<commit_message>
changes as per requirments
</commit_message>
<xml_diff>
--- a/source/MySEProject/Documentation/ML -24-25-01-Investigate Image reconstruction using classifiers.docx
+++ b/source/MySEProject/Documentation/ML -24-25-01-Investigate Image reconstruction using classifiers.docx
@@ -518,16 +518,7 @@
           <w:i/>
           <w:sz w:val="18"/>
         </w:rPr>
-        <w:t xml:space="preserve">Neighbors (KNN), </w:t>
-      </w:r>
-      <w:proofErr w:type="gramStart"/>
-      <w:r>
-        <w:rPr>
-          <w:b/>
-          <w:i/>
-          <w:sz w:val="18"/>
-        </w:rPr>
-        <w:t>Hierarchical</w:t>
+        <w:t>Neighbors (KNN), Hierarchical</w:t>
       </w:r>
       <w:r>
         <w:rPr>
@@ -554,7 +545,6 @@
         </w:rPr>
         <w:t>Temporal</w:t>
       </w:r>
-      <w:proofErr w:type="gramEnd"/>
       <w:r>
         <w:rPr>
           <w:b/>
@@ -606,23 +596,13 @@
         </w:rPr>
         <w:t xml:space="preserve"> </w:t>
       </w:r>
-      <w:proofErr w:type="spellStart"/>
       <w:r>
         <w:rPr>
           <w:b/>
           <w:i/>
           <w:sz w:val="18"/>
         </w:rPr>
-        <w:t>NeoCortexApi</w:t>
-      </w:r>
-      <w:proofErr w:type="spellEnd"/>
-      <w:r>
-        <w:rPr>
-          <w:b/>
-          <w:i/>
-          <w:sz w:val="18"/>
-        </w:rPr>
-        <w:t>,</w:t>
+        <w:t>NeoCortexApi,</w:t>
       </w:r>
       <w:r>
         <w:rPr>
@@ -1420,53 +1400,28 @@
           <w:iCs/>
           <w:sz w:val="20"/>
         </w:rPr>
-        <w:t xml:space="preserve"> to be classified, </w:t>
-      </w:r>
-      <w:proofErr w:type="gramStart"/>
+        <w:t xml:space="preserve"> to be classified, its </w:t>
+      </w:r>
+      <w:r>
+        <w:rPr>
+          <w:i/>
+          <w:sz w:val="20"/>
+        </w:rPr>
+        <w:t>k</w:t>
+      </w:r>
       <w:r>
         <w:rPr>
           <w:iCs/>
           <w:sz w:val="20"/>
         </w:rPr>
-        <w:t xml:space="preserve">its </w:t>
-      </w:r>
-      <w:r>
-        <w:rPr>
-          <w:i/>
-          <w:sz w:val="20"/>
-        </w:rPr>
-        <w:t>k</w:t>
-      </w:r>
-      <w:proofErr w:type="gramEnd"/>
+        <w:t xml:space="preserve"> </w:t>
+      </w:r>
       <w:r>
         <w:rPr>
           <w:iCs/>
           <w:sz w:val="20"/>
         </w:rPr>
-        <w:t xml:space="preserve"> </w:t>
-      </w:r>
-      <w:r>
-        <w:rPr>
-          <w:iCs/>
-          <w:sz w:val="20"/>
-        </w:rPr>
-        <w:t xml:space="preserve">nearest neighbors </w:t>
-      </w:r>
-      <w:proofErr w:type="gramStart"/>
-      <w:r>
-        <w:rPr>
-          <w:iCs/>
-          <w:sz w:val="20"/>
-        </w:rPr>
-        <w:t>are</w:t>
-      </w:r>
-      <w:proofErr w:type="gramEnd"/>
-      <w:r>
-        <w:rPr>
-          <w:iCs/>
-          <w:sz w:val="20"/>
-        </w:rPr>
-        <w:t xml:space="preserve"> retrieved, forming a neighbourhood of </w:t>
+        <w:t xml:space="preserve">nearest neighbors are retrieved, forming a neighbourhood of </w:t>
       </w:r>
       <w:r>
         <w:rPr>
@@ -2095,88 +2050,54 @@
           <w:rFonts w:eastAsia="Times New Roman"/>
           <w:szCs w:val="22"/>
         </w:rPr>
-        <w:t xml:space="preserve"> classification and reconstruction, input images are first converted into binary representations. An Image </w:t>
-      </w:r>
-      <w:proofErr w:type="spellStart"/>
+        <w:t xml:space="preserve"> classification and reconstruction, input images are first converted into binary representations. An Image Binarizer </w:t>
+      </w:r>
+      <w:r>
+        <w:t xml:space="preserve">using the </w:t>
+      </w:r>
+      <w:r>
+        <w:t>BinarizeToFixedSize()</w:t>
+      </w:r>
+      <w:r>
+        <w:t xml:space="preserve"> </w:t>
+      </w:r>
       <w:r>
         <w:rPr>
           <w:rFonts w:eastAsia="Times New Roman"/>
           <w:szCs w:val="22"/>
         </w:rPr>
-        <w:t>Binarizer</w:t>
-      </w:r>
-      <w:proofErr w:type="spellEnd"/>
-      <w:r>
+        <w:t xml:space="preserve">is employed to transform grayscale or color images into binary arrays, where each pixel is represented as either 0 or 1. </w:t>
+      </w:r>
+    </w:p>
+    <w:p>
+      <w:pPr>
+        <w:spacing w:after="120"/>
+        <w:jc w:val="left"/>
         <w:rPr>
           <w:rFonts w:eastAsia="Times New Roman"/>
           <w:szCs w:val="22"/>
         </w:rPr>
-        <w:t xml:space="preserve"> </w:t>
-      </w:r>
-      <w:r>
-        <w:t xml:space="preserve">using the </w:t>
-      </w:r>
-      <w:proofErr w:type="spellStart"/>
-      <w:proofErr w:type="gramStart"/>
-      <w:r>
-        <w:t>BinarizeToFixedSize</w:t>
-      </w:r>
-      <w:proofErr w:type="spellEnd"/>
-      <w:r>
-        <w:t>(</w:t>
-      </w:r>
-      <w:proofErr w:type="gramEnd"/>
-      <w:r>
-        <w:t>)</w:t>
-      </w:r>
-      <w:r>
-        <w:t xml:space="preserve"> </w:t>
-      </w:r>
+      </w:pPr>
       <w:r>
         <w:rPr>
           <w:rFonts w:eastAsia="Times New Roman"/>
           <w:szCs w:val="22"/>
         </w:rPr>
-        <w:t xml:space="preserve">is employed to transform grayscale or color images into binary arrays, where each pixel is represented as either 0 or 1. </w:t>
-      </w:r>
-    </w:p>
-    <w:p>
-      <w:pPr>
-        <w:spacing w:after="120"/>
-        <w:jc w:val="left"/>
+        <w:t>Listing 1</w:t>
+      </w:r>
+      <w:r>
         <w:rPr>
           <w:rFonts w:eastAsia="Times New Roman"/>
           <w:szCs w:val="22"/>
         </w:rPr>
-      </w:pPr>
-      <w:r>
-        <w:rPr>
-          <w:rFonts w:eastAsia="Times New Roman"/>
-          <w:szCs w:val="22"/>
-        </w:rPr>
-        <w:t>Listing 1</w:t>
-      </w:r>
-      <w:r>
-        <w:rPr>
-          <w:rFonts w:eastAsia="Times New Roman"/>
-          <w:szCs w:val="22"/>
-        </w:rPr>
         <w:t xml:space="preserve"> </w:t>
       </w:r>
       <w:hyperlink r:id="rId14" w:anchor="L223" w:history="1">
-        <w:proofErr w:type="spellStart"/>
         <w:r>
           <w:rPr>
             <w:rStyle w:val="Hyperlink"/>
           </w:rPr>
-          <w:t>BinarizeToFixedSize</w:t>
-        </w:r>
-        <w:proofErr w:type="spellEnd"/>
-        <w:r>
-          <w:rPr>
-            <w:rStyle w:val="Hyperlink"/>
-          </w:rPr>
-          <w:t>()</w:t>
+          <w:t>BinarizeToFixedSize()</w:t>
         </w:r>
       </w:hyperlink>
     </w:p>
@@ -2239,36 +2160,7 @@
                               <w:jc w:val="left"/>
                             </w:pPr>
                             <w:r>
-                              <w:t xml:space="preserve">string </w:t>
-                            </w:r>
-                            <w:proofErr w:type="spellStart"/>
-                            <w:r>
-                              <w:t>binarizedImageFile</w:t>
-                            </w:r>
-                            <w:proofErr w:type="spellEnd"/>
-                            <w:r>
-                              <w:t xml:space="preserve"> = </w:t>
-                            </w:r>
-                            <w:proofErr w:type="spellStart"/>
-                            <w:proofErr w:type="gramStart"/>
-                            <w:r>
-                              <w:t>BinarizeImageToFixedSize</w:t>
-                            </w:r>
-                            <w:proofErr w:type="spellEnd"/>
-                            <w:r>
-                              <w:t>(</w:t>
-                            </w:r>
-                            <w:proofErr w:type="gramEnd"/>
-                            <w:r>
-                              <w:t xml:space="preserve">image, </w:t>
-                            </w:r>
-                            <w:proofErr w:type="spellStart"/>
-                            <w:r>
-                              <w:t>imgSize</w:t>
-                            </w:r>
-                            <w:proofErr w:type="spellEnd"/>
-                            <w:r>
-                              <w:t>);</w:t>
+                              <w:t>string binarizedImageFile = BinarizeImageToFixedSize(image, imgSize);</w:t>
                             </w:r>
                           </w:p>
                         </w:txbxContent>
@@ -2296,36 +2188,7 @@
                         <w:jc w:val="left"/>
                       </w:pPr>
                       <w:r>
-                        <w:t xml:space="preserve">string </w:t>
-                      </w:r>
-                      <w:proofErr w:type="spellStart"/>
-                      <w:r>
-                        <w:t>binarizedImageFile</w:t>
-                      </w:r>
-                      <w:proofErr w:type="spellEnd"/>
-                      <w:r>
-                        <w:t xml:space="preserve"> = </w:t>
-                      </w:r>
-                      <w:proofErr w:type="spellStart"/>
-                      <w:proofErr w:type="gramStart"/>
-                      <w:r>
-                        <w:t>BinarizeImageToFixedSize</w:t>
-                      </w:r>
-                      <w:proofErr w:type="spellEnd"/>
-                      <w:r>
-                        <w:t>(</w:t>
-                      </w:r>
-                      <w:proofErr w:type="gramEnd"/>
-                      <w:r>
-                        <w:t xml:space="preserve">image, </w:t>
-                      </w:r>
-                      <w:proofErr w:type="spellStart"/>
-                      <w:r>
-                        <w:t>imgSize</w:t>
-                      </w:r>
-                      <w:proofErr w:type="spellEnd"/>
-                      <w:r>
-                        <w:t>);</w:t>
+                        <w:t>string binarizedImageFile = BinarizeImageToFixedSize(image, imgSize);</w:t>
                       </w:r>
                     </w:p>
                   </w:txbxContent>
@@ -2516,30 +2379,8 @@
         <w:rPr>
           <w:bCs/>
         </w:rPr>
-        <w:t xml:space="preserve">The binarized image data is processed using the Hierarchical Temporal Memory (HTM) Spatial Pooler (SP) from the </w:t>
-      </w:r>
-      <w:proofErr w:type="spellStart"/>
-      <w:r>
-        <w:rPr>
-          <w:bCs/>
-        </w:rPr>
-        <w:t>NeoCortex</w:t>
-      </w:r>
-      <w:proofErr w:type="spellEnd"/>
-      <w:r>
-        <w:rPr>
-          <w:bCs/>
-        </w:rPr>
-        <w:t xml:space="preserve"> API to generate Sparse Distributed Representations (SDRs). The Spatial Pooler maps the binary input into an SDR, ensuring that similar input images produce similar SDRs. The key parameters of the compute method </w:t>
-      </w:r>
-      <w:proofErr w:type="spellStart"/>
-      <w:r>
-        <w:rPr>
-          <w:bCs/>
-        </w:rPr>
-        <w:t>sp.compute</w:t>
-      </w:r>
-      <w:proofErr w:type="spellEnd"/>
+        <w:t>The binarized image data is processed using the Hierarchical Temporal Memory (HTM) Spatial Pooler (SP) from the NeoCortex API to generate Sparse Distributed Representations (SDRs). The Spatial Pooler maps the binary input into an SDR, ensuring that similar input images produce similar SDRs. The key parameters of the compute method sp.compute</w:t>
+      </w:r>
       <w:r>
         <w:rPr>
           <w:bCs/>
@@ -2627,49 +2468,11 @@
                                 <w:lang w:val="en-IN"/>
                               </w:rPr>
                             </w:pPr>
-                            <w:proofErr w:type="spellStart"/>
-                            <w:proofErr w:type="gramStart"/>
                             <w:r>
                               <w:rPr>
                                 <w:lang w:val="en-IN"/>
                               </w:rPr>
-                              <w:t>sp.compute</w:t>
-                            </w:r>
-                            <w:proofErr w:type="spellEnd"/>
-                            <w:proofErr w:type="gramEnd"/>
-                            <w:r>
-                              <w:rPr>
-                                <w:lang w:val="en-IN"/>
-                              </w:rPr>
-                              <w:t>(</w:t>
-                            </w:r>
-                            <w:proofErr w:type="spellStart"/>
-                            <w:r>
-                              <w:rPr>
-                                <w:lang w:val="en-IN"/>
-                              </w:rPr>
-                              <w:t>inputVector</w:t>
-                            </w:r>
-                            <w:proofErr w:type="spellEnd"/>
-                            <w:r>
-                              <w:rPr>
-                                <w:lang w:val="en-IN"/>
-                              </w:rPr>
-                              <w:t xml:space="preserve">, </w:t>
-                            </w:r>
-                            <w:proofErr w:type="spellStart"/>
-                            <w:r>
-                              <w:rPr>
-                                <w:lang w:val="en-IN"/>
-                              </w:rPr>
-                              <w:t>activeArray</w:t>
-                            </w:r>
-                            <w:proofErr w:type="spellEnd"/>
-                            <w:r>
-                              <w:rPr>
-                                <w:lang w:val="en-IN"/>
-                              </w:rPr>
-                              <w:t>, true);</w:t>
+                              <w:t>sp.compute(inputVector, activeArray, true);</w:t>
                             </w:r>
                           </w:p>
                           <w:p>
@@ -2682,115 +2485,15 @@
                               <w:rPr>
                                 <w:lang w:val="en-IN"/>
                               </w:rPr>
-                              <w:t xml:space="preserve">var </w:t>
+                              <w:t>var activeCols = ArrayUtils.IndexWhere(activeArray, el =&gt; el == 1);</w:t>
                             </w:r>
-                            <w:proofErr w:type="spellStart"/>
+                          </w:p>
+                          <w:p>
                             <w:r>
                               <w:rPr>
                                 <w:lang w:val="en-IN"/>
                               </w:rPr>
-                              <w:t>activeCols</w:t>
-                            </w:r>
-                            <w:proofErr w:type="spellEnd"/>
-                            <w:r>
-                              <w:rPr>
-                                <w:lang w:val="en-IN"/>
-                              </w:rPr>
-                              <w:t xml:space="preserve"> = </w:t>
-                            </w:r>
-                            <w:proofErr w:type="spellStart"/>
-                            <w:r>
-                              <w:rPr>
-                                <w:lang w:val="en-IN"/>
-                              </w:rPr>
-                              <w:t>ArrayUtils.IndexWhere</w:t>
-                            </w:r>
-                            <w:proofErr w:type="spellEnd"/>
-                            <w:r>
-                              <w:rPr>
-                                <w:lang w:val="en-IN"/>
-                              </w:rPr>
-                              <w:t>(</w:t>
-                            </w:r>
-                            <w:proofErr w:type="spellStart"/>
-                            <w:r>
-                              <w:rPr>
-                                <w:lang w:val="en-IN"/>
-                              </w:rPr>
-                              <w:t>activeArray</w:t>
-                            </w:r>
-                            <w:proofErr w:type="spellEnd"/>
-                            <w:r>
-                              <w:rPr>
-                                <w:lang w:val="en-IN"/>
-                              </w:rPr>
-                              <w:t xml:space="preserve">, </w:t>
-                            </w:r>
-                            <w:proofErr w:type="spellStart"/>
-                            <w:r>
-                              <w:rPr>
-                                <w:lang w:val="en-IN"/>
-                              </w:rPr>
-                              <w:t>el</w:t>
-                            </w:r>
-                            <w:proofErr w:type="spellEnd"/>
-                            <w:r>
-                              <w:rPr>
-                                <w:lang w:val="en-IN"/>
-                              </w:rPr>
-                              <w:t xml:space="preserve"> =&gt; </w:t>
-                            </w:r>
-                            <w:proofErr w:type="spellStart"/>
-                            <w:r>
-                              <w:rPr>
-                                <w:lang w:val="en-IN"/>
-                              </w:rPr>
-                              <w:t>el</w:t>
-                            </w:r>
-                            <w:proofErr w:type="spellEnd"/>
-                            <w:r>
-                              <w:rPr>
-                                <w:lang w:val="en-IN"/>
-                              </w:rPr>
-                              <w:t xml:space="preserve"> == 1</w:t>
-                            </w:r>
-                            <w:proofErr w:type="gramStart"/>
-                            <w:r>
-                              <w:rPr>
-                                <w:lang w:val="en-IN"/>
-                              </w:rPr>
-                              <w:t>);</w:t>
-                            </w:r>
-                            <w:proofErr w:type="gramEnd"/>
-                          </w:p>
-                          <w:p>
-                            <w:proofErr w:type="spellStart"/>
-                            <w:r>
-                              <w:rPr>
-                                <w:lang w:val="en-IN"/>
-                              </w:rPr>
-                              <w:t>Debug.WriteLine</w:t>
-                            </w:r>
-                            <w:proofErr w:type="spellEnd"/>
-                            <w:r>
-                              <w:rPr>
-                                <w:lang w:val="en-IN"/>
-                              </w:rPr>
-                              <w:t>($" Active Columns Count: {</w:t>
-                            </w:r>
-                            <w:proofErr w:type="spellStart"/>
-                            <w:r>
-                              <w:rPr>
-                                <w:lang w:val="en-IN"/>
-                              </w:rPr>
-                              <w:t>activeCols.Length</w:t>
-                            </w:r>
-                            <w:proofErr w:type="spellEnd"/>
-                            <w:r>
-                              <w:rPr>
-                                <w:lang w:val="en-IN"/>
-                              </w:rPr>
-                              <w:t>}")</w:t>
+                              <w:t>Debug.WriteLine($" Active Columns Count: {activeCols.Length}")</w:t>
                             </w:r>
                             <w:r>
                               <w:rPr>
@@ -2827,49 +2530,11 @@
                           <w:lang w:val="en-IN"/>
                         </w:rPr>
                       </w:pPr>
-                      <w:proofErr w:type="spellStart"/>
-                      <w:proofErr w:type="gramStart"/>
                       <w:r>
                         <w:rPr>
                           <w:lang w:val="en-IN"/>
                         </w:rPr>
-                        <w:t>sp.compute</w:t>
-                      </w:r>
-                      <w:proofErr w:type="spellEnd"/>
-                      <w:proofErr w:type="gramEnd"/>
-                      <w:r>
-                        <w:rPr>
-                          <w:lang w:val="en-IN"/>
-                        </w:rPr>
-                        <w:t>(</w:t>
-                      </w:r>
-                      <w:proofErr w:type="spellStart"/>
-                      <w:r>
-                        <w:rPr>
-                          <w:lang w:val="en-IN"/>
-                        </w:rPr>
-                        <w:t>inputVector</w:t>
-                      </w:r>
-                      <w:proofErr w:type="spellEnd"/>
-                      <w:r>
-                        <w:rPr>
-                          <w:lang w:val="en-IN"/>
-                        </w:rPr>
-                        <w:t xml:space="preserve">, </w:t>
-                      </w:r>
-                      <w:proofErr w:type="spellStart"/>
-                      <w:r>
-                        <w:rPr>
-                          <w:lang w:val="en-IN"/>
-                        </w:rPr>
-                        <w:t>activeArray</w:t>
-                      </w:r>
-                      <w:proofErr w:type="spellEnd"/>
-                      <w:r>
-                        <w:rPr>
-                          <w:lang w:val="en-IN"/>
-                        </w:rPr>
-                        <w:t>, true);</w:t>
+                        <w:t>sp.compute(inputVector, activeArray, true);</w:t>
                       </w:r>
                     </w:p>
                     <w:p>
@@ -2882,115 +2547,15 @@
                         <w:rPr>
                           <w:lang w:val="en-IN"/>
                         </w:rPr>
-                        <w:t xml:space="preserve">var </w:t>
+                        <w:t>var activeCols = ArrayUtils.IndexWhere(activeArray, el =&gt; el == 1);</w:t>
                       </w:r>
-                      <w:proofErr w:type="spellStart"/>
+                    </w:p>
+                    <w:p>
                       <w:r>
                         <w:rPr>
                           <w:lang w:val="en-IN"/>
                         </w:rPr>
-                        <w:t>activeCols</w:t>
-                      </w:r>
-                      <w:proofErr w:type="spellEnd"/>
-                      <w:r>
-                        <w:rPr>
-                          <w:lang w:val="en-IN"/>
-                        </w:rPr>
-                        <w:t xml:space="preserve"> = </w:t>
-                      </w:r>
-                      <w:proofErr w:type="spellStart"/>
-                      <w:r>
-                        <w:rPr>
-                          <w:lang w:val="en-IN"/>
-                        </w:rPr>
-                        <w:t>ArrayUtils.IndexWhere</w:t>
-                      </w:r>
-                      <w:proofErr w:type="spellEnd"/>
-                      <w:r>
-                        <w:rPr>
-                          <w:lang w:val="en-IN"/>
-                        </w:rPr>
-                        <w:t>(</w:t>
-                      </w:r>
-                      <w:proofErr w:type="spellStart"/>
-                      <w:r>
-                        <w:rPr>
-                          <w:lang w:val="en-IN"/>
-                        </w:rPr>
-                        <w:t>activeArray</w:t>
-                      </w:r>
-                      <w:proofErr w:type="spellEnd"/>
-                      <w:r>
-                        <w:rPr>
-                          <w:lang w:val="en-IN"/>
-                        </w:rPr>
-                        <w:t xml:space="preserve">, </w:t>
-                      </w:r>
-                      <w:proofErr w:type="spellStart"/>
-                      <w:r>
-                        <w:rPr>
-                          <w:lang w:val="en-IN"/>
-                        </w:rPr>
-                        <w:t>el</w:t>
-                      </w:r>
-                      <w:proofErr w:type="spellEnd"/>
-                      <w:r>
-                        <w:rPr>
-                          <w:lang w:val="en-IN"/>
-                        </w:rPr>
-                        <w:t xml:space="preserve"> =&gt; </w:t>
-                      </w:r>
-                      <w:proofErr w:type="spellStart"/>
-                      <w:r>
-                        <w:rPr>
-                          <w:lang w:val="en-IN"/>
-                        </w:rPr>
-                        <w:t>el</w:t>
-                      </w:r>
-                      <w:proofErr w:type="spellEnd"/>
-                      <w:r>
-                        <w:rPr>
-                          <w:lang w:val="en-IN"/>
-                        </w:rPr>
-                        <w:t xml:space="preserve"> == 1</w:t>
-                      </w:r>
-                      <w:proofErr w:type="gramStart"/>
-                      <w:r>
-                        <w:rPr>
-                          <w:lang w:val="en-IN"/>
-                        </w:rPr>
-                        <w:t>);</w:t>
-                      </w:r>
-                      <w:proofErr w:type="gramEnd"/>
-                    </w:p>
-                    <w:p>
-                      <w:proofErr w:type="spellStart"/>
-                      <w:r>
-                        <w:rPr>
-                          <w:lang w:val="en-IN"/>
-                        </w:rPr>
-                        <w:t>Debug.WriteLine</w:t>
-                      </w:r>
-                      <w:proofErr w:type="spellEnd"/>
-                      <w:r>
-                        <w:rPr>
-                          <w:lang w:val="en-IN"/>
-                        </w:rPr>
-                        <w:t>($" Active Columns Count: {</w:t>
-                      </w:r>
-                      <w:proofErr w:type="spellStart"/>
-                      <w:r>
-                        <w:rPr>
-                          <w:lang w:val="en-IN"/>
-                        </w:rPr>
-                        <w:t>activeCols.Length</w:t>
-                      </w:r>
-                      <w:proofErr w:type="spellEnd"/>
-                      <w:r>
-                        <w:rPr>
-                          <w:lang w:val="en-IN"/>
-                        </w:rPr>
-                        <w:t>}")</w:t>
+                        <w:t>Debug.WriteLine($" Active Columns Count: {activeCols.Length}")</w:t>
                       </w:r>
                       <w:r>
                         <w:rPr>
@@ -3011,14 +2576,12 @@
         <w:t xml:space="preserve">Listing 2 </w:t>
       </w:r>
       <w:hyperlink r:id="rId15" w:anchor="L232" w:history="1">
-        <w:proofErr w:type="spellStart"/>
         <w:r>
           <w:rPr>
             <w:rStyle w:val="Hyperlink"/>
           </w:rPr>
           <w:t>sp.compute</w:t>
         </w:r>
-        <w:proofErr w:type="spellEnd"/>
       </w:hyperlink>
       <w:r>
         <w:t xml:space="preserve"> </w:t>
@@ -3478,23 +3041,7 @@
           <w:spacing w:val="-1"/>
           <w:lang w:val="x-none" w:eastAsia="x-none"/>
         </w:rPr>
-        <w:t xml:space="preserve">Once classification is performed, the reconstruction process is initiated to evaluate how well the classifiers retain image structure. The </w:t>
-      </w:r>
-      <w:proofErr w:type="spellStart"/>
-      <w:r>
-        <w:rPr>
-          <w:spacing w:val="-1"/>
-          <w:lang w:val="x-none" w:eastAsia="x-none"/>
-        </w:rPr>
-        <w:t>NeoCortex</w:t>
-      </w:r>
-      <w:proofErr w:type="spellEnd"/>
-      <w:r>
-        <w:rPr>
-          <w:spacing w:val="-1"/>
-          <w:lang w:val="x-none" w:eastAsia="x-none"/>
-        </w:rPr>
-        <w:t xml:space="preserve"> API’s Reconstruct() method </w:t>
+        <w:t xml:space="preserve">Once classification is performed, the reconstruction process is initiated to evaluate how well the classifiers retain image structure. The NeoCortex API’s Reconstruct() method </w:t>
       </w:r>
       <w:r>
         <w:rPr>
@@ -4443,39 +3990,38 @@
     </w:p>
     <w:p>
       <w:pPr>
-        <w:pStyle w:val="Heading2"/>
+        <w:pStyle w:val="BodyText"/>
         <w:numPr>
-          <w:ilvl w:val="1"/>
-          <w:numId w:val="7"/>
+          <w:ilvl w:val="0"/>
+          <w:numId w:val="30"/>
         </w:numPr>
-        <w:tabs>
-          <w:tab w:val="num" w:pos="360"/>
-          <w:tab w:val="left" w:pos="682"/>
-        </w:tabs>
-        <w:spacing w:before="0" w:after="0"/>
-        <w:ind w:left="284" w:hanging="284"/>
-        <w:jc w:val="both"/>
-      </w:pPr>
-      <w:r>
-        <w:rPr>
-          <w:spacing w:val="15"/>
-        </w:rPr>
-        <w:t xml:space="preserve"> </w:t>
-      </w:r>
-      <w:r>
-        <w:rPr>
+        <w:spacing w:after="0"/>
+        <w:ind w:left="445"/>
+        <w:rPr>
+          <w:i/>
+          <w:iCs/>
+        </w:rPr>
+      </w:pPr>
+      <w:r>
+        <w:rPr>
+          <w:i/>
+          <w:iCs/>
           <w:spacing w:val="-2"/>
         </w:rPr>
         <w:t>Classification</w:t>
       </w:r>
       <w:r>
         <w:rPr>
+          <w:i/>
+          <w:iCs/>
           <w:spacing w:val="-2"/>
         </w:rPr>
         <w:t xml:space="preserve"> Process</w:t>
       </w:r>
       <w:r>
         <w:rPr>
+          <w:i/>
+          <w:iCs/>
           <w:spacing w:val="-2"/>
         </w:rPr>
         <w:t>:</w:t>
@@ -4486,10 +4032,10 @@
         <w:pStyle w:val="bulletlist"/>
         <w:numPr>
           <w:ilvl w:val="2"/>
-          <w:numId w:val="18"/>
+          <w:numId w:val="27"/>
         </w:numPr>
         <w:spacing w:before="40" w:after="40"/>
-        <w:ind w:left="360"/>
+        <w:ind w:left="757"/>
       </w:pPr>
       <w:r>
         <w:t>The</w:t>
@@ -4545,10 +4091,10 @@
         <w:pStyle w:val="bulletlist"/>
         <w:numPr>
           <w:ilvl w:val="2"/>
-          <w:numId w:val="18"/>
+          <w:numId w:val="27"/>
         </w:numPr>
         <w:spacing w:before="40" w:after="40"/>
-        <w:ind w:left="360"/>
+        <w:ind w:left="757"/>
       </w:pPr>
       <w:r>
         <w:t>Over multiple iterations, the classifier improves its prediction accuracy as it learns the underlying patterns in the input data.</w:t>
@@ -4556,30 +4102,37 @@
     </w:p>
     <w:p>
       <w:pPr>
-        <w:pStyle w:val="Heading2"/>
+        <w:pStyle w:val="bulletlist"/>
         <w:numPr>
           <w:ilvl w:val="1"/>
-          <w:numId w:val="7"/>
+          <w:numId w:val="27"/>
         </w:numPr>
-        <w:tabs>
-          <w:tab w:val="num" w:pos="360"/>
-          <w:tab w:val="left" w:pos="682"/>
-        </w:tabs>
-        <w:spacing w:before="0" w:after="0"/>
-        <w:ind w:left="284" w:hanging="284"/>
-        <w:jc w:val="both"/>
-      </w:pPr>
-      <w:r>
+        <w:spacing w:before="40" w:after="40"/>
+        <w:ind w:left="445"/>
+        <w:rPr>
+          <w:i/>
+          <w:iCs/>
+        </w:rPr>
+      </w:pPr>
+      <w:r>
+        <w:rPr>
+          <w:i/>
+          <w:iCs/>
+        </w:rPr>
         <w:t>Training</w:t>
       </w:r>
       <w:r>
         <w:rPr>
+          <w:i/>
+          <w:iCs/>
           <w:spacing w:val="1"/>
         </w:rPr>
         <w:t xml:space="preserve"> </w:t>
       </w:r>
       <w:r>
         <w:rPr>
+          <w:i/>
+          <w:iCs/>
           <w:spacing w:val="-2"/>
         </w:rPr>
         <w:t>Process:</w:t>
@@ -4590,9 +4143,10 @@
         <w:pStyle w:val="bulletlist"/>
         <w:numPr>
           <w:ilvl w:val="2"/>
-          <w:numId w:val="19"/>
+          <w:numId w:val="27"/>
         </w:numPr>
-        <w:ind w:left="360"/>
+        <w:spacing w:before="40" w:after="40"/>
+        <w:ind w:left="757"/>
       </w:pPr>
       <w:r>
         <w:t>During training, the HTM</w:t>
@@ -4603,16 +4157,11 @@
       <w:r>
         <w:t xml:space="preserve"> </w:t>
       </w:r>
-      <w:proofErr w:type="spellStart"/>
       <w:r>
         <w:t>IC</w:t>
       </w:r>
       <w:r>
-        <w:t>lassifier</w:t>
-      </w:r>
-      <w:proofErr w:type="spellEnd"/>
-      <w:r>
-        <w:t xml:space="preserve"> learns to recognize</w:t>
+        <w:t>lassifier learns to recognize</w:t>
       </w:r>
       <w:r>
         <w:t xml:space="preserve"> </w:t>
@@ -4656,10 +4205,10 @@
         <w:pStyle w:val="bulletlist"/>
         <w:numPr>
           <w:ilvl w:val="2"/>
-          <w:numId w:val="18"/>
+          <w:numId w:val="27"/>
         </w:numPr>
         <w:spacing w:before="40" w:after="40"/>
-        <w:ind w:left="360"/>
+        <w:ind w:left="757"/>
       </w:pPr>
       <w:r>
         <w:t>The</w:t>
@@ -4709,30 +4258,37 @@
     </w:p>
     <w:p>
       <w:pPr>
-        <w:pStyle w:val="Heading2"/>
+        <w:pStyle w:val="bulletlist"/>
         <w:numPr>
           <w:ilvl w:val="1"/>
-          <w:numId w:val="7"/>
+          <w:numId w:val="27"/>
         </w:numPr>
-        <w:tabs>
-          <w:tab w:val="num" w:pos="360"/>
-          <w:tab w:val="left" w:pos="742"/>
-        </w:tabs>
-        <w:spacing w:before="0" w:after="0"/>
-        <w:ind w:left="284" w:hanging="284"/>
-        <w:jc w:val="both"/>
-      </w:pPr>
-      <w:r>
+        <w:spacing w:before="40" w:after="40"/>
+        <w:ind w:left="445"/>
+        <w:rPr>
+          <w:i/>
+          <w:iCs/>
+        </w:rPr>
+      </w:pPr>
+      <w:r>
+        <w:rPr>
+          <w:i/>
+          <w:iCs/>
+        </w:rPr>
         <w:t>Prediction</w:t>
       </w:r>
       <w:r>
         <w:rPr>
+          <w:i/>
+          <w:iCs/>
           <w:spacing w:val="11"/>
         </w:rPr>
         <w:t xml:space="preserve"> </w:t>
       </w:r>
       <w:r>
         <w:rPr>
+          <w:i/>
+          <w:iCs/>
           <w:spacing w:val="-2"/>
         </w:rPr>
         <w:t>Process:</w:t>
@@ -4743,9 +4299,10 @@
         <w:pStyle w:val="bulletlist"/>
         <w:numPr>
           <w:ilvl w:val="2"/>
-          <w:numId w:val="19"/>
+          <w:numId w:val="27"/>
         </w:numPr>
-        <w:ind w:left="360"/>
+        <w:spacing w:before="40" w:after="40"/>
+        <w:ind w:left="757"/>
       </w:pPr>
       <w:r>
         <w:t>After</w:t>
@@ -4771,14 +4328,12 @@
       <w:r>
         <w:t xml:space="preserve"> </w:t>
       </w:r>
-      <w:proofErr w:type="spellStart"/>
       <w:r>
         <w:t>IC</w:t>
       </w:r>
       <w:r>
         <w:t>lassifier</w:t>
       </w:r>
-      <w:proofErr w:type="spellEnd"/>
       <w:r>
         <w:t xml:space="preserve"> </w:t>
       </w:r>
@@ -4821,9 +4376,10 @@
         <w:pStyle w:val="bulletlist"/>
         <w:numPr>
           <w:ilvl w:val="2"/>
-          <w:numId w:val="19"/>
+          <w:numId w:val="27"/>
         </w:numPr>
-        <w:ind w:left="360"/>
+        <w:spacing w:before="40" w:after="40"/>
+        <w:ind w:left="757"/>
       </w:pPr>
       <w:r>
         <w:t xml:space="preserve">Given an </w:t>
@@ -4858,24 +4414,24 @@
     </w:p>
     <w:p>
       <w:pPr>
-        <w:pStyle w:val="Heading2"/>
+        <w:pStyle w:val="bulletlist"/>
         <w:numPr>
           <w:ilvl w:val="1"/>
-          <w:numId w:val="7"/>
+          <w:numId w:val="27"/>
         </w:numPr>
-        <w:tabs>
-          <w:tab w:val="num" w:pos="360"/>
-          <w:tab w:val="left" w:pos="682"/>
-        </w:tabs>
-        <w:spacing w:before="0" w:after="0"/>
-        <w:ind w:left="284" w:hanging="284"/>
-        <w:jc w:val="both"/>
-      </w:pPr>
-      <w:r>
-        <w:t>Iterative</w:t>
-      </w:r>
-      <w:r>
-        <w:t xml:space="preserve"> Learning:</w:t>
+        <w:spacing w:before="40" w:after="40"/>
+        <w:ind w:left="445"/>
+        <w:rPr>
+          <w:i/>
+          <w:iCs/>
+        </w:rPr>
+      </w:pPr>
+      <w:r>
+        <w:rPr>
+          <w:i/>
+          <w:iCs/>
+        </w:rPr>
+        <w:t>Iterative Learning:</w:t>
       </w:r>
     </w:p>
     <w:p>
@@ -4883,9 +4439,9 @@
         <w:pStyle w:val="bulletlist"/>
         <w:numPr>
           <w:ilvl w:val="2"/>
-          <w:numId w:val="19"/>
+          <w:numId w:val="31"/>
         </w:numPr>
-        <w:ind w:left="360"/>
+        <w:ind w:left="757"/>
       </w:pPr>
       <w:r>
         <w:t>The HTM Classifier improves over time, enhancing prediction accuracy as it processes more examples.</w:t>
@@ -4896,9 +4452,9 @@
         <w:pStyle w:val="bulletlist"/>
         <w:numPr>
           <w:ilvl w:val="2"/>
-          <w:numId w:val="19"/>
+          <w:numId w:val="31"/>
         </w:numPr>
-        <w:ind w:left="360"/>
+        <w:ind w:left="757"/>
       </w:pPr>
       <w:r>
         <w:t>Through</w:t>
@@ -4933,11 +4489,6 @@
       <w:r>
         <w:t>for future inputs.</w:t>
       </w:r>
-    </w:p>
-    <w:p>
-      <w:pPr>
-        <w:pStyle w:val="bulletlist"/>
-      </w:pPr>
     </w:p>
     <w:p>
       <w:pPr>
@@ -7859,7 +7410,7 @@
       <w:pPr>
         <w:pStyle w:val="BodyText"/>
         <w:spacing w:before="40" w:after="40" w:line="249" w:lineRule="auto"/>
-        <w:ind w:firstLine="199"/>
+        <w:ind w:firstLine="0"/>
       </w:pPr>
       <w:r>
         <w:rPr>
@@ -7869,13 +7420,134 @@
       </w:r>
       <w:r>
         <w:t>: Confirm that the CosineSimilarity function re- turns a similarity score of 0.0 for completely different vectors, indicating no similarity.</w:t>
+      </w:r>
+    </w:p>
+    <w:p>
+      <w:pPr>
+        <w:pStyle w:val="BodyText"/>
+        <w:spacing w:before="40" w:after="40" w:line="249" w:lineRule="auto"/>
+        <w:ind w:firstLine="0"/>
+      </w:pPr>
+      <w:r>
+        <w:rPr>
+          <w:b/>
+          <w:bCs/>
+        </w:rPr>
+        <w:t>Test</w:t>
+      </w:r>
+      <w:r>
+        <w:rPr>
+          <w:b/>
+          <w:bCs/>
+          <w:spacing w:val="1"/>
+        </w:rPr>
+        <w:t xml:space="preserve"> </w:t>
+      </w:r>
+      <w:r>
+        <w:rPr>
+          <w:b/>
+          <w:bCs/>
+          <w:spacing w:val="-2"/>
+        </w:rPr>
+        <w:t>Scenario:</w:t>
+      </w:r>
+      <w:r>
+        <w:rPr>
+          <w:b/>
+          <w:bCs/>
+          <w:spacing w:val="-2"/>
+        </w:rPr>
+        <w:t xml:space="preserve"> </w:t>
+      </w:r>
+      <w:r>
+        <w:t>Two integer vectors with no overlapping elements are ini- tialized. The CosineSimilarity function is invoked with these vectors.</w:t>
+      </w:r>
+      <w:r>
+        <w:rPr>
+          <w:spacing w:val="-9"/>
+        </w:rPr>
+        <w:t xml:space="preserve"> </w:t>
+      </w:r>
+      <w:r>
+        <w:t>The</w:t>
+      </w:r>
+      <w:r>
+        <w:rPr>
+          <w:spacing w:val="-9"/>
+        </w:rPr>
+        <w:t xml:space="preserve"> </w:t>
+      </w:r>
+      <w:r>
+        <w:t>result</w:t>
+      </w:r>
+      <w:r>
+        <w:rPr>
+          <w:spacing w:val="-8"/>
+        </w:rPr>
+        <w:t xml:space="preserve"> </w:t>
+      </w:r>
+      <w:r>
+        <w:t>is</w:t>
+      </w:r>
+      <w:r>
+        <w:rPr>
+          <w:spacing w:val="-9"/>
+        </w:rPr>
+        <w:t xml:space="preserve"> </w:t>
+      </w:r>
+      <w:r>
+        <w:t>compared</w:t>
+      </w:r>
+      <w:r>
+        <w:rPr>
+          <w:spacing w:val="-9"/>
+        </w:rPr>
+        <w:t xml:space="preserve"> </w:t>
+      </w:r>
+      <w:r>
+        <w:t>to</w:t>
+      </w:r>
+      <w:r>
+        <w:rPr>
+          <w:spacing w:val="-9"/>
+        </w:rPr>
+        <w:t xml:space="preserve"> </w:t>
+      </w:r>
+      <w:r>
+        <w:t>the</w:t>
+      </w:r>
+      <w:r>
+        <w:rPr>
+          <w:spacing w:val="-8"/>
+        </w:rPr>
+        <w:t xml:space="preserve"> </w:t>
+      </w:r>
+      <w:r>
+        <w:t>expected</w:t>
+      </w:r>
+      <w:r>
+        <w:rPr>
+          <w:spacing w:val="-9"/>
+        </w:rPr>
+        <w:t xml:space="preserve"> </w:t>
+      </w:r>
+      <w:r>
+        <w:t>similarity</w:t>
+      </w:r>
+      <w:r>
+        <w:rPr>
+          <w:spacing w:val="-9"/>
+        </w:rPr>
+        <w:t xml:space="preserve"> </w:t>
+      </w:r>
+      <w:r>
+        <w:t>score of 0.0.</w:t>
       </w:r>
     </w:p>
     <w:p>
       <w:pPr>
         <w:pStyle w:val="Heading2"/>
         <w:spacing w:before="0" w:after="120"/>
-        <w:ind w:left="288" w:hanging="288"/>
         <w:rPr>
           <w:b/>
           <w:bCs/>
@@ -7883,34 +7555,6 @@
           <w:iCs w:val="0"/>
         </w:rPr>
       </w:pPr>
-      <w:r>
-        <w:rPr>
-          <w:b/>
-          <w:bCs/>
-          <w:i w:val="0"/>
-          <w:iCs w:val="0"/>
-        </w:rPr>
-        <w:t xml:space="preserve">    </w:t>
-      </w:r>
-      <w:r>
-        <w:rPr>
-          <w:b/>
-          <w:bCs/>
-          <w:i w:val="0"/>
-          <w:iCs w:val="0"/>
-        </w:rPr>
-        <w:t>Test</w:t>
-      </w:r>
-      <w:r>
-        <w:rPr>
-          <w:b/>
-          <w:bCs/>
-          <w:i w:val="0"/>
-          <w:iCs w:val="0"/>
-          <w:spacing w:val="1"/>
-        </w:rPr>
-        <w:t xml:space="preserve"> </w:t>
-      </w:r>
       <w:r>
         <w:rPr>
           <w:b/>
@@ -7919,7 +7563,246 @@
           <w:iCs w:val="0"/>
           <w:spacing w:val="-2"/>
         </w:rPr>
-        <w:t>Scenario:</w:t>
+        <w:t>Parameters:</w:t>
+      </w:r>
+    </w:p>
+    <w:p>
+      <w:pPr>
+        <w:pStyle w:val="BodyText"/>
+        <w:spacing w:before="20"/>
+        <w:ind w:firstLine="0"/>
+        <w:jc w:val="left"/>
+      </w:pPr>
+      <w:r>
+        <w:t>Input:</w:t>
+      </w:r>
+      <w:r>
+        <w:rPr>
+          <w:spacing w:val="26"/>
+        </w:rPr>
+        <w:t xml:space="preserve"> </w:t>
+      </w:r>
+      <w:r>
+        <w:t>vec1</w:t>
+      </w:r>
+      <w:r>
+        <w:rPr>
+          <w:spacing w:val="27"/>
+        </w:rPr>
+        <w:t xml:space="preserve"> </w:t>
+      </w:r>
+      <w:r>
+        <w:t>=</w:t>
+      </w:r>
+      <w:r>
+        <w:rPr>
+          <w:spacing w:val="26"/>
+        </w:rPr>
+        <w:t xml:space="preserve"> </w:t>
+      </w:r>
+      <w:r>
+        <w:t>1,</w:t>
+      </w:r>
+      <w:r>
+        <w:rPr>
+          <w:spacing w:val="27"/>
+        </w:rPr>
+        <w:t xml:space="preserve"> </w:t>
+      </w:r>
+      <w:r>
+        <w:t>1,</w:t>
+      </w:r>
+      <w:r>
+        <w:rPr>
+          <w:spacing w:val="27"/>
+        </w:rPr>
+        <w:t xml:space="preserve"> </w:t>
+      </w:r>
+      <w:r>
+        <w:t>1,</w:t>
+      </w:r>
+      <w:r>
+        <w:rPr>
+          <w:spacing w:val="26"/>
+        </w:rPr>
+        <w:t xml:space="preserve"> </w:t>
+      </w:r>
+      <w:r>
+        <w:t>1,</w:t>
+      </w:r>
+      <w:r>
+        <w:rPr>
+          <w:spacing w:val="27"/>
+        </w:rPr>
+        <w:t xml:space="preserve"> </w:t>
+      </w:r>
+      <w:r>
+        <w:t>1,</w:t>
+      </w:r>
+      <w:r>
+        <w:rPr>
+          <w:spacing w:val="27"/>
+        </w:rPr>
+        <w:t xml:space="preserve"> </w:t>
+      </w:r>
+      <w:r>
+        <w:t>vec2</w:t>
+      </w:r>
+      <w:r>
+        <w:rPr>
+          <w:spacing w:val="26"/>
+        </w:rPr>
+        <w:t xml:space="preserve"> </w:t>
+      </w:r>
+      <w:r>
+        <w:t>=</w:t>
+      </w:r>
+      <w:r>
+        <w:rPr>
+          <w:spacing w:val="27"/>
+        </w:rPr>
+        <w:t xml:space="preserve"> </w:t>
+      </w:r>
+      <w:r>
+        <w:t>0,</w:t>
+      </w:r>
+      <w:r>
+        <w:rPr>
+          <w:spacing w:val="27"/>
+        </w:rPr>
+        <w:t xml:space="preserve"> </w:t>
+      </w:r>
+      <w:r>
+        <w:t>0,</w:t>
+      </w:r>
+      <w:r>
+        <w:rPr>
+          <w:spacing w:val="26"/>
+        </w:rPr>
+        <w:t xml:space="preserve"> </w:t>
+      </w:r>
+      <w:r>
+        <w:t>0,</w:t>
+      </w:r>
+      <w:r>
+        <w:rPr>
+          <w:spacing w:val="27"/>
+        </w:rPr>
+        <w:t xml:space="preserve"> </w:t>
+      </w:r>
+      <w:r>
+        <w:t>0,</w:t>
+      </w:r>
+      <w:r>
+        <w:rPr>
+          <w:spacing w:val="27"/>
+        </w:rPr>
+        <w:t xml:space="preserve"> </w:t>
+      </w:r>
+      <w:r>
+        <w:t>0</w:t>
+      </w:r>
+      <w:r>
+        <w:rPr>
+          <w:spacing w:val="26"/>
+        </w:rPr>
+        <w:t xml:space="preserve"> </w:t>
+      </w:r>
+      <w:r>
+        <w:rPr>
+          <w:spacing w:val="-2"/>
+        </w:rPr>
+        <w:t>Expected</w:t>
+      </w:r>
+    </w:p>
+    <w:p>
+      <w:pPr>
+        <w:pStyle w:val="BodyText"/>
+        <w:spacing w:before="9"/>
+        <w:ind w:firstLine="0"/>
+        <w:jc w:val="left"/>
+      </w:pPr>
+      <w:r>
+        <w:t>Output:</w:t>
+      </w:r>
+      <w:r>
+        <w:rPr>
+          <w:spacing w:val="11"/>
+        </w:rPr>
+        <w:t xml:space="preserve"> </w:t>
+      </w:r>
+      <w:r>
+        <w:t>0.0</w:t>
+      </w:r>
+      <w:r>
+        <w:rPr>
+          <w:spacing w:val="11"/>
+        </w:rPr>
+        <w:t xml:space="preserve"> </w:t>
+      </w:r>
+      <w:r>
+        <w:t>Delta</w:t>
+      </w:r>
+      <w:r>
+        <w:rPr>
+          <w:spacing w:val="11"/>
+        </w:rPr>
+        <w:t xml:space="preserve"> </w:t>
+      </w:r>
+      <w:r>
+        <w:t>for</w:t>
+      </w:r>
+      <w:r>
+        <w:rPr>
+          <w:spacing w:val="11"/>
+        </w:rPr>
+        <w:t xml:space="preserve"> </w:t>
+      </w:r>
+      <w:r>
+        <w:t>Tolerance:</w:t>
+      </w:r>
+      <w:r>
+        <w:rPr>
+          <w:spacing w:val="11"/>
+        </w:rPr>
+        <w:t xml:space="preserve"> </w:t>
+      </w:r>
+      <w:r>
+        <w:rPr>
+          <w:spacing w:val="-4"/>
+        </w:rPr>
+        <w:t>0.01</w:t>
+      </w:r>
+    </w:p>
+    <w:p>
+      <w:pPr>
+        <w:pStyle w:val="Heading2"/>
+        <w:spacing w:before="0" w:after="120"/>
+        <w:rPr>
+          <w:b/>
+          <w:bCs/>
+          <w:i w:val="0"/>
+          <w:iCs w:val="0"/>
+        </w:rPr>
+      </w:pPr>
+      <w:r>
+        <w:rPr>
+          <w:b/>
+          <w:bCs/>
+          <w:i w:val="0"/>
+          <w:iCs w:val="0"/>
+        </w:rPr>
+        <w:t>Outcome</w:t>
+      </w:r>
+      <w:r>
+        <w:rPr>
+          <w:b/>
+          <w:bCs/>
+          <w:i w:val="0"/>
+          <w:iCs w:val="0"/>
+          <w:spacing w:val="16"/>
+        </w:rPr>
+        <w:t xml:space="preserve"> </w:t>
       </w:r>
       <w:r>
         <w:rPr>
@@ -7929,438 +7812,6 @@
           <w:iCs w:val="0"/>
           <w:spacing w:val="-2"/>
         </w:rPr>
-        <w:t xml:space="preserve"> </w:t>
-      </w:r>
-      <w:r>
-        <w:rPr>
-          <w:i w:val="0"/>
-          <w:iCs w:val="0"/>
-        </w:rPr>
-        <w:t>Two integer vectors with no overlapping elements are ini- tialized. The CosineSimilarity function is invoked with these vectors.</w:t>
-      </w:r>
-      <w:r>
-        <w:rPr>
-          <w:i w:val="0"/>
-          <w:iCs w:val="0"/>
-          <w:spacing w:val="-9"/>
-        </w:rPr>
-        <w:t xml:space="preserve"> </w:t>
-      </w:r>
-      <w:r>
-        <w:rPr>
-          <w:i w:val="0"/>
-          <w:iCs w:val="0"/>
-        </w:rPr>
-        <w:t>The</w:t>
-      </w:r>
-      <w:r>
-        <w:rPr>
-          <w:i w:val="0"/>
-          <w:iCs w:val="0"/>
-          <w:spacing w:val="-9"/>
-        </w:rPr>
-        <w:t xml:space="preserve"> </w:t>
-      </w:r>
-      <w:r>
-        <w:rPr>
-          <w:i w:val="0"/>
-          <w:iCs w:val="0"/>
-        </w:rPr>
-        <w:t>result</w:t>
-      </w:r>
-      <w:r>
-        <w:rPr>
-          <w:i w:val="0"/>
-          <w:iCs w:val="0"/>
-          <w:spacing w:val="-8"/>
-        </w:rPr>
-        <w:t xml:space="preserve"> </w:t>
-      </w:r>
-      <w:r>
-        <w:rPr>
-          <w:i w:val="0"/>
-          <w:iCs w:val="0"/>
-        </w:rPr>
-        <w:t>is</w:t>
-      </w:r>
-      <w:r>
-        <w:rPr>
-          <w:i w:val="0"/>
-          <w:iCs w:val="0"/>
-          <w:spacing w:val="-9"/>
-        </w:rPr>
-        <w:t xml:space="preserve"> </w:t>
-      </w:r>
-      <w:r>
-        <w:rPr>
-          <w:i w:val="0"/>
-          <w:iCs w:val="0"/>
-        </w:rPr>
-        <w:t>compared</w:t>
-      </w:r>
-      <w:r>
-        <w:rPr>
-          <w:i w:val="0"/>
-          <w:iCs w:val="0"/>
-          <w:spacing w:val="-9"/>
-        </w:rPr>
-        <w:t xml:space="preserve"> </w:t>
-      </w:r>
-      <w:r>
-        <w:rPr>
-          <w:i w:val="0"/>
-          <w:iCs w:val="0"/>
-        </w:rPr>
-        <w:t>to</w:t>
-      </w:r>
-      <w:r>
-        <w:rPr>
-          <w:i w:val="0"/>
-          <w:iCs w:val="0"/>
-          <w:spacing w:val="-9"/>
-        </w:rPr>
-        <w:t xml:space="preserve"> </w:t>
-      </w:r>
-      <w:r>
-        <w:rPr>
-          <w:i w:val="0"/>
-          <w:iCs w:val="0"/>
-        </w:rPr>
-        <w:t>the</w:t>
-      </w:r>
-      <w:r>
-        <w:rPr>
-          <w:i w:val="0"/>
-          <w:iCs w:val="0"/>
-          <w:spacing w:val="-8"/>
-        </w:rPr>
-        <w:t xml:space="preserve"> </w:t>
-      </w:r>
-      <w:r>
-        <w:rPr>
-          <w:i w:val="0"/>
-          <w:iCs w:val="0"/>
-        </w:rPr>
-        <w:t>expected</w:t>
-      </w:r>
-      <w:r>
-        <w:rPr>
-          <w:i w:val="0"/>
-          <w:iCs w:val="0"/>
-          <w:spacing w:val="-9"/>
-        </w:rPr>
-        <w:t xml:space="preserve"> </w:t>
-      </w:r>
-      <w:r>
-        <w:rPr>
-          <w:i w:val="0"/>
-          <w:iCs w:val="0"/>
-        </w:rPr>
-        <w:t>similarity</w:t>
-      </w:r>
-      <w:r>
-        <w:rPr>
-          <w:i w:val="0"/>
-          <w:iCs w:val="0"/>
-          <w:spacing w:val="-9"/>
-        </w:rPr>
-        <w:t xml:space="preserve"> </w:t>
-      </w:r>
-      <w:r>
-        <w:rPr>
-          <w:i w:val="0"/>
-          <w:iCs w:val="0"/>
-        </w:rPr>
-        <w:t>score of 0.0.</w:t>
-      </w:r>
-    </w:p>
-    <w:p>
-      <w:pPr>
-        <w:pStyle w:val="Heading2"/>
-        <w:spacing w:before="0" w:after="120"/>
-        <w:rPr>
-          <w:b/>
-          <w:bCs/>
-          <w:i w:val="0"/>
-          <w:iCs w:val="0"/>
-        </w:rPr>
-      </w:pPr>
-      <w:r>
-        <w:rPr>
-          <w:b/>
-          <w:bCs/>
-          <w:i w:val="0"/>
-          <w:iCs w:val="0"/>
-          <w:spacing w:val="-2"/>
-        </w:rPr>
-        <w:t xml:space="preserve">   </w:t>
-      </w:r>
-      <w:r>
-        <w:rPr>
-          <w:b/>
-          <w:bCs/>
-          <w:i w:val="0"/>
-          <w:iCs w:val="0"/>
-          <w:spacing w:val="-2"/>
-        </w:rPr>
-        <w:t>Parameters:</w:t>
-      </w:r>
-    </w:p>
-    <w:p>
-      <w:pPr>
-        <w:pStyle w:val="BodyText"/>
-        <w:spacing w:before="20"/>
-        <w:ind w:firstLine="0"/>
-        <w:jc w:val="left"/>
-      </w:pPr>
-      <w:r>
-        <w:t>Input:</w:t>
-      </w:r>
-      <w:r>
-        <w:rPr>
-          <w:spacing w:val="26"/>
-        </w:rPr>
-        <w:t xml:space="preserve"> </w:t>
-      </w:r>
-      <w:r>
-        <w:t>vec1</w:t>
-      </w:r>
-      <w:r>
-        <w:rPr>
-          <w:spacing w:val="27"/>
-        </w:rPr>
-        <w:t xml:space="preserve"> </w:t>
-      </w:r>
-      <w:r>
-        <w:t>=</w:t>
-      </w:r>
-      <w:r>
-        <w:rPr>
-          <w:spacing w:val="26"/>
-        </w:rPr>
-        <w:t xml:space="preserve"> </w:t>
-      </w:r>
-      <w:r>
-        <w:t>1,</w:t>
-      </w:r>
-      <w:r>
-        <w:rPr>
-          <w:spacing w:val="27"/>
-        </w:rPr>
-        <w:t xml:space="preserve"> </w:t>
-      </w:r>
-      <w:r>
-        <w:t>1,</w:t>
-      </w:r>
-      <w:r>
-        <w:rPr>
-          <w:spacing w:val="27"/>
-        </w:rPr>
-        <w:t xml:space="preserve"> </w:t>
-      </w:r>
-      <w:r>
-        <w:t>1,</w:t>
-      </w:r>
-      <w:r>
-        <w:rPr>
-          <w:spacing w:val="26"/>
-        </w:rPr>
-        <w:t xml:space="preserve"> </w:t>
-      </w:r>
-      <w:r>
-        <w:t>1,</w:t>
-      </w:r>
-      <w:r>
-        <w:rPr>
-          <w:spacing w:val="27"/>
-        </w:rPr>
-        <w:t xml:space="preserve"> </w:t>
-      </w:r>
-      <w:r>
-        <w:t>1,</w:t>
-      </w:r>
-      <w:r>
-        <w:rPr>
-          <w:spacing w:val="27"/>
-        </w:rPr>
-        <w:t xml:space="preserve"> </w:t>
-      </w:r>
-      <w:r>
-        <w:t>vec2</w:t>
-      </w:r>
-      <w:r>
-        <w:rPr>
-          <w:spacing w:val="26"/>
-        </w:rPr>
-        <w:t xml:space="preserve"> </w:t>
-      </w:r>
-      <w:r>
-        <w:t>=</w:t>
-      </w:r>
-      <w:r>
-        <w:rPr>
-          <w:spacing w:val="27"/>
-        </w:rPr>
-        <w:t xml:space="preserve"> </w:t>
-      </w:r>
-      <w:r>
-        <w:t>0,</w:t>
-      </w:r>
-      <w:r>
-        <w:rPr>
-          <w:spacing w:val="27"/>
-        </w:rPr>
-        <w:t xml:space="preserve"> </w:t>
-      </w:r>
-      <w:r>
-        <w:t>0,</w:t>
-      </w:r>
-      <w:r>
-        <w:rPr>
-          <w:spacing w:val="26"/>
-        </w:rPr>
-        <w:t xml:space="preserve"> </w:t>
-      </w:r>
-      <w:r>
-        <w:t>0,</w:t>
-      </w:r>
-      <w:r>
-        <w:rPr>
-          <w:spacing w:val="27"/>
-        </w:rPr>
-        <w:t xml:space="preserve"> </w:t>
-      </w:r>
-      <w:r>
-        <w:t>0,</w:t>
-      </w:r>
-      <w:r>
-        <w:rPr>
-          <w:spacing w:val="27"/>
-        </w:rPr>
-        <w:t xml:space="preserve"> </w:t>
-      </w:r>
-      <w:r>
-        <w:t>0</w:t>
-      </w:r>
-      <w:r>
-        <w:rPr>
-          <w:spacing w:val="26"/>
-        </w:rPr>
-        <w:t xml:space="preserve"> </w:t>
-      </w:r>
-      <w:r>
-        <w:rPr>
-          <w:spacing w:val="-2"/>
-        </w:rPr>
-        <w:t>Expected</w:t>
-      </w:r>
-    </w:p>
-    <w:p>
-      <w:pPr>
-        <w:pStyle w:val="BodyText"/>
-        <w:spacing w:before="9"/>
-        <w:ind w:firstLine="0"/>
-        <w:jc w:val="left"/>
-      </w:pPr>
-      <w:r>
-        <w:t>Output:</w:t>
-      </w:r>
-      <w:r>
-        <w:rPr>
-          <w:spacing w:val="11"/>
-        </w:rPr>
-        <w:t xml:space="preserve"> </w:t>
-      </w:r>
-      <w:r>
-        <w:t>0.0</w:t>
-      </w:r>
-      <w:r>
-        <w:rPr>
-          <w:spacing w:val="11"/>
-        </w:rPr>
-        <w:t xml:space="preserve"> </w:t>
-      </w:r>
-      <w:r>
-        <w:t>Delta</w:t>
-      </w:r>
-      <w:r>
-        <w:rPr>
-          <w:spacing w:val="11"/>
-        </w:rPr>
-        <w:t xml:space="preserve"> </w:t>
-      </w:r>
-      <w:r>
-        <w:t>for</w:t>
-      </w:r>
-      <w:r>
-        <w:rPr>
-          <w:spacing w:val="11"/>
-        </w:rPr>
-        <w:t xml:space="preserve"> </w:t>
-      </w:r>
-      <w:r>
-        <w:t>Tolerance:</w:t>
-      </w:r>
-      <w:r>
-        <w:rPr>
-          <w:spacing w:val="11"/>
-        </w:rPr>
-        <w:t xml:space="preserve"> </w:t>
-      </w:r>
-      <w:r>
-        <w:rPr>
-          <w:spacing w:val="-4"/>
-        </w:rPr>
-        <w:t>0.01</w:t>
-      </w:r>
-    </w:p>
-    <w:p>
-      <w:pPr>
-        <w:pStyle w:val="Heading2"/>
-        <w:spacing w:before="0" w:after="120"/>
-        <w:rPr>
-          <w:b/>
-          <w:bCs/>
-          <w:i w:val="0"/>
-          <w:iCs w:val="0"/>
-        </w:rPr>
-      </w:pPr>
-      <w:r>
-        <w:rPr>
-          <w:b/>
-          <w:bCs/>
-          <w:i w:val="0"/>
-          <w:iCs w:val="0"/>
-        </w:rPr>
-        <w:t xml:space="preserve">   </w:t>
-      </w:r>
-      <w:r>
-        <w:rPr>
-          <w:b/>
-          <w:bCs/>
-          <w:i w:val="0"/>
-          <w:iCs w:val="0"/>
-        </w:rPr>
-        <w:t>Outcome</w:t>
-      </w:r>
-      <w:r>
-        <w:rPr>
-          <w:b/>
-          <w:bCs/>
-          <w:i w:val="0"/>
-          <w:iCs w:val="0"/>
-          <w:spacing w:val="16"/>
-        </w:rPr>
-        <w:t xml:space="preserve"> </w:t>
-      </w:r>
-      <w:r>
-        <w:rPr>
-          <w:b/>
-          <w:bCs/>
-          <w:i w:val="0"/>
-          <w:iCs w:val="0"/>
-          <w:spacing w:val="-2"/>
-        </w:rPr>
         <w:t>Verification:</w:t>
       </w:r>
     </w:p>
@@ -8368,7 +7819,7 @@
       <w:pPr>
         <w:pStyle w:val="BodyText"/>
         <w:spacing w:before="20" w:line="249" w:lineRule="auto"/>
-        <w:ind w:firstLine="199"/>
+        <w:ind w:firstLine="0"/>
       </w:pPr>
       <w:r>
         <w:t>The</w:t>
@@ -8543,7 +7994,7 @@
         <w:rPr>
           <w:b/>
         </w:rPr>
-        <w:t xml:space="preserve">   Benefit</w:t>
+        <w:t>Benefit</w:t>
       </w:r>
       <w:r>
         <w:t>: This test ensures that the function correctly distinguishes between completely dissimilar data, a fundamental requirement for classification and clustering.</w:t>
@@ -8602,7 +8053,7 @@
       <w:pPr>
         <w:pStyle w:val="BodyText"/>
         <w:spacing w:line="249" w:lineRule="auto"/>
-        <w:ind w:firstLine="199"/>
+        <w:ind w:firstLine="0"/>
       </w:pPr>
       <w:r>
         <w:rPr>
@@ -8616,112 +8067,63 @@
     </w:p>
     <w:p>
       <w:pPr>
-        <w:pStyle w:val="Heading2"/>
-        <w:spacing w:before="0" w:after="120"/>
-        <w:ind w:left="288" w:hanging="288"/>
+        <w:pStyle w:val="BodyText"/>
+        <w:spacing w:line="249" w:lineRule="auto"/>
+        <w:ind w:firstLine="0"/>
+      </w:pPr>
+      <w:r>
         <w:rPr>
           <w:b/>
           <w:bCs/>
-          <w:i w:val="0"/>
-          <w:iCs w:val="0"/>
-        </w:rPr>
-      </w:pPr>
+        </w:rPr>
+        <w:t>Test</w:t>
+      </w:r>
       <w:r>
         <w:rPr>
           <w:b/>
           <w:bCs/>
-          <w:i w:val="0"/>
-          <w:iCs w:val="0"/>
-        </w:rPr>
-        <w:t xml:space="preserve">    </w:t>
+          <w:spacing w:val="1"/>
+        </w:rPr>
+        <w:t xml:space="preserve"> </w:t>
       </w:r>
       <w:r>
         <w:rPr>
           <w:b/>
           <w:bCs/>
-          <w:i w:val="0"/>
-          <w:iCs w:val="0"/>
-        </w:rPr>
-        <w:t>Test</w:t>
+          <w:spacing w:val="-2"/>
+        </w:rPr>
+        <w:t>Scenario</w:t>
       </w:r>
       <w:r>
         <w:rPr>
           <w:b/>
           <w:bCs/>
-          <w:i w:val="0"/>
-          <w:iCs w:val="0"/>
-          <w:spacing w:val="1"/>
-        </w:rPr>
-        <w:t xml:space="preserve"> </w:t>
+          <w:spacing w:val="-2"/>
+        </w:rPr>
+        <w:t>:</w:t>
       </w:r>
       <w:r>
         <w:rPr>
           <w:b/>
           <w:bCs/>
-          <w:i w:val="0"/>
-          <w:iCs w:val="0"/>
           <w:spacing w:val="-2"/>
         </w:rPr>
-        <w:t>Scenario</w:t>
-      </w:r>
-      <w:r>
-        <w:rPr>
-          <w:b/>
-          <w:bCs/>
-          <w:i w:val="0"/>
-          <w:iCs w:val="0"/>
-          <w:spacing w:val="-2"/>
-        </w:rPr>
-        <w:t>:</w:t>
-      </w:r>
-      <w:r>
-        <w:rPr>
-          <w:b/>
-          <w:bCs/>
-          <w:i w:val="0"/>
-          <w:iCs w:val="0"/>
-          <w:spacing w:val="-2"/>
-        </w:rPr>
-        <w:t xml:space="preserve"> </w:t>
-      </w:r>
-      <w:r>
-        <w:rPr>
-          <w:i w:val="0"/>
-          <w:iCs w:val="0"/>
-        </w:rPr>
-        <w:t>A set of permanence values is defined. The function is executed with a threshold of 0.7. The output is compared to</w:t>
-      </w:r>
-      <w:r>
-        <w:rPr>
-          <w:i w:val="0"/>
-          <w:iCs w:val="0"/>
-          <w:spacing w:val="40"/>
-        </w:rPr>
-        <w:t xml:space="preserve"> </w:t>
-      </w:r>
-      <w:r>
-        <w:rPr>
-          <w:i w:val="0"/>
-          <w:iCs w:val="0"/>
-        </w:rPr>
-        <w:t>the expected binary array.</w:t>
+        <w:t xml:space="preserve"> </w:t>
+      </w:r>
+      <w:r>
+        <w:t>A set of permanence values is defined. The function is executed with a threshold of 0.7. The output is compared to the expected binary array.</w:t>
       </w:r>
     </w:p>
     <w:p>
       <w:pPr>
         <w:pStyle w:val="BodyText"/>
         <w:ind w:firstLine="0"/>
+        <w:jc w:val="left"/>
       </w:pPr>
       <w:r>
         <w:rPr>
           <w:b/>
         </w:rPr>
-        <w:t xml:space="preserve">   </w:t>
-      </w:r>
-      <w:r>
-        <w:rPr>
-          <w:b/>
-        </w:rPr>
         <w:t>Parameters</w:t>
       </w:r>
       <w:r>
@@ -8737,13 +8139,43 @@
         <w:t>Input:</w:t>
       </w:r>
       <w:r>
+        <w:t xml:space="preserve"> </w:t>
+      </w:r>
+      <w:r>
+        <w:t>permanenceValues</w:t>
+      </w:r>
+      <w:r>
+        <w:rPr>
+          <w:spacing w:val="13"/>
+        </w:rPr>
+        <w:t xml:space="preserve"> </w:t>
+      </w:r>
+      <w:r>
+        <w:t>=</w:t>
+      </w:r>
+      <w:r>
+        <w:t xml:space="preserve"> </w:t>
+      </w:r>
+      <w:r>
+        <w:t>0.5,</w:t>
+      </w:r>
+      <w:r>
+        <w:rPr>
+          <w:spacing w:val="13"/>
+        </w:rPr>
+        <w:t xml:space="preserve"> </w:t>
+      </w:r>
+      <w:r>
+        <w:t>0.8,</w:t>
+      </w:r>
+      <w:r>
         <w:rPr>
           <w:spacing w:val="12"/>
         </w:rPr>
         <w:t xml:space="preserve"> </w:t>
       </w:r>
       <w:r>
-        <w:t>permanenceValues</w:t>
+        <w:t>0.3,</w:t>
       </w:r>
       <w:r>
         <w:rPr>
@@ -8752,88 +8184,50 @@
         <w:t xml:space="preserve"> </w:t>
       </w:r>
       <w:r>
+        <w:rPr>
+          <w:spacing w:val="-4"/>
+        </w:rPr>
+        <w:t>0.9,</w:t>
+      </w:r>
+      <w:r>
+        <w:t>0.7,</w:t>
+      </w:r>
+    </w:p>
+    <w:p>
+      <w:pPr>
+        <w:pStyle w:val="BodyText"/>
+        <w:jc w:val="left"/>
+        <w:rPr>
+          <w:spacing w:val="16"/>
+        </w:rPr>
+      </w:pPr>
+      <w:r>
+        <w:t>threshold</w:t>
+      </w:r>
+      <w:r>
+        <w:rPr>
+          <w:spacing w:val="16"/>
+        </w:rPr>
+        <w:t xml:space="preserve"> </w:t>
+      </w:r>
+      <w:r>
         <w:t>=</w:t>
       </w:r>
       <w:r>
         <w:rPr>
-          <w:spacing w:val="12"/>
-        </w:rPr>
-        <w:t xml:space="preserve"> </w:t>
-      </w:r>
-      <w:r>
-        <w:t>0.5,</w:t>
-      </w:r>
-      <w:r>
-        <w:rPr>
-          <w:spacing w:val="13"/>
-        </w:rPr>
-        <w:t xml:space="preserve"> </w:t>
-      </w:r>
-      <w:r>
-        <w:t>0.8,</w:t>
-      </w:r>
-      <w:r>
-        <w:rPr>
-          <w:spacing w:val="12"/>
-        </w:rPr>
-        <w:t xml:space="preserve"> </w:t>
-      </w:r>
-      <w:r>
-        <w:t>0.3,</w:t>
-      </w:r>
-      <w:r>
-        <w:rPr>
-          <w:spacing w:val="13"/>
-        </w:rPr>
-        <w:t xml:space="preserve"> </w:t>
-      </w:r>
-      <w:r>
-        <w:rPr>
-          <w:spacing w:val="-4"/>
-        </w:rPr>
-        <w:t>0.9,</w:t>
+          <w:spacing w:val="15"/>
+        </w:rPr>
+        <w:t xml:space="preserve"> </w:t>
+      </w:r>
+      <w:r>
+        <w:t>0.7</w:t>
       </w:r>
     </w:p>
     <w:p>
       <w:pPr>
         <w:pStyle w:val="BodyText"/>
-      </w:pPr>
-      <w:r>
-        <w:t>0.7,</w:t>
-      </w:r>
-      <w:r>
-        <w:rPr>
-          <w:spacing w:val="15"/>
-        </w:rPr>
-        <w:t xml:space="preserve"> </w:t>
-      </w:r>
-      <w:r>
-        <w:t>threshold</w:t>
-      </w:r>
-      <w:r>
-        <w:rPr>
-          <w:spacing w:val="16"/>
-        </w:rPr>
-        <w:t xml:space="preserve"> </w:t>
-      </w:r>
-      <w:r>
-        <w:t>=</w:t>
-      </w:r>
-      <w:r>
-        <w:rPr>
-          <w:spacing w:val="15"/>
-        </w:rPr>
-        <w:t xml:space="preserve"> </w:t>
-      </w:r>
-      <w:r>
-        <w:t>0.7</w:t>
-      </w:r>
-      <w:r>
-        <w:rPr>
-          <w:spacing w:val="16"/>
-        </w:rPr>
-        <w:t xml:space="preserve"> </w:t>
-      </w:r>
+        <w:jc w:val="left"/>
+      </w:pPr>
       <w:r>
         <w:t>Expected</w:t>
       </w:r>
@@ -8904,12 +8298,6 @@
         <w:rPr>
           <w:b/>
         </w:rPr>
-        <w:t xml:space="preserve">  </w:t>
-      </w:r>
-      <w:r>
-        <w:rPr>
-          <w:b/>
-        </w:rPr>
         <w:t>Outcome Verification</w:t>
       </w:r>
       <w:r>
@@ -8920,7 +8308,7 @@
       <w:pPr>
         <w:pStyle w:val="BodyText"/>
         <w:spacing w:line="249" w:lineRule="auto"/>
-        <w:ind w:firstLine="199"/>
+        <w:ind w:firstLine="0"/>
       </w:pPr>
       <w:r>
         <w:rPr>
@@ -9040,84 +8428,52 @@
     </w:p>
     <w:p>
       <w:pPr>
-        <w:pStyle w:val="Heading2"/>
-        <w:spacing w:before="8" w:after="120"/>
-        <w:ind w:left="89" w:hanging="288"/>
+        <w:pStyle w:val="BodyText"/>
+        <w:spacing w:before="100" w:line="249" w:lineRule="auto"/>
+        <w:ind w:right="257" w:firstLine="0"/>
+        <w:jc w:val="left"/>
+      </w:pPr>
+      <w:r>
         <w:rPr>
           <w:b/>
           <w:bCs/>
-          <w:i w:val="0"/>
-          <w:iCs w:val="0"/>
-        </w:rPr>
-      </w:pPr>
+        </w:rPr>
+        <w:t>Test</w:t>
+      </w:r>
       <w:r>
         <w:rPr>
           <w:b/>
           <w:bCs/>
-          <w:i w:val="0"/>
-          <w:iCs w:val="0"/>
-        </w:rPr>
-        <w:t xml:space="preserve">    </w:t>
+          <w:spacing w:val="1"/>
+        </w:rPr>
+        <w:t xml:space="preserve"> </w:t>
       </w:r>
       <w:r>
         <w:rPr>
           <w:b/>
           <w:bCs/>
-          <w:i w:val="0"/>
-          <w:iCs w:val="0"/>
-        </w:rPr>
-        <w:t>Test</w:t>
+          <w:spacing w:val="-2"/>
+        </w:rPr>
+        <w:t>Scenario:</w:t>
       </w:r>
       <w:r>
         <w:rPr>
           <w:b/>
           <w:bCs/>
-          <w:i w:val="0"/>
-          <w:iCs w:val="0"/>
-          <w:spacing w:val="1"/>
-        </w:rPr>
-        <w:t xml:space="preserve"> </w:t>
-      </w:r>
-      <w:r>
-        <w:rPr>
-          <w:b/>
-          <w:bCs/>
-          <w:i w:val="0"/>
-          <w:iCs w:val="0"/>
           <w:spacing w:val="-2"/>
         </w:rPr>
-        <w:t>Scenario:</w:t>
-      </w:r>
-      <w:r>
-        <w:rPr>
-          <w:b/>
-          <w:bCs/>
-          <w:i w:val="0"/>
-          <w:iCs w:val="0"/>
-          <w:spacing w:val="-2"/>
-        </w:rPr>
-        <w:t xml:space="preserve"> </w:t>
-      </w:r>
-      <w:r>
-        <w:rPr>
-          <w:i w:val="0"/>
-          <w:iCs w:val="0"/>
-        </w:rPr>
+        <w:t xml:space="preserve"> </w:t>
+      </w:r>
+      <w:r>
         <w:t>A valid permanence array (all non-negative values) is provided. The function is executed with a threshold. The output</w:t>
       </w:r>
       <w:r>
         <w:rPr>
-          <w:i w:val="0"/>
-          <w:iCs w:val="0"/>
           <w:spacing w:val="80"/>
         </w:rPr>
         <w:t xml:space="preserve"> </w:t>
       </w:r>
       <w:r>
-        <w:rPr>
-          <w:i w:val="0"/>
-          <w:iCs w:val="0"/>
-        </w:rPr>
         <w:t>is compared to the expected binary array.</w:t>
       </w:r>
     </w:p>
@@ -9157,11 +8513,9 @@
         </w:rPr>
         <w:t xml:space="preserve"> </w:t>
       </w:r>
-      <w:proofErr w:type="spellStart"/>
       <w:r>
         <w:t>permanenceValues</w:t>
       </w:r>
-      <w:proofErr w:type="spellEnd"/>
       <w:r>
         <w:rPr>
           <w:spacing w:val="12"/>
@@ -9215,6 +8569,9 @@
       <w:pPr>
         <w:pStyle w:val="BodyText"/>
         <w:spacing w:before="9"/>
+        <w:rPr>
+          <w:spacing w:val="15"/>
+        </w:rPr>
       </w:pPr>
       <w:r>
         <w:t>0.7,</w:t>
@@ -9225,6 +8582,15 @@
         </w:rPr>
         <w:t xml:space="preserve"> </w:t>
       </w:r>
+    </w:p>
+    <w:p>
+      <w:pPr>
+        <w:pStyle w:val="BodyText"/>
+        <w:spacing w:before="9"/>
+        <w:rPr>
+          <w:spacing w:val="16"/>
+        </w:rPr>
+      </w:pPr>
       <w:r>
         <w:t>threshold</w:t>
       </w:r>
@@ -9252,6 +8618,12 @@
         </w:rPr>
         <w:t xml:space="preserve"> </w:t>
       </w:r>
+    </w:p>
+    <w:p>
+      <w:pPr>
+        <w:pStyle w:val="BodyText"/>
+        <w:spacing w:before="9"/>
+      </w:pPr>
       <w:r>
         <w:t>Expected</w:t>
       </w:r>
@@ -9408,7 +8780,6 @@
         </w:rPr>
         <w:t xml:space="preserve"> </w:t>
       </w:r>
-      <w:proofErr w:type="gramStart"/>
       <w:r>
         <w:rPr>
           <w:i/>
@@ -9416,7 +8787,6 @@
         </w:rPr>
         <w:t>To</w:t>
       </w:r>
-      <w:proofErr w:type="gramEnd"/>
       <w:r>
         <w:rPr>
           <w:i/>
@@ -9717,6 +9087,7 @@
         <w:rPr>
           <w:b/>
         </w:rPr>
+        <w:lastRenderedPageBreak/>
         <w:t>Benefit</w:t>
       </w:r>
       <w:r>
@@ -9930,7 +9301,6 @@
         <w:rPr>
           <w:b/>
         </w:rPr>
-        <w:lastRenderedPageBreak/>
         <w:t>Objective</w:t>
       </w:r>
       <w:r>
@@ -10619,6 +9989,11 @@
     </w:p>
     <w:p>
       <w:pPr>
+        <w:pStyle w:val="BodyText"/>
+      </w:pPr>
+    </w:p>
+    <w:p>
+      <w:pPr>
         <w:pStyle w:val="tablefootnote"/>
         <w:keepNext/>
         <w:ind w:left="29" w:right="240"/>
@@ -10629,9 +10004,9 @@
           <w:noProof/>
         </w:rPr>
         <w:drawing>
-          <wp:inline distT="0" distB="0" distL="0" distR="0" wp14:anchorId="39B693A8" wp14:editId="7C1B8588">
-            <wp:extent cx="2901950" cy="2221865"/>
-            <wp:effectExtent l="0" t="0" r="0" b="6985"/>
+          <wp:inline distT="0" distB="0" distL="0" distR="0" wp14:anchorId="39B693A8" wp14:editId="2CEBE4FF">
+            <wp:extent cx="2889250" cy="1974850"/>
+            <wp:effectExtent l="0" t="0" r="6350" b="6350"/>
             <wp:docPr id="21" name="Image 21"/>
             <wp:cNvGraphicFramePr>
               <a:graphicFrameLocks xmlns:a="http://schemas.openxmlformats.org/drawingml/2006/main"/>
@@ -10652,7 +10027,7 @@
                   <pic:spPr>
                     <a:xfrm>
                       <a:off x="0" y="0"/>
-                      <a:ext cx="2901972" cy="2221882"/>
+                      <a:ext cx="2889272" cy="1974865"/>
                     </a:xfrm>
                     <a:prstGeom prst="rect">
                       <a:avLst/>
@@ -11380,7 +10755,6 @@
         </w:rPr>
         <w:t xml:space="preserve"> </w:t>
       </w:r>
-      <w:proofErr w:type="gramStart"/>
       <w:r>
         <w:rPr>
           <w:spacing w:val="-10"/>
@@ -11393,15 +10767,7 @@
           <w:smallCaps/>
           <w:sz w:val="16"/>
         </w:rPr>
-        <w:t xml:space="preserve"> .</w:t>
-      </w:r>
-      <w:proofErr w:type="gramEnd"/>
-      <w:r>
-        <w:rPr>
-          <w:smallCaps/>
-          <w:sz w:val="16"/>
-        </w:rPr>
-        <w:t xml:space="preserve"> KNN</w:t>
+        <w:t xml:space="preserve"> . KNN</w:t>
       </w:r>
       <w:r>
         <w:rPr>
@@ -12336,6 +11702,11 @@
       <w:pPr>
         <w:pStyle w:val="BodyText"/>
       </w:pPr>
+    </w:p>
+    <w:p>
+      <w:pPr>
+        <w:pStyle w:val="BodyText"/>
+      </w:pPr>
       <w:r>
         <w:t xml:space="preserve">The results demonstrate that the </w:t>
       </w:r>
@@ -12372,6 +11743,7 @@
           <w:i/>
           <w:sz w:val="20"/>
         </w:rPr>
+        <w:lastRenderedPageBreak/>
         <w:t>Classification</w:t>
       </w:r>
       <w:r>
@@ -12548,7 +11920,7 @@
     <w:tbl>
       <w:tblPr>
         <w:tblStyle w:val="TableGrid"/>
-        <w:tblpPr w:leftFromText="180" w:rightFromText="180" w:vertAnchor="text" w:horzAnchor="page" w:tblpX="6112" w:tblpY="-56"/>
+        <w:tblpPr w:leftFromText="180" w:rightFromText="180" w:vertAnchor="text" w:horzAnchor="margin" w:tblpY="-39"/>
         <w:tblW w:w="4957" w:type="dxa"/>
         <w:tblLook w:val="04A0" w:firstRow="1" w:lastRow="0" w:firstColumn="1" w:lastColumn="0" w:noHBand="0" w:noVBand="1"/>
       </w:tblPr>
@@ -12862,7 +12234,6 @@
         <w:ind w:left="360"/>
       </w:pPr>
       <w:r>
-        <w:lastRenderedPageBreak/>
         <w:t>Discussion</w:t>
       </w:r>
     </w:p>
@@ -13045,23 +12416,13 @@
         </w:rPr>
         <w:t>Hawkins, J., Ahmad, S., &amp; Dubinsky, D. (2011). Cortical learning algorithm and hierarchical temporal memory. </w:t>
       </w:r>
-      <w:proofErr w:type="spellStart"/>
       <w:r>
         <w:rPr>
           <w:i/>
           <w:iCs/>
           <w:sz w:val="16"/>
         </w:rPr>
-        <w:t>Numenta</w:t>
-      </w:r>
-      <w:proofErr w:type="spellEnd"/>
-      <w:r>
-        <w:rPr>
-          <w:i/>
-          <w:iCs/>
-          <w:sz w:val="16"/>
-        </w:rPr>
-        <w:t xml:space="preserve"> Whitepaper</w:t>
+        <w:t>Numenta Whitepaper</w:t>
       </w:r>
       <w:r>
         <w:rPr>
@@ -13190,21 +12551,7 @@
         <w:rPr>
           <w:sz w:val="16"/>
         </w:rPr>
-        <w:t xml:space="preserve">Guo, </w:t>
-      </w:r>
-      <w:proofErr w:type="spellStart"/>
-      <w:r>
-        <w:rPr>
-          <w:sz w:val="16"/>
-        </w:rPr>
-        <w:t>Gongde</w:t>
-      </w:r>
-      <w:proofErr w:type="spellEnd"/>
-      <w:r>
-        <w:rPr>
-          <w:sz w:val="16"/>
-        </w:rPr>
-        <w:t xml:space="preserve"> &amp; Wang, Hui &amp; Bell, David &amp; Bi, Yaxin. (2004). KNN Model-Based Approach in Classification.</w:t>
+        <w:t>Guo, Gongde &amp; Wang, Hui &amp; Bell, David &amp; Bi, Yaxin. (2004). KNN Model-Based Approach in Classification.</w:t>
       </w:r>
     </w:p>
     <w:p>
@@ -13228,21 +12575,7 @@
         <w:rPr>
           <w:sz w:val="16"/>
         </w:rPr>
-        <w:t xml:space="preserve">Antic, S. D., Zhou, W. L., Moore, A. R., Short, S. M., &amp; </w:t>
-      </w:r>
-      <w:proofErr w:type="spellStart"/>
-      <w:r>
-        <w:rPr>
-          <w:sz w:val="16"/>
-        </w:rPr>
-        <w:t>Ikonomu</w:t>
-      </w:r>
-      <w:proofErr w:type="spellEnd"/>
-      <w:r>
-        <w:rPr>
-          <w:sz w:val="16"/>
-        </w:rPr>
-        <w:t>, K. D. (2010). The decade of the dendritic NMDA spike. </w:t>
+        <w:t>Antic, S. D., Zhou, W. L., Moore, A. R., Short, S. M., &amp; Ikonomu, K. D. (2010). The decade of the dendritic NMDA spike. </w:t>
       </w:r>
       <w:r>
         <w:rPr>
@@ -14056,6 +13389,92 @@
     </w:lvl>
   </w:abstractNum>
   <w:abstractNum w:abstractNumId="4" w15:restartNumberingAfterBreak="0">
+    <w:nsid w:val="0A162B52"/>
+    <w:multiLevelType w:val="hybridMultilevel"/>
+    <w:tmpl w:val="5BDC58A8"/>
+    <w:lvl w:ilvl="0" w:tplc="40090011">
+      <w:start w:val="1"/>
+      <w:numFmt w:val="decimal"/>
+      <w:lvlText w:val="%1)"/>
+      <w:lvlJc w:val="left"/>
+      <w:pPr>
+        <w:ind w:left="1008" w:hanging="360"/>
+      </w:pPr>
+    </w:lvl>
+    <w:lvl w:ilvl="1" w:tplc="40090019" w:tentative="1">
+      <w:start w:val="1"/>
+      <w:numFmt w:val="lowerLetter"/>
+      <w:lvlText w:val="%2."/>
+      <w:lvlJc w:val="left"/>
+      <w:pPr>
+        <w:ind w:left="1728" w:hanging="360"/>
+      </w:pPr>
+    </w:lvl>
+    <w:lvl w:ilvl="2" w:tplc="4009001B" w:tentative="1">
+      <w:start w:val="1"/>
+      <w:numFmt w:val="lowerRoman"/>
+      <w:lvlText w:val="%3."/>
+      <w:lvlJc w:val="right"/>
+      <w:pPr>
+        <w:ind w:left="2448" w:hanging="180"/>
+      </w:pPr>
+    </w:lvl>
+    <w:lvl w:ilvl="3" w:tplc="4009000F" w:tentative="1">
+      <w:start w:val="1"/>
+      <w:numFmt w:val="decimal"/>
+      <w:lvlText w:val="%4."/>
+      <w:lvlJc w:val="left"/>
+      <w:pPr>
+        <w:ind w:left="3168" w:hanging="360"/>
+      </w:pPr>
+    </w:lvl>
+    <w:lvl w:ilvl="4" w:tplc="40090019" w:tentative="1">
+      <w:start w:val="1"/>
+      <w:numFmt w:val="lowerLetter"/>
+      <w:lvlText w:val="%5."/>
+      <w:lvlJc w:val="left"/>
+      <w:pPr>
+        <w:ind w:left="3888" w:hanging="360"/>
+      </w:pPr>
+    </w:lvl>
+    <w:lvl w:ilvl="5" w:tplc="4009001B" w:tentative="1">
+      <w:start w:val="1"/>
+      <w:numFmt w:val="lowerRoman"/>
+      <w:lvlText w:val="%6."/>
+      <w:lvlJc w:val="right"/>
+      <w:pPr>
+        <w:ind w:left="4608" w:hanging="180"/>
+      </w:pPr>
+    </w:lvl>
+    <w:lvl w:ilvl="6" w:tplc="4009000F" w:tentative="1">
+      <w:start w:val="1"/>
+      <w:numFmt w:val="decimal"/>
+      <w:lvlText w:val="%7."/>
+      <w:lvlJc w:val="left"/>
+      <w:pPr>
+        <w:ind w:left="5328" w:hanging="360"/>
+      </w:pPr>
+    </w:lvl>
+    <w:lvl w:ilvl="7" w:tplc="40090019" w:tentative="1">
+      <w:start w:val="1"/>
+      <w:numFmt w:val="lowerLetter"/>
+      <w:lvlText w:val="%8."/>
+      <w:lvlJc w:val="left"/>
+      <w:pPr>
+        <w:ind w:left="6048" w:hanging="360"/>
+      </w:pPr>
+    </w:lvl>
+    <w:lvl w:ilvl="8" w:tplc="4009001B" w:tentative="1">
+      <w:start w:val="1"/>
+      <w:numFmt w:val="lowerRoman"/>
+      <w:lvlText w:val="%9."/>
+      <w:lvlJc w:val="right"/>
+      <w:pPr>
+        <w:ind w:left="6768" w:hanging="180"/>
+      </w:pPr>
+    </w:lvl>
+  </w:abstractNum>
+  <w:abstractNum w:abstractNumId="5" w15:restartNumberingAfterBreak="0">
     <w:nsid w:val="136B17BB"/>
     <w:multiLevelType w:val="hybridMultilevel"/>
     <w:tmpl w:val="D52C81D4"/>
@@ -14182,7 +13601,7 @@
       </w:rPr>
     </w:lvl>
   </w:abstractNum>
-  <w:abstractNum w:abstractNumId="5" w15:restartNumberingAfterBreak="0">
+  <w:abstractNum w:abstractNumId="6" w15:restartNumberingAfterBreak="0">
     <w:nsid w:val="1518676A"/>
     <w:multiLevelType w:val="hybridMultilevel"/>
     <w:tmpl w:val="57860584"/>
@@ -14305,7 +13724,7 @@
       </w:rPr>
     </w:lvl>
   </w:abstractNum>
-  <w:abstractNum w:abstractNumId="6" w15:restartNumberingAfterBreak="0">
+  <w:abstractNum w:abstractNumId="7" w15:restartNumberingAfterBreak="0">
     <w:nsid w:val="18D30CB7"/>
     <w:multiLevelType w:val="hybridMultilevel"/>
     <w:tmpl w:val="FC828C2E"/>
@@ -14427,7 +13846,7 @@
       </w:rPr>
     </w:lvl>
   </w:abstractNum>
-  <w:abstractNum w:abstractNumId="7" w15:restartNumberingAfterBreak="0">
+  <w:abstractNum w:abstractNumId="8" w15:restartNumberingAfterBreak="0">
     <w:nsid w:val="25863780"/>
     <w:multiLevelType w:val="hybridMultilevel"/>
     <w:tmpl w:val="D9E0F9FE"/>
@@ -14550,7 +13969,7 @@
       </w:rPr>
     </w:lvl>
   </w:abstractNum>
-  <w:abstractNum w:abstractNumId="8" w15:restartNumberingAfterBreak="0">
+  <w:abstractNum w:abstractNumId="9" w15:restartNumberingAfterBreak="0">
     <w:nsid w:val="26FE1FCF"/>
     <w:multiLevelType w:val="hybridMultilevel"/>
     <w:tmpl w:val="33826962"/>
@@ -14711,7 +14130,7 @@
       </w:rPr>
     </w:lvl>
   </w:abstractNum>
-  <w:abstractNum w:abstractNumId="9" w15:restartNumberingAfterBreak="0">
+  <w:abstractNum w:abstractNumId="10" w15:restartNumberingAfterBreak="0">
     <w:nsid w:val="2FA801BA"/>
     <w:multiLevelType w:val="hybridMultilevel"/>
     <w:tmpl w:val="02DAC57A"/>
@@ -14809,11 +14228,239 @@
       </w:pPr>
     </w:lvl>
   </w:abstractNum>
-  <w:abstractNum w:abstractNumId="10" w15:restartNumberingAfterBreak="0">
+  <w:abstractNum w:abstractNumId="11" w15:restartNumberingAfterBreak="0">
     <w:nsid w:val="2FFD3570"/>
+    <w:multiLevelType w:val="multilevel"/>
+    <w:tmpl w:val="1F100400"/>
+    <w:lvl w:ilvl="0">
+      <w:start w:val="1"/>
+      <w:numFmt w:val="decimal"/>
+      <w:lvlText w:val="%1)"/>
+      <w:lvlJc w:val="left"/>
+      <w:pPr>
+        <w:ind w:left="360" w:hanging="360"/>
+      </w:pPr>
+      <w:rPr>
+        <w:rFonts w:hint="default"/>
+        <w:b w:val="0"/>
+        <w:bCs w:val="0"/>
+        <w:i/>
+        <w:iCs/>
+        <w:spacing w:val="0"/>
+        <w:w w:val="99"/>
+        <w:sz w:val="20"/>
+        <w:szCs w:val="20"/>
+        <w:lang w:val="en-US" w:eastAsia="en-US" w:bidi="ar-SA"/>
+      </w:rPr>
+    </w:lvl>
+    <w:lvl w:ilvl="1">
+      <w:start w:val="1"/>
+      <w:numFmt w:val="lowerLetter"/>
+      <w:lvlText w:val="%2)"/>
+      <w:lvlJc w:val="left"/>
+      <w:pPr>
+        <w:ind w:left="720" w:hanging="360"/>
+      </w:pPr>
+      <w:rPr>
+        <w:rFonts w:hint="default"/>
+        <w:b w:val="0"/>
+        <w:bCs w:val="0"/>
+        <w:i w:val="0"/>
+        <w:iCs w:val="0"/>
+        <w:spacing w:val="0"/>
+        <w:w w:val="99"/>
+        <w:sz w:val="20"/>
+        <w:szCs w:val="20"/>
+        <w:lang w:val="en-US" w:eastAsia="en-US" w:bidi="ar-SA"/>
+      </w:rPr>
+    </w:lvl>
+    <w:lvl w:ilvl="2">
+      <w:start w:val="1"/>
+      <w:numFmt w:val="lowerLetter"/>
+      <w:lvlText w:val="%3)"/>
+      <w:lvlJc w:val="left"/>
+      <w:pPr>
+        <w:ind w:left="1080" w:hanging="360"/>
+      </w:pPr>
+    </w:lvl>
+    <w:lvl w:ilvl="3">
+      <w:start w:val="1"/>
+      <w:numFmt w:val="decimal"/>
+      <w:lvlText w:val="(%4)"/>
+      <w:lvlJc w:val="left"/>
+      <w:pPr>
+        <w:ind w:left="1440" w:hanging="360"/>
+      </w:pPr>
+      <w:rPr>
+        <w:rFonts w:hint="default"/>
+        <w:b/>
+        <w:bCs/>
+        <w:i w:val="0"/>
+        <w:iCs w:val="0"/>
+        <w:spacing w:val="0"/>
+        <w:w w:val="99"/>
+        <w:sz w:val="20"/>
+        <w:szCs w:val="20"/>
+        <w:lang w:val="en-US" w:eastAsia="en-US" w:bidi="ar-SA"/>
+      </w:rPr>
+    </w:lvl>
+    <w:lvl w:ilvl="4">
+      <w:start w:val="1"/>
+      <w:numFmt w:val="lowerLetter"/>
+      <w:lvlText w:val="(%5)"/>
+      <w:lvlJc w:val="left"/>
+      <w:pPr>
+        <w:ind w:left="1800" w:hanging="360"/>
+      </w:pPr>
+      <w:rPr>
+        <w:rFonts w:hint="default"/>
+        <w:lang w:val="en-US" w:eastAsia="en-US" w:bidi="ar-SA"/>
+      </w:rPr>
+    </w:lvl>
+    <w:lvl w:ilvl="5">
+      <w:start w:val="1"/>
+      <w:numFmt w:val="lowerRoman"/>
+      <w:lvlText w:val="(%6)"/>
+      <w:lvlJc w:val="left"/>
+      <w:pPr>
+        <w:ind w:left="2160" w:hanging="360"/>
+      </w:pPr>
+      <w:rPr>
+        <w:rFonts w:hint="default"/>
+        <w:lang w:val="en-US" w:eastAsia="en-US" w:bidi="ar-SA"/>
+      </w:rPr>
+    </w:lvl>
+    <w:lvl w:ilvl="6">
+      <w:start w:val="1"/>
+      <w:numFmt w:val="decimal"/>
+      <w:lvlText w:val="%7."/>
+      <w:lvlJc w:val="left"/>
+      <w:pPr>
+        <w:ind w:left="2520" w:hanging="360"/>
+      </w:pPr>
+      <w:rPr>
+        <w:rFonts w:hint="default"/>
+        <w:lang w:val="en-US" w:eastAsia="en-US" w:bidi="ar-SA"/>
+      </w:rPr>
+    </w:lvl>
+    <w:lvl w:ilvl="7">
+      <w:start w:val="1"/>
+      <w:numFmt w:val="lowerLetter"/>
+      <w:lvlText w:val="%8."/>
+      <w:lvlJc w:val="left"/>
+      <w:pPr>
+        <w:ind w:left="2880" w:hanging="360"/>
+      </w:pPr>
+      <w:rPr>
+        <w:rFonts w:hint="default"/>
+        <w:lang w:val="en-US" w:eastAsia="en-US" w:bidi="ar-SA"/>
+      </w:rPr>
+    </w:lvl>
+    <w:lvl w:ilvl="8">
+      <w:start w:val="1"/>
+      <w:numFmt w:val="lowerRoman"/>
+      <w:lvlText w:val="%9."/>
+      <w:lvlJc w:val="left"/>
+      <w:pPr>
+        <w:ind w:left="3240" w:hanging="360"/>
+      </w:pPr>
+      <w:rPr>
+        <w:rFonts w:hint="default"/>
+        <w:lang w:val="en-US" w:eastAsia="en-US" w:bidi="ar-SA"/>
+      </w:rPr>
+    </w:lvl>
+  </w:abstractNum>
+  <w:abstractNum w:abstractNumId="12" w15:restartNumberingAfterBreak="0">
+    <w:nsid w:val="327144B6"/>
     <w:multiLevelType w:val="hybridMultilevel"/>
-    <w:tmpl w:val="2268594C"/>
-    <w:lvl w:ilvl="0" w:tplc="FFFFFFFF">
+    <w:tmpl w:val="94AE6026"/>
+    <w:lvl w:ilvl="0" w:tplc="40090013">
+      <w:start w:val="1"/>
+      <w:numFmt w:val="upperRoman"/>
+      <w:lvlText w:val="%1."/>
+      <w:lvlJc w:val="right"/>
+      <w:pPr>
+        <w:ind w:left="720" w:hanging="360"/>
+      </w:pPr>
+    </w:lvl>
+    <w:lvl w:ilvl="1" w:tplc="40090019" w:tentative="1">
+      <w:start w:val="1"/>
+      <w:numFmt w:val="lowerLetter"/>
+      <w:lvlText w:val="%2."/>
+      <w:lvlJc w:val="left"/>
+      <w:pPr>
+        <w:ind w:left="1440" w:hanging="360"/>
+      </w:pPr>
+    </w:lvl>
+    <w:lvl w:ilvl="2" w:tplc="4009001B" w:tentative="1">
+      <w:start w:val="1"/>
+      <w:numFmt w:val="lowerRoman"/>
+      <w:lvlText w:val="%3."/>
+      <w:lvlJc w:val="right"/>
+      <w:pPr>
+        <w:ind w:left="2160" w:hanging="180"/>
+      </w:pPr>
+    </w:lvl>
+    <w:lvl w:ilvl="3" w:tplc="4009000F" w:tentative="1">
+      <w:start w:val="1"/>
+      <w:numFmt w:val="decimal"/>
+      <w:lvlText w:val="%4."/>
+      <w:lvlJc w:val="left"/>
+      <w:pPr>
+        <w:ind w:left="2880" w:hanging="360"/>
+      </w:pPr>
+    </w:lvl>
+    <w:lvl w:ilvl="4" w:tplc="40090019" w:tentative="1">
+      <w:start w:val="1"/>
+      <w:numFmt w:val="lowerLetter"/>
+      <w:lvlText w:val="%5."/>
+      <w:lvlJc w:val="left"/>
+      <w:pPr>
+        <w:ind w:left="3600" w:hanging="360"/>
+      </w:pPr>
+    </w:lvl>
+    <w:lvl w:ilvl="5" w:tplc="4009001B" w:tentative="1">
+      <w:start w:val="1"/>
+      <w:numFmt w:val="lowerRoman"/>
+      <w:lvlText w:val="%6."/>
+      <w:lvlJc w:val="right"/>
+      <w:pPr>
+        <w:ind w:left="4320" w:hanging="180"/>
+      </w:pPr>
+    </w:lvl>
+    <w:lvl w:ilvl="6" w:tplc="4009000F" w:tentative="1">
+      <w:start w:val="1"/>
+      <w:numFmt w:val="decimal"/>
+      <w:lvlText w:val="%7."/>
+      <w:lvlJc w:val="left"/>
+      <w:pPr>
+        <w:ind w:left="5040" w:hanging="360"/>
+      </w:pPr>
+    </w:lvl>
+    <w:lvl w:ilvl="7" w:tplc="40090019" w:tentative="1">
+      <w:start w:val="1"/>
+      <w:numFmt w:val="lowerLetter"/>
+      <w:lvlText w:val="%8."/>
+      <w:lvlJc w:val="left"/>
+      <w:pPr>
+        <w:ind w:left="5760" w:hanging="360"/>
+      </w:pPr>
+    </w:lvl>
+    <w:lvl w:ilvl="8" w:tplc="4009001B" w:tentative="1">
+      <w:start w:val="1"/>
+      <w:numFmt w:val="lowerRoman"/>
+      <w:lvlText w:val="%9."/>
+      <w:lvlJc w:val="right"/>
+      <w:pPr>
+        <w:ind w:left="6480" w:hanging="180"/>
+      </w:pPr>
+    </w:lvl>
+  </w:abstractNum>
+  <w:abstractNum w:abstractNumId="13" w15:restartNumberingAfterBreak="0">
+    <w:nsid w:val="329959E7"/>
+    <w:multiLevelType w:val="hybridMultilevel"/>
+    <w:tmpl w:val="46AA3D5C"/>
+    <w:lvl w:ilvl="0" w:tplc="B85AC5F6">
       <w:start w:val="1"/>
       <w:numFmt w:val="upperLetter"/>
       <w:lvlText w:val="%1."/>
@@ -14835,7 +14482,7 @@
         <w:lang w:val="en-US" w:eastAsia="en-US" w:bidi="ar-SA"/>
       </w:rPr>
     </w:lvl>
-    <w:lvl w:ilvl="1" w:tplc="FFFFFFFF">
+    <w:lvl w:ilvl="1" w:tplc="F8FEBE2E">
       <w:start w:val="1"/>
       <w:numFmt w:val="decimal"/>
       <w:lvlText w:val="%2)"/>
@@ -14861,7 +14508,7 @@
       <w:lvlText w:val="•"/>
       <w:lvlJc w:val="left"/>
       <w:pPr>
-        <w:ind w:left="1192" w:hanging="360"/>
+        <w:ind w:left="1034" w:hanging="202"/>
       </w:pPr>
       <w:rPr>
         <w:rFonts w:ascii="Arial" w:eastAsia="Arial" w:hAnsi="Arial" w:cs="Arial" w:hint="default"/>
@@ -14876,7 +14523,7 @@
         <w:lang w:val="en-US" w:eastAsia="en-US" w:bidi="ar-SA"/>
       </w:rPr>
     </w:lvl>
-    <w:lvl w:ilvl="3" w:tplc="FFFFFFFF">
+    <w:lvl w:ilvl="3" w:tplc="93CA4A62">
       <w:numFmt w:val="bullet"/>
       <w:lvlText w:val="–"/>
       <w:lvlJc w:val="left"/>
@@ -14896,7 +14543,7 @@
         <w:lang w:val="en-US" w:eastAsia="en-US" w:bidi="ar-SA"/>
       </w:rPr>
     </w:lvl>
-    <w:lvl w:ilvl="4" w:tplc="FFFFFFFF">
+    <w:lvl w:ilvl="4" w:tplc="09B230B6">
       <w:numFmt w:val="bullet"/>
       <w:lvlText w:val="•"/>
       <w:lvlJc w:val="left"/>
@@ -14908,7 +14555,7 @@
         <w:lang w:val="en-US" w:eastAsia="en-US" w:bidi="ar-SA"/>
       </w:rPr>
     </w:lvl>
-    <w:lvl w:ilvl="5" w:tplc="FFFFFFFF">
+    <w:lvl w:ilvl="5" w:tplc="16BC6B46">
       <w:numFmt w:val="bullet"/>
       <w:lvlText w:val="•"/>
       <w:lvlJc w:val="left"/>
@@ -14920,7 +14567,7 @@
         <w:lang w:val="en-US" w:eastAsia="en-US" w:bidi="ar-SA"/>
       </w:rPr>
     </w:lvl>
-    <w:lvl w:ilvl="6" w:tplc="FFFFFFFF">
+    <w:lvl w:ilvl="6" w:tplc="D5C8DD94">
       <w:numFmt w:val="bullet"/>
       <w:lvlText w:val="•"/>
       <w:lvlJc w:val="left"/>
@@ -14932,7 +14579,7 @@
         <w:lang w:val="en-US" w:eastAsia="en-US" w:bidi="ar-SA"/>
       </w:rPr>
     </w:lvl>
-    <w:lvl w:ilvl="7" w:tplc="FFFFFFFF">
+    <w:lvl w:ilvl="7" w:tplc="291C6E2C">
       <w:numFmt w:val="bullet"/>
       <w:lvlText w:val="•"/>
       <w:lvlJc w:val="left"/>
@@ -14944,7 +14591,7 @@
         <w:lang w:val="en-US" w:eastAsia="en-US" w:bidi="ar-SA"/>
       </w:rPr>
     </w:lvl>
-    <w:lvl w:ilvl="8" w:tplc="FFFFFFFF">
+    <w:lvl w:ilvl="8" w:tplc="19F8AFD8">
       <w:numFmt w:val="bullet"/>
       <w:lvlText w:val="•"/>
       <w:lvlJc w:val="left"/>
@@ -14957,15 +14604,15 @@
       </w:rPr>
     </w:lvl>
   </w:abstractNum>
-  <w:abstractNum w:abstractNumId="11" w15:restartNumberingAfterBreak="0">
-    <w:nsid w:val="327144B6"/>
+  <w:abstractNum w:abstractNumId="14" w15:restartNumberingAfterBreak="0">
+    <w:nsid w:val="35BF1372"/>
     <w:multiLevelType w:val="hybridMultilevel"/>
-    <w:tmpl w:val="94AE6026"/>
-    <w:lvl w:ilvl="0" w:tplc="40090013">
-      <w:start w:val="1"/>
-      <w:numFmt w:val="upperRoman"/>
+    <w:tmpl w:val="3B1E53AC"/>
+    <w:lvl w:ilvl="0" w:tplc="4009000F">
+      <w:start w:val="1"/>
+      <w:numFmt w:val="decimal"/>
       <w:lvlText w:val="%1."/>
-      <w:lvlJc w:val="right"/>
+      <w:lvlJc w:val="left"/>
       <w:pPr>
         <w:ind w:left="720" w:hanging="360"/>
       </w:pPr>
@@ -15043,11 +14690,11 @@
       </w:pPr>
     </w:lvl>
   </w:abstractNum>
-  <w:abstractNum w:abstractNumId="12" w15:restartNumberingAfterBreak="0">
-    <w:nsid w:val="329959E7"/>
+  <w:abstractNum w:abstractNumId="15" w15:restartNumberingAfterBreak="0">
+    <w:nsid w:val="395E7C60"/>
     <w:multiLevelType w:val="hybridMultilevel"/>
-    <w:tmpl w:val="46AA3D5C"/>
-    <w:lvl w:ilvl="0" w:tplc="B85AC5F6">
+    <w:tmpl w:val="7A5E0DF8"/>
+    <w:lvl w:ilvl="0" w:tplc="333CE4A0">
       <w:start w:val="1"/>
       <w:numFmt w:val="upperLetter"/>
       <w:lvlText w:val="%1."/>
@@ -15069,7 +14716,228 @@
         <w:lang w:val="en-US" w:eastAsia="en-US" w:bidi="ar-SA"/>
       </w:rPr>
     </w:lvl>
-    <w:lvl w:ilvl="1" w:tplc="F8FEBE2E">
+    <w:lvl w:ilvl="1" w:tplc="8ED4DA4A">
+      <w:numFmt w:val="bullet"/>
+      <w:lvlText w:val="•"/>
+      <w:lvlJc w:val="left"/>
+      <w:pPr>
+        <w:ind w:left="659" w:hanging="202"/>
+      </w:pPr>
+      <w:rPr>
+        <w:rFonts w:ascii="Arial" w:eastAsia="Arial" w:hAnsi="Arial" w:cs="Arial" w:hint="default"/>
+        <w:b w:val="0"/>
+        <w:bCs w:val="0"/>
+        <w:i/>
+        <w:iCs/>
+        <w:spacing w:val="0"/>
+        <w:w w:val="166"/>
+        <w:sz w:val="14"/>
+        <w:szCs w:val="14"/>
+        <w:lang w:val="en-US" w:eastAsia="en-US" w:bidi="ar-SA"/>
+      </w:rPr>
+    </w:lvl>
+    <w:lvl w:ilvl="2" w:tplc="0220E15C">
+      <w:numFmt w:val="bullet"/>
+      <w:lvlText w:val="•"/>
+      <w:lvlJc w:val="left"/>
+      <w:pPr>
+        <w:ind w:left="582" w:hanging="202"/>
+      </w:pPr>
+      <w:rPr>
+        <w:rFonts w:hint="default"/>
+        <w:lang w:val="en-US" w:eastAsia="en-US" w:bidi="ar-SA"/>
+      </w:rPr>
+    </w:lvl>
+    <w:lvl w:ilvl="3" w:tplc="22E61644">
+      <w:numFmt w:val="bullet"/>
+      <w:lvlText w:val="•"/>
+      <w:lvlJc w:val="left"/>
+      <w:pPr>
+        <w:ind w:left="504" w:hanging="202"/>
+      </w:pPr>
+      <w:rPr>
+        <w:rFonts w:hint="default"/>
+        <w:lang w:val="en-US" w:eastAsia="en-US" w:bidi="ar-SA"/>
+      </w:rPr>
+    </w:lvl>
+    <w:lvl w:ilvl="4" w:tplc="8C0E5AA4">
+      <w:numFmt w:val="bullet"/>
+      <w:lvlText w:val="•"/>
+      <w:lvlJc w:val="left"/>
+      <w:pPr>
+        <w:ind w:left="426" w:hanging="202"/>
+      </w:pPr>
+      <w:rPr>
+        <w:rFonts w:hint="default"/>
+        <w:lang w:val="en-US" w:eastAsia="en-US" w:bidi="ar-SA"/>
+      </w:rPr>
+    </w:lvl>
+    <w:lvl w:ilvl="5" w:tplc="DD1862AE">
+      <w:numFmt w:val="bullet"/>
+      <w:lvlText w:val="•"/>
+      <w:lvlJc w:val="left"/>
+      <w:pPr>
+        <w:ind w:left="348" w:hanging="202"/>
+      </w:pPr>
+      <w:rPr>
+        <w:rFonts w:hint="default"/>
+        <w:lang w:val="en-US" w:eastAsia="en-US" w:bidi="ar-SA"/>
+      </w:rPr>
+    </w:lvl>
+    <w:lvl w:ilvl="6" w:tplc="4C468A34">
+      <w:numFmt w:val="bullet"/>
+      <w:lvlText w:val="•"/>
+      <w:lvlJc w:val="left"/>
+      <w:pPr>
+        <w:ind w:left="271" w:hanging="202"/>
+      </w:pPr>
+      <w:rPr>
+        <w:rFonts w:hint="default"/>
+        <w:lang w:val="en-US" w:eastAsia="en-US" w:bidi="ar-SA"/>
+      </w:rPr>
+    </w:lvl>
+    <w:lvl w:ilvl="7" w:tplc="733AE47C">
+      <w:numFmt w:val="bullet"/>
+      <w:lvlText w:val="•"/>
+      <w:lvlJc w:val="left"/>
+      <w:pPr>
+        <w:ind w:left="193" w:hanging="202"/>
+      </w:pPr>
+      <w:rPr>
+        <w:rFonts w:hint="default"/>
+        <w:lang w:val="en-US" w:eastAsia="en-US" w:bidi="ar-SA"/>
+      </w:rPr>
+    </w:lvl>
+    <w:lvl w:ilvl="8" w:tplc="1F321CB2">
+      <w:numFmt w:val="bullet"/>
+      <w:lvlText w:val="•"/>
+      <w:lvlJc w:val="left"/>
+      <w:pPr>
+        <w:ind w:left="115" w:hanging="202"/>
+      </w:pPr>
+      <w:rPr>
+        <w:rFonts w:hint="default"/>
+        <w:lang w:val="en-US" w:eastAsia="en-US" w:bidi="ar-SA"/>
+      </w:rPr>
+    </w:lvl>
+  </w:abstractNum>
+  <w:abstractNum w:abstractNumId="16" w15:restartNumberingAfterBreak="0">
+    <w:nsid w:val="414F25B0"/>
+    <w:multiLevelType w:val="hybridMultilevel"/>
+    <w:tmpl w:val="E5A6B116"/>
+    <w:lvl w:ilvl="0" w:tplc="B03C6000">
+      <w:start w:val="1"/>
+      <w:numFmt w:val="upperLetter"/>
+      <w:lvlText w:val="%1."/>
+      <w:lvlJc w:val="left"/>
+      <w:pPr>
+        <w:ind w:left="720" w:hanging="360"/>
+      </w:pPr>
+      <w:rPr>
+        <w:i/>
+        <w:iCs/>
+      </w:rPr>
+    </w:lvl>
+    <w:lvl w:ilvl="1" w:tplc="40090019" w:tentative="1">
+      <w:start w:val="1"/>
+      <w:numFmt w:val="lowerLetter"/>
+      <w:lvlText w:val="%2."/>
+      <w:lvlJc w:val="left"/>
+      <w:pPr>
+        <w:ind w:left="1440" w:hanging="360"/>
+      </w:pPr>
+    </w:lvl>
+    <w:lvl w:ilvl="2" w:tplc="4009001B" w:tentative="1">
+      <w:start w:val="1"/>
+      <w:numFmt w:val="lowerRoman"/>
+      <w:lvlText w:val="%3."/>
+      <w:lvlJc w:val="right"/>
+      <w:pPr>
+        <w:ind w:left="2160" w:hanging="180"/>
+      </w:pPr>
+    </w:lvl>
+    <w:lvl w:ilvl="3" w:tplc="4009000F" w:tentative="1">
+      <w:start w:val="1"/>
+      <w:numFmt w:val="decimal"/>
+      <w:lvlText w:val="%4."/>
+      <w:lvlJc w:val="left"/>
+      <w:pPr>
+        <w:ind w:left="2880" w:hanging="360"/>
+      </w:pPr>
+    </w:lvl>
+    <w:lvl w:ilvl="4" w:tplc="40090019" w:tentative="1">
+      <w:start w:val="1"/>
+      <w:numFmt w:val="lowerLetter"/>
+      <w:lvlText w:val="%5."/>
+      <w:lvlJc w:val="left"/>
+      <w:pPr>
+        <w:ind w:left="3600" w:hanging="360"/>
+      </w:pPr>
+    </w:lvl>
+    <w:lvl w:ilvl="5" w:tplc="4009001B" w:tentative="1">
+      <w:start w:val="1"/>
+      <w:numFmt w:val="lowerRoman"/>
+      <w:lvlText w:val="%6."/>
+      <w:lvlJc w:val="right"/>
+      <w:pPr>
+        <w:ind w:left="4320" w:hanging="180"/>
+      </w:pPr>
+    </w:lvl>
+    <w:lvl w:ilvl="6" w:tplc="4009000F" w:tentative="1">
+      <w:start w:val="1"/>
+      <w:numFmt w:val="decimal"/>
+      <w:lvlText w:val="%7."/>
+      <w:lvlJc w:val="left"/>
+      <w:pPr>
+        <w:ind w:left="5040" w:hanging="360"/>
+      </w:pPr>
+    </w:lvl>
+    <w:lvl w:ilvl="7" w:tplc="40090019" w:tentative="1">
+      <w:start w:val="1"/>
+      <w:numFmt w:val="lowerLetter"/>
+      <w:lvlText w:val="%8."/>
+      <w:lvlJc w:val="left"/>
+      <w:pPr>
+        <w:ind w:left="5760" w:hanging="360"/>
+      </w:pPr>
+    </w:lvl>
+    <w:lvl w:ilvl="8" w:tplc="4009001B" w:tentative="1">
+      <w:start w:val="1"/>
+      <w:numFmt w:val="lowerRoman"/>
+      <w:lvlText w:val="%9."/>
+      <w:lvlJc w:val="right"/>
+      <w:pPr>
+        <w:ind w:left="6480" w:hanging="180"/>
+      </w:pPr>
+    </w:lvl>
+  </w:abstractNum>
+  <w:abstractNum w:abstractNumId="17" w15:restartNumberingAfterBreak="0">
+    <w:nsid w:val="46D21D73"/>
+    <w:multiLevelType w:val="hybridMultilevel"/>
+    <w:tmpl w:val="810E8BD0"/>
+    <w:lvl w:ilvl="0" w:tplc="FFFFFFFF">
+      <w:start w:val="1"/>
+      <w:numFmt w:val="upperLetter"/>
+      <w:lvlText w:val="%1."/>
+      <w:lvlJc w:val="left"/>
+      <w:pPr>
+        <w:ind w:left="470" w:hanging="272"/>
+        <w:jc w:val="right"/>
+      </w:pPr>
+      <w:rPr>
+        <w:rFonts w:ascii="Times New Roman" w:eastAsia="Times New Roman" w:hAnsi="Times New Roman" w:cs="Times New Roman" w:hint="default"/>
+        <w:b w:val="0"/>
+        <w:bCs w:val="0"/>
+        <w:i/>
+        <w:iCs/>
+        <w:spacing w:val="0"/>
+        <w:w w:val="99"/>
+        <w:sz w:val="20"/>
+        <w:szCs w:val="20"/>
+        <w:lang w:val="en-US" w:eastAsia="en-US" w:bidi="ar-SA"/>
+      </w:rPr>
+    </w:lvl>
+    <w:lvl w:ilvl="1" w:tplc="FFFFFFFF">
       <w:start w:val="1"/>
       <w:numFmt w:val="decimal"/>
       <w:lvlText w:val="%2)"/>
@@ -15090,27 +14958,20 @@
         <w:lang w:val="en-US" w:eastAsia="en-US" w:bidi="ar-SA"/>
       </w:rPr>
     </w:lvl>
-    <w:lvl w:ilvl="2" w:tplc="708AEF72">
-      <w:numFmt w:val="bullet"/>
-      <w:lvlText w:val="•"/>
-      <w:lvlJc w:val="left"/>
-      <w:pPr>
-        <w:ind w:left="1034" w:hanging="202"/>
+    <w:lvl w:ilvl="2" w:tplc="3A46E550">
+      <w:start w:val="1"/>
+      <w:numFmt w:val="lowerLetter"/>
+      <w:lvlText w:val="%3)"/>
+      <w:lvlJc w:val="left"/>
+      <w:pPr>
+        <w:ind w:left="1192" w:hanging="360"/>
       </w:pPr>
       <w:rPr>
-        <w:rFonts w:ascii="Arial" w:eastAsia="Arial" w:hAnsi="Arial" w:cs="Arial" w:hint="default"/>
-        <w:b w:val="0"/>
-        <w:bCs w:val="0"/>
         <w:i/>
         <w:iCs/>
-        <w:spacing w:val="0"/>
-        <w:w w:val="166"/>
-        <w:sz w:val="14"/>
-        <w:szCs w:val="14"/>
-        <w:lang w:val="en-US" w:eastAsia="en-US" w:bidi="ar-SA"/>
       </w:rPr>
     </w:lvl>
-    <w:lvl w:ilvl="3" w:tplc="93CA4A62">
+    <w:lvl w:ilvl="3" w:tplc="FFFFFFFF">
       <w:numFmt w:val="bullet"/>
       <w:lvlText w:val="–"/>
       <w:lvlJc w:val="left"/>
@@ -15130,7 +14991,7 @@
         <w:lang w:val="en-US" w:eastAsia="en-US" w:bidi="ar-SA"/>
       </w:rPr>
     </w:lvl>
-    <w:lvl w:ilvl="4" w:tplc="09B230B6">
+    <w:lvl w:ilvl="4" w:tplc="FFFFFFFF">
       <w:numFmt w:val="bullet"/>
       <w:lvlText w:val="•"/>
       <w:lvlJc w:val="left"/>
@@ -15142,7 +15003,7 @@
         <w:lang w:val="en-US" w:eastAsia="en-US" w:bidi="ar-SA"/>
       </w:rPr>
     </w:lvl>
-    <w:lvl w:ilvl="5" w:tplc="16BC6B46">
+    <w:lvl w:ilvl="5" w:tplc="FFFFFFFF">
       <w:numFmt w:val="bullet"/>
       <w:lvlText w:val="•"/>
       <w:lvlJc w:val="left"/>
@@ -15154,7 +15015,7 @@
         <w:lang w:val="en-US" w:eastAsia="en-US" w:bidi="ar-SA"/>
       </w:rPr>
     </w:lvl>
-    <w:lvl w:ilvl="6" w:tplc="D5C8DD94">
+    <w:lvl w:ilvl="6" w:tplc="FFFFFFFF">
       <w:numFmt w:val="bullet"/>
       <w:lvlText w:val="•"/>
       <w:lvlJc w:val="left"/>
@@ -15166,7 +15027,7 @@
         <w:lang w:val="en-US" w:eastAsia="en-US" w:bidi="ar-SA"/>
       </w:rPr>
     </w:lvl>
-    <w:lvl w:ilvl="7" w:tplc="291C6E2C">
+    <w:lvl w:ilvl="7" w:tplc="FFFFFFFF">
       <w:numFmt w:val="bullet"/>
       <w:lvlText w:val="•"/>
       <w:lvlJc w:val="left"/>
@@ -15178,7 +15039,7 @@
         <w:lang w:val="en-US" w:eastAsia="en-US" w:bidi="ar-SA"/>
       </w:rPr>
     </w:lvl>
-    <w:lvl w:ilvl="8" w:tplc="19F8AFD8">
+    <w:lvl w:ilvl="8" w:tplc="FFFFFFFF">
       <w:numFmt w:val="bullet"/>
       <w:lvlText w:val="•"/>
       <w:lvlJc w:val="left"/>
@@ -15191,314 +15052,7 @@
       </w:rPr>
     </w:lvl>
   </w:abstractNum>
-  <w:abstractNum w:abstractNumId="13" w15:restartNumberingAfterBreak="0">
-    <w:nsid w:val="35BF1372"/>
-    <w:multiLevelType w:val="hybridMultilevel"/>
-    <w:tmpl w:val="3B1E53AC"/>
-    <w:lvl w:ilvl="0" w:tplc="4009000F">
-      <w:start w:val="1"/>
-      <w:numFmt w:val="decimal"/>
-      <w:lvlText w:val="%1."/>
-      <w:lvlJc w:val="left"/>
-      <w:pPr>
-        <w:ind w:left="720" w:hanging="360"/>
-      </w:pPr>
-    </w:lvl>
-    <w:lvl w:ilvl="1" w:tplc="40090019" w:tentative="1">
-      <w:start w:val="1"/>
-      <w:numFmt w:val="lowerLetter"/>
-      <w:lvlText w:val="%2."/>
-      <w:lvlJc w:val="left"/>
-      <w:pPr>
-        <w:ind w:left="1440" w:hanging="360"/>
-      </w:pPr>
-    </w:lvl>
-    <w:lvl w:ilvl="2" w:tplc="4009001B" w:tentative="1">
-      <w:start w:val="1"/>
-      <w:numFmt w:val="lowerRoman"/>
-      <w:lvlText w:val="%3."/>
-      <w:lvlJc w:val="right"/>
-      <w:pPr>
-        <w:ind w:left="2160" w:hanging="180"/>
-      </w:pPr>
-    </w:lvl>
-    <w:lvl w:ilvl="3" w:tplc="4009000F" w:tentative="1">
-      <w:start w:val="1"/>
-      <w:numFmt w:val="decimal"/>
-      <w:lvlText w:val="%4."/>
-      <w:lvlJc w:val="left"/>
-      <w:pPr>
-        <w:ind w:left="2880" w:hanging="360"/>
-      </w:pPr>
-    </w:lvl>
-    <w:lvl w:ilvl="4" w:tplc="40090019" w:tentative="1">
-      <w:start w:val="1"/>
-      <w:numFmt w:val="lowerLetter"/>
-      <w:lvlText w:val="%5."/>
-      <w:lvlJc w:val="left"/>
-      <w:pPr>
-        <w:ind w:left="3600" w:hanging="360"/>
-      </w:pPr>
-    </w:lvl>
-    <w:lvl w:ilvl="5" w:tplc="4009001B" w:tentative="1">
-      <w:start w:val="1"/>
-      <w:numFmt w:val="lowerRoman"/>
-      <w:lvlText w:val="%6."/>
-      <w:lvlJc w:val="right"/>
-      <w:pPr>
-        <w:ind w:left="4320" w:hanging="180"/>
-      </w:pPr>
-    </w:lvl>
-    <w:lvl w:ilvl="6" w:tplc="4009000F" w:tentative="1">
-      <w:start w:val="1"/>
-      <w:numFmt w:val="decimal"/>
-      <w:lvlText w:val="%7."/>
-      <w:lvlJc w:val="left"/>
-      <w:pPr>
-        <w:ind w:left="5040" w:hanging="360"/>
-      </w:pPr>
-    </w:lvl>
-    <w:lvl w:ilvl="7" w:tplc="40090019" w:tentative="1">
-      <w:start w:val="1"/>
-      <w:numFmt w:val="lowerLetter"/>
-      <w:lvlText w:val="%8."/>
-      <w:lvlJc w:val="left"/>
-      <w:pPr>
-        <w:ind w:left="5760" w:hanging="360"/>
-      </w:pPr>
-    </w:lvl>
-    <w:lvl w:ilvl="8" w:tplc="4009001B" w:tentative="1">
-      <w:start w:val="1"/>
-      <w:numFmt w:val="lowerRoman"/>
-      <w:lvlText w:val="%9."/>
-      <w:lvlJc w:val="right"/>
-      <w:pPr>
-        <w:ind w:left="6480" w:hanging="180"/>
-      </w:pPr>
-    </w:lvl>
-  </w:abstractNum>
-  <w:abstractNum w:abstractNumId="14" w15:restartNumberingAfterBreak="0">
-    <w:nsid w:val="395E7C60"/>
-    <w:multiLevelType w:val="hybridMultilevel"/>
-    <w:tmpl w:val="7A5E0DF8"/>
-    <w:lvl w:ilvl="0" w:tplc="333CE4A0">
-      <w:start w:val="1"/>
-      <w:numFmt w:val="upperLetter"/>
-      <w:lvlText w:val="%1."/>
-      <w:lvlJc w:val="left"/>
-      <w:pPr>
-        <w:ind w:left="470" w:hanging="272"/>
-        <w:jc w:val="right"/>
-      </w:pPr>
-      <w:rPr>
-        <w:rFonts w:ascii="Times New Roman" w:eastAsia="Times New Roman" w:hAnsi="Times New Roman" w:cs="Times New Roman" w:hint="default"/>
-        <w:b w:val="0"/>
-        <w:bCs w:val="0"/>
-        <w:i/>
-        <w:iCs/>
-        <w:spacing w:val="0"/>
-        <w:w w:val="99"/>
-        <w:sz w:val="20"/>
-        <w:szCs w:val="20"/>
-        <w:lang w:val="en-US" w:eastAsia="en-US" w:bidi="ar-SA"/>
-      </w:rPr>
-    </w:lvl>
-    <w:lvl w:ilvl="1" w:tplc="8ED4DA4A">
-      <w:numFmt w:val="bullet"/>
-      <w:lvlText w:val="•"/>
-      <w:lvlJc w:val="left"/>
-      <w:pPr>
-        <w:ind w:left="659" w:hanging="202"/>
-      </w:pPr>
-      <w:rPr>
-        <w:rFonts w:ascii="Arial" w:eastAsia="Arial" w:hAnsi="Arial" w:cs="Arial" w:hint="default"/>
-        <w:b w:val="0"/>
-        <w:bCs w:val="0"/>
-        <w:i/>
-        <w:iCs/>
-        <w:spacing w:val="0"/>
-        <w:w w:val="166"/>
-        <w:sz w:val="14"/>
-        <w:szCs w:val="14"/>
-        <w:lang w:val="en-US" w:eastAsia="en-US" w:bidi="ar-SA"/>
-      </w:rPr>
-    </w:lvl>
-    <w:lvl w:ilvl="2" w:tplc="0220E15C">
-      <w:numFmt w:val="bullet"/>
-      <w:lvlText w:val="•"/>
-      <w:lvlJc w:val="left"/>
-      <w:pPr>
-        <w:ind w:left="582" w:hanging="202"/>
-      </w:pPr>
-      <w:rPr>
-        <w:rFonts w:hint="default"/>
-        <w:lang w:val="en-US" w:eastAsia="en-US" w:bidi="ar-SA"/>
-      </w:rPr>
-    </w:lvl>
-    <w:lvl w:ilvl="3" w:tplc="22E61644">
-      <w:numFmt w:val="bullet"/>
-      <w:lvlText w:val="•"/>
-      <w:lvlJc w:val="left"/>
-      <w:pPr>
-        <w:ind w:left="504" w:hanging="202"/>
-      </w:pPr>
-      <w:rPr>
-        <w:rFonts w:hint="default"/>
-        <w:lang w:val="en-US" w:eastAsia="en-US" w:bidi="ar-SA"/>
-      </w:rPr>
-    </w:lvl>
-    <w:lvl w:ilvl="4" w:tplc="8C0E5AA4">
-      <w:numFmt w:val="bullet"/>
-      <w:lvlText w:val="•"/>
-      <w:lvlJc w:val="left"/>
-      <w:pPr>
-        <w:ind w:left="426" w:hanging="202"/>
-      </w:pPr>
-      <w:rPr>
-        <w:rFonts w:hint="default"/>
-        <w:lang w:val="en-US" w:eastAsia="en-US" w:bidi="ar-SA"/>
-      </w:rPr>
-    </w:lvl>
-    <w:lvl w:ilvl="5" w:tplc="DD1862AE">
-      <w:numFmt w:val="bullet"/>
-      <w:lvlText w:val="•"/>
-      <w:lvlJc w:val="left"/>
-      <w:pPr>
-        <w:ind w:left="348" w:hanging="202"/>
-      </w:pPr>
-      <w:rPr>
-        <w:rFonts w:hint="default"/>
-        <w:lang w:val="en-US" w:eastAsia="en-US" w:bidi="ar-SA"/>
-      </w:rPr>
-    </w:lvl>
-    <w:lvl w:ilvl="6" w:tplc="4C468A34">
-      <w:numFmt w:val="bullet"/>
-      <w:lvlText w:val="•"/>
-      <w:lvlJc w:val="left"/>
-      <w:pPr>
-        <w:ind w:left="271" w:hanging="202"/>
-      </w:pPr>
-      <w:rPr>
-        <w:rFonts w:hint="default"/>
-        <w:lang w:val="en-US" w:eastAsia="en-US" w:bidi="ar-SA"/>
-      </w:rPr>
-    </w:lvl>
-    <w:lvl w:ilvl="7" w:tplc="733AE47C">
-      <w:numFmt w:val="bullet"/>
-      <w:lvlText w:val="•"/>
-      <w:lvlJc w:val="left"/>
-      <w:pPr>
-        <w:ind w:left="193" w:hanging="202"/>
-      </w:pPr>
-      <w:rPr>
-        <w:rFonts w:hint="default"/>
-        <w:lang w:val="en-US" w:eastAsia="en-US" w:bidi="ar-SA"/>
-      </w:rPr>
-    </w:lvl>
-    <w:lvl w:ilvl="8" w:tplc="1F321CB2">
-      <w:numFmt w:val="bullet"/>
-      <w:lvlText w:val="•"/>
-      <w:lvlJc w:val="left"/>
-      <w:pPr>
-        <w:ind w:left="115" w:hanging="202"/>
-      </w:pPr>
-      <w:rPr>
-        <w:rFonts w:hint="default"/>
-        <w:lang w:val="en-US" w:eastAsia="en-US" w:bidi="ar-SA"/>
-      </w:rPr>
-    </w:lvl>
-  </w:abstractNum>
-  <w:abstractNum w:abstractNumId="15" w15:restartNumberingAfterBreak="0">
-    <w:nsid w:val="414F25B0"/>
-    <w:multiLevelType w:val="hybridMultilevel"/>
-    <w:tmpl w:val="E5A6B116"/>
-    <w:lvl w:ilvl="0" w:tplc="B03C6000">
-      <w:start w:val="1"/>
-      <w:numFmt w:val="upperLetter"/>
-      <w:lvlText w:val="%1."/>
-      <w:lvlJc w:val="left"/>
-      <w:pPr>
-        <w:ind w:left="720" w:hanging="360"/>
-      </w:pPr>
-      <w:rPr>
-        <w:i/>
-        <w:iCs/>
-      </w:rPr>
-    </w:lvl>
-    <w:lvl w:ilvl="1" w:tplc="40090019" w:tentative="1">
-      <w:start w:val="1"/>
-      <w:numFmt w:val="lowerLetter"/>
-      <w:lvlText w:val="%2."/>
-      <w:lvlJc w:val="left"/>
-      <w:pPr>
-        <w:ind w:left="1440" w:hanging="360"/>
-      </w:pPr>
-    </w:lvl>
-    <w:lvl w:ilvl="2" w:tplc="4009001B" w:tentative="1">
-      <w:start w:val="1"/>
-      <w:numFmt w:val="lowerRoman"/>
-      <w:lvlText w:val="%3."/>
-      <w:lvlJc w:val="right"/>
-      <w:pPr>
-        <w:ind w:left="2160" w:hanging="180"/>
-      </w:pPr>
-    </w:lvl>
-    <w:lvl w:ilvl="3" w:tplc="4009000F" w:tentative="1">
-      <w:start w:val="1"/>
-      <w:numFmt w:val="decimal"/>
-      <w:lvlText w:val="%4."/>
-      <w:lvlJc w:val="left"/>
-      <w:pPr>
-        <w:ind w:left="2880" w:hanging="360"/>
-      </w:pPr>
-    </w:lvl>
-    <w:lvl w:ilvl="4" w:tplc="40090019" w:tentative="1">
-      <w:start w:val="1"/>
-      <w:numFmt w:val="lowerLetter"/>
-      <w:lvlText w:val="%5."/>
-      <w:lvlJc w:val="left"/>
-      <w:pPr>
-        <w:ind w:left="3600" w:hanging="360"/>
-      </w:pPr>
-    </w:lvl>
-    <w:lvl w:ilvl="5" w:tplc="4009001B" w:tentative="1">
-      <w:start w:val="1"/>
-      <w:numFmt w:val="lowerRoman"/>
-      <w:lvlText w:val="%6."/>
-      <w:lvlJc w:val="right"/>
-      <w:pPr>
-        <w:ind w:left="4320" w:hanging="180"/>
-      </w:pPr>
-    </w:lvl>
-    <w:lvl w:ilvl="6" w:tplc="4009000F" w:tentative="1">
-      <w:start w:val="1"/>
-      <w:numFmt w:val="decimal"/>
-      <w:lvlText w:val="%7."/>
-      <w:lvlJc w:val="left"/>
-      <w:pPr>
-        <w:ind w:left="5040" w:hanging="360"/>
-      </w:pPr>
-    </w:lvl>
-    <w:lvl w:ilvl="7" w:tplc="40090019" w:tentative="1">
-      <w:start w:val="1"/>
-      <w:numFmt w:val="lowerLetter"/>
-      <w:lvlText w:val="%8."/>
-      <w:lvlJc w:val="left"/>
-      <w:pPr>
-        <w:ind w:left="5760" w:hanging="360"/>
-      </w:pPr>
-    </w:lvl>
-    <w:lvl w:ilvl="8" w:tplc="4009001B" w:tentative="1">
-      <w:start w:val="1"/>
-      <w:numFmt w:val="lowerRoman"/>
-      <w:lvlText w:val="%9."/>
-      <w:lvlJc w:val="right"/>
-      <w:pPr>
-        <w:ind w:left="6480" w:hanging="180"/>
-      </w:pPr>
-    </w:lvl>
-  </w:abstractNum>
-  <w:abstractNum w:abstractNumId="16" w15:restartNumberingAfterBreak="0">
+  <w:abstractNum w:abstractNumId="18" w15:restartNumberingAfterBreak="0">
     <w:nsid w:val="483F4AC5"/>
     <w:multiLevelType w:val="hybridMultilevel"/>
     <w:tmpl w:val="79F8C210"/>
@@ -15596,7 +15150,93 @@
       </w:pPr>
     </w:lvl>
   </w:abstractNum>
-  <w:abstractNum w:abstractNumId="17" w15:restartNumberingAfterBreak="0">
+  <w:abstractNum w:abstractNumId="19" w15:restartNumberingAfterBreak="0">
+    <w:nsid w:val="4AED358A"/>
+    <w:multiLevelType w:val="multilevel"/>
+    <w:tmpl w:val="03E833F4"/>
+    <w:lvl w:ilvl="0">
+      <w:start w:val="1"/>
+      <w:numFmt w:val="decimal"/>
+      <w:lvlText w:val="%1)"/>
+      <w:lvlJc w:val="left"/>
+      <w:pPr>
+        <w:ind w:left="360" w:hanging="360"/>
+      </w:pPr>
+    </w:lvl>
+    <w:lvl w:ilvl="1">
+      <w:start w:val="1"/>
+      <w:numFmt w:val="decimal"/>
+      <w:lvlText w:val="%2)"/>
+      <w:lvlJc w:val="left"/>
+      <w:pPr>
+        <w:ind w:left="1008" w:hanging="360"/>
+      </w:pPr>
+    </w:lvl>
+    <w:lvl w:ilvl="2">
+      <w:start w:val="1"/>
+      <w:numFmt w:val="lowerRoman"/>
+      <w:lvlText w:val="%3)"/>
+      <w:lvlJc w:val="left"/>
+      <w:pPr>
+        <w:ind w:left="1080" w:hanging="360"/>
+      </w:pPr>
+    </w:lvl>
+    <w:lvl w:ilvl="3">
+      <w:start w:val="1"/>
+      <w:numFmt w:val="decimal"/>
+      <w:lvlText w:val="(%4)"/>
+      <w:lvlJc w:val="left"/>
+      <w:pPr>
+        <w:ind w:left="1440" w:hanging="360"/>
+      </w:pPr>
+    </w:lvl>
+    <w:lvl w:ilvl="4">
+      <w:start w:val="1"/>
+      <w:numFmt w:val="lowerLetter"/>
+      <w:lvlText w:val="(%5)"/>
+      <w:lvlJc w:val="left"/>
+      <w:pPr>
+        <w:ind w:left="1800" w:hanging="360"/>
+      </w:pPr>
+    </w:lvl>
+    <w:lvl w:ilvl="5">
+      <w:start w:val="1"/>
+      <w:numFmt w:val="lowerRoman"/>
+      <w:lvlText w:val="(%6)"/>
+      <w:lvlJc w:val="left"/>
+      <w:pPr>
+        <w:ind w:left="2160" w:hanging="360"/>
+      </w:pPr>
+    </w:lvl>
+    <w:lvl w:ilvl="6">
+      <w:start w:val="1"/>
+      <w:numFmt w:val="decimal"/>
+      <w:lvlText w:val="%7."/>
+      <w:lvlJc w:val="left"/>
+      <w:pPr>
+        <w:ind w:left="2520" w:hanging="360"/>
+      </w:pPr>
+    </w:lvl>
+    <w:lvl w:ilvl="7">
+      <w:start w:val="1"/>
+      <w:numFmt w:val="lowerLetter"/>
+      <w:lvlText w:val="%8."/>
+      <w:lvlJc w:val="left"/>
+      <w:pPr>
+        <w:ind w:left="2880" w:hanging="360"/>
+      </w:pPr>
+    </w:lvl>
+    <w:lvl w:ilvl="8">
+      <w:start w:val="1"/>
+      <w:numFmt w:val="lowerRoman"/>
+      <w:lvlText w:val="%9."/>
+      <w:lvlJc w:val="left"/>
+      <w:pPr>
+        <w:ind w:left="3240" w:hanging="360"/>
+      </w:pPr>
+    </w:lvl>
+  </w:abstractNum>
+  <w:abstractNum w:abstractNumId="20" w15:restartNumberingAfterBreak="0">
     <w:nsid w:val="52CA544A"/>
     <w:multiLevelType w:val="singleLevel"/>
     <w:tmpl w:val="AED6D67E"/>
@@ -15623,7 +15263,93 @@
       </w:rPr>
     </w:lvl>
   </w:abstractNum>
-  <w:abstractNum w:abstractNumId="18" w15:restartNumberingAfterBreak="0">
+  <w:abstractNum w:abstractNumId="21" w15:restartNumberingAfterBreak="0">
+    <w:nsid w:val="548778F6"/>
+    <w:multiLevelType w:val="hybridMultilevel"/>
+    <w:tmpl w:val="7B24B4EA"/>
+    <w:lvl w:ilvl="0" w:tplc="40090011">
+      <w:start w:val="1"/>
+      <w:numFmt w:val="decimal"/>
+      <w:lvlText w:val="%1)"/>
+      <w:lvlJc w:val="left"/>
+      <w:pPr>
+        <w:ind w:left="1008" w:hanging="360"/>
+      </w:pPr>
+    </w:lvl>
+    <w:lvl w:ilvl="1" w:tplc="40090019">
+      <w:start w:val="1"/>
+      <w:numFmt w:val="lowerLetter"/>
+      <w:lvlText w:val="%2."/>
+      <w:lvlJc w:val="left"/>
+      <w:pPr>
+        <w:ind w:left="1728" w:hanging="360"/>
+      </w:pPr>
+    </w:lvl>
+    <w:lvl w:ilvl="2" w:tplc="4009001B" w:tentative="1">
+      <w:start w:val="1"/>
+      <w:numFmt w:val="lowerRoman"/>
+      <w:lvlText w:val="%3."/>
+      <w:lvlJc w:val="right"/>
+      <w:pPr>
+        <w:ind w:left="2448" w:hanging="180"/>
+      </w:pPr>
+    </w:lvl>
+    <w:lvl w:ilvl="3" w:tplc="4009000F" w:tentative="1">
+      <w:start w:val="1"/>
+      <w:numFmt w:val="decimal"/>
+      <w:lvlText w:val="%4."/>
+      <w:lvlJc w:val="left"/>
+      <w:pPr>
+        <w:ind w:left="3168" w:hanging="360"/>
+      </w:pPr>
+    </w:lvl>
+    <w:lvl w:ilvl="4" w:tplc="40090019" w:tentative="1">
+      <w:start w:val="1"/>
+      <w:numFmt w:val="lowerLetter"/>
+      <w:lvlText w:val="%5."/>
+      <w:lvlJc w:val="left"/>
+      <w:pPr>
+        <w:ind w:left="3888" w:hanging="360"/>
+      </w:pPr>
+    </w:lvl>
+    <w:lvl w:ilvl="5" w:tplc="4009001B" w:tentative="1">
+      <w:start w:val="1"/>
+      <w:numFmt w:val="lowerRoman"/>
+      <w:lvlText w:val="%6."/>
+      <w:lvlJc w:val="right"/>
+      <w:pPr>
+        <w:ind w:left="4608" w:hanging="180"/>
+      </w:pPr>
+    </w:lvl>
+    <w:lvl w:ilvl="6" w:tplc="4009000F" w:tentative="1">
+      <w:start w:val="1"/>
+      <w:numFmt w:val="decimal"/>
+      <w:lvlText w:val="%7."/>
+      <w:lvlJc w:val="left"/>
+      <w:pPr>
+        <w:ind w:left="5328" w:hanging="360"/>
+      </w:pPr>
+    </w:lvl>
+    <w:lvl w:ilvl="7" w:tplc="40090019" w:tentative="1">
+      <w:start w:val="1"/>
+      <w:numFmt w:val="lowerLetter"/>
+      <w:lvlText w:val="%8."/>
+      <w:lvlJc w:val="left"/>
+      <w:pPr>
+        <w:ind w:left="6048" w:hanging="360"/>
+      </w:pPr>
+    </w:lvl>
+    <w:lvl w:ilvl="8" w:tplc="4009001B" w:tentative="1">
+      <w:start w:val="1"/>
+      <w:numFmt w:val="lowerRoman"/>
+      <w:lvlText w:val="%9."/>
+      <w:lvlJc w:val="right"/>
+      <w:pPr>
+        <w:ind w:left="6768" w:hanging="180"/>
+      </w:pPr>
+    </w:lvl>
+  </w:abstractNum>
+  <w:abstractNum w:abstractNumId="22" w15:restartNumberingAfterBreak="0">
     <w:nsid w:val="584C193E"/>
     <w:multiLevelType w:val="hybridMultilevel"/>
     <w:tmpl w:val="1682F284"/>
@@ -15709,7 +15435,183 @@
       </w:pPr>
     </w:lvl>
   </w:abstractNum>
-  <w:abstractNum w:abstractNumId="19" w15:restartNumberingAfterBreak="0">
+  <w:abstractNum w:abstractNumId="23" w15:restartNumberingAfterBreak="0">
+    <w:nsid w:val="63CD6CF0"/>
+    <w:multiLevelType w:val="multilevel"/>
+    <w:tmpl w:val="09E4EEB6"/>
+    <w:lvl w:ilvl="0">
+      <w:start w:val="1"/>
+      <w:numFmt w:val="decimal"/>
+      <w:lvlText w:val="%1)"/>
+      <w:lvlJc w:val="left"/>
+      <w:pPr>
+        <w:ind w:left="360" w:hanging="360"/>
+      </w:pPr>
+    </w:lvl>
+    <w:lvl w:ilvl="1">
+      <w:start w:val="1"/>
+      <w:numFmt w:val="decimal"/>
+      <w:lvlText w:val="%2)"/>
+      <w:lvlJc w:val="left"/>
+      <w:pPr>
+        <w:ind w:left="1008" w:hanging="360"/>
+      </w:pPr>
+    </w:lvl>
+    <w:lvl w:ilvl="2">
+      <w:start w:val="1"/>
+      <w:numFmt w:val="lowerLetter"/>
+      <w:lvlText w:val="%3)"/>
+      <w:lvlJc w:val="left"/>
+      <w:pPr>
+        <w:ind w:left="1080" w:hanging="360"/>
+      </w:pPr>
+      <w:rPr>
+        <w:i/>
+        <w:iCs/>
+      </w:rPr>
+    </w:lvl>
+    <w:lvl w:ilvl="3">
+      <w:start w:val="1"/>
+      <w:numFmt w:val="decimal"/>
+      <w:lvlText w:val="(%4)"/>
+      <w:lvlJc w:val="left"/>
+      <w:pPr>
+        <w:ind w:left="1440" w:hanging="360"/>
+      </w:pPr>
+    </w:lvl>
+    <w:lvl w:ilvl="4">
+      <w:start w:val="1"/>
+      <w:numFmt w:val="lowerLetter"/>
+      <w:lvlText w:val="(%5)"/>
+      <w:lvlJc w:val="left"/>
+      <w:pPr>
+        <w:ind w:left="1800" w:hanging="360"/>
+      </w:pPr>
+    </w:lvl>
+    <w:lvl w:ilvl="5">
+      <w:start w:val="1"/>
+      <w:numFmt w:val="lowerRoman"/>
+      <w:lvlText w:val="(%6)"/>
+      <w:lvlJc w:val="left"/>
+      <w:pPr>
+        <w:ind w:left="2160" w:hanging="360"/>
+      </w:pPr>
+    </w:lvl>
+    <w:lvl w:ilvl="6">
+      <w:start w:val="1"/>
+      <w:numFmt w:val="decimal"/>
+      <w:lvlText w:val="%7."/>
+      <w:lvlJc w:val="left"/>
+      <w:pPr>
+        <w:ind w:left="2520" w:hanging="360"/>
+      </w:pPr>
+    </w:lvl>
+    <w:lvl w:ilvl="7">
+      <w:start w:val="1"/>
+      <w:numFmt w:val="lowerLetter"/>
+      <w:lvlText w:val="%8."/>
+      <w:lvlJc w:val="left"/>
+      <w:pPr>
+        <w:ind w:left="2880" w:hanging="360"/>
+      </w:pPr>
+    </w:lvl>
+    <w:lvl w:ilvl="8">
+      <w:start w:val="1"/>
+      <w:numFmt w:val="lowerRoman"/>
+      <w:lvlText w:val="%9."/>
+      <w:lvlJc w:val="left"/>
+      <w:pPr>
+        <w:ind w:left="3240" w:hanging="360"/>
+      </w:pPr>
+    </w:lvl>
+  </w:abstractNum>
+  <w:abstractNum w:abstractNumId="24" w15:restartNumberingAfterBreak="0">
+    <w:nsid w:val="66563724"/>
+    <w:multiLevelType w:val="multilevel"/>
+    <w:tmpl w:val="04429BC6"/>
+    <w:lvl w:ilvl="0">
+      <w:start w:val="1"/>
+      <w:numFmt w:val="decimal"/>
+      <w:lvlText w:val="%1)"/>
+      <w:lvlJc w:val="left"/>
+      <w:pPr>
+        <w:ind w:left="360" w:hanging="360"/>
+      </w:pPr>
+    </w:lvl>
+    <w:lvl w:ilvl="1">
+      <w:start w:val="1"/>
+      <w:numFmt w:val="decimal"/>
+      <w:lvlText w:val="%2."/>
+      <w:lvlJc w:val="left"/>
+      <w:pPr>
+        <w:ind w:left="720" w:hanging="360"/>
+      </w:pPr>
+    </w:lvl>
+    <w:lvl w:ilvl="2">
+      <w:start w:val="1"/>
+      <w:numFmt w:val="lowerRoman"/>
+      <w:lvlText w:val="%3)"/>
+      <w:lvlJc w:val="left"/>
+      <w:pPr>
+        <w:ind w:left="1080" w:hanging="360"/>
+      </w:pPr>
+    </w:lvl>
+    <w:lvl w:ilvl="3">
+      <w:start w:val="1"/>
+      <w:numFmt w:val="decimal"/>
+      <w:lvlText w:val="(%4)"/>
+      <w:lvlJc w:val="left"/>
+      <w:pPr>
+        <w:ind w:left="1440" w:hanging="360"/>
+      </w:pPr>
+    </w:lvl>
+    <w:lvl w:ilvl="4">
+      <w:start w:val="1"/>
+      <w:numFmt w:val="lowerLetter"/>
+      <w:lvlText w:val="(%5)"/>
+      <w:lvlJc w:val="left"/>
+      <w:pPr>
+        <w:ind w:left="1800" w:hanging="360"/>
+      </w:pPr>
+    </w:lvl>
+    <w:lvl w:ilvl="5">
+      <w:start w:val="1"/>
+      <w:numFmt w:val="lowerRoman"/>
+      <w:lvlText w:val="(%6)"/>
+      <w:lvlJc w:val="left"/>
+      <w:pPr>
+        <w:ind w:left="2160" w:hanging="360"/>
+      </w:pPr>
+    </w:lvl>
+    <w:lvl w:ilvl="6">
+      <w:start w:val="1"/>
+      <w:numFmt w:val="decimal"/>
+      <w:lvlText w:val="%7."/>
+      <w:lvlJc w:val="left"/>
+      <w:pPr>
+        <w:ind w:left="2520" w:hanging="360"/>
+      </w:pPr>
+    </w:lvl>
+    <w:lvl w:ilvl="7">
+      <w:start w:val="1"/>
+      <w:numFmt w:val="lowerLetter"/>
+      <w:lvlText w:val="%8."/>
+      <w:lvlJc w:val="left"/>
+      <w:pPr>
+        <w:ind w:left="2880" w:hanging="360"/>
+      </w:pPr>
+    </w:lvl>
+    <w:lvl w:ilvl="8">
+      <w:start w:val="1"/>
+      <w:numFmt w:val="lowerRoman"/>
+      <w:lvlText w:val="%9."/>
+      <w:lvlJc w:val="left"/>
+      <w:pPr>
+        <w:ind w:left="3240" w:hanging="360"/>
+      </w:pPr>
+    </w:lvl>
+  </w:abstractNum>
+  <w:abstractNum w:abstractNumId="25" w15:restartNumberingAfterBreak="0">
     <w:nsid w:val="67C375EA"/>
     <w:multiLevelType w:val="hybridMultilevel"/>
     <w:tmpl w:val="6EA41248"/>
@@ -15806,7 +15708,7 @@
       </w:pPr>
     </w:lvl>
   </w:abstractNum>
-  <w:abstractNum w:abstractNumId="20" w15:restartNumberingAfterBreak="0">
+  <w:abstractNum w:abstractNumId="26" w15:restartNumberingAfterBreak="0">
     <w:nsid w:val="6C402C58"/>
     <w:multiLevelType w:val="hybridMultilevel"/>
     <w:tmpl w:val="9A1CA078"/>
@@ -15951,7 +15853,7 @@
       </w:rPr>
     </w:lvl>
   </w:abstractNum>
-  <w:abstractNum w:abstractNumId="21" w15:restartNumberingAfterBreak="0">
+  <w:abstractNum w:abstractNumId="27" w15:restartNumberingAfterBreak="0">
     <w:nsid w:val="6CD32DA8"/>
     <w:multiLevelType w:val="singleLevel"/>
     <w:tmpl w:val="166470C2"/>
@@ -15977,7 +15879,7 @@
       </w:rPr>
     </w:lvl>
   </w:abstractNum>
-  <w:abstractNum w:abstractNumId="22" w15:restartNumberingAfterBreak="0">
+  <w:abstractNum w:abstractNumId="28" w15:restartNumberingAfterBreak="0">
     <w:nsid w:val="77A13E1D"/>
     <w:multiLevelType w:val="hybridMultilevel"/>
     <w:tmpl w:val="589247EE"/>
@@ -16063,7 +15965,7 @@
       </w:pPr>
     </w:lvl>
   </w:abstractNum>
-  <w:abstractNum w:abstractNumId="23" w15:restartNumberingAfterBreak="0">
+  <w:abstractNum w:abstractNumId="29" w15:restartNumberingAfterBreak="0">
     <w:nsid w:val="79FA3F91"/>
     <w:multiLevelType w:val="hybridMultilevel"/>
     <w:tmpl w:val="CF58DE7E"/>
@@ -16177,76 +16079,76 @@
     </w:lvl>
   </w:abstractNum>
   <w:num w:numId="1" w16cid:durableId="1363625899">
+    <w:abstractNumId w:val="26"/>
+  </w:num>
+  <w:num w:numId="2" w16cid:durableId="829172102">
+    <w:abstractNumId w:val="9"/>
+  </w:num>
+  <w:num w:numId="3" w16cid:durableId="1380124935">
     <w:abstractNumId w:val="20"/>
   </w:num>
-  <w:num w:numId="2" w16cid:durableId="829172102">
+  <w:num w:numId="4" w16cid:durableId="31927620">
+    <w:abstractNumId w:val="27"/>
+  </w:num>
+  <w:num w:numId="5" w16cid:durableId="1713844123">
     <w:abstractNumId w:val="8"/>
   </w:num>
-  <w:num w:numId="3" w16cid:durableId="1380124935">
-    <w:abstractNumId w:val="17"/>
-  </w:num>
-  <w:num w:numId="4" w16cid:durableId="31927620">
-    <w:abstractNumId w:val="21"/>
-  </w:num>
-  <w:num w:numId="5" w16cid:durableId="1713844123">
-    <w:abstractNumId w:val="7"/>
-  </w:num>
   <w:num w:numId="6" w16cid:durableId="1889488984">
-    <w:abstractNumId w:val="4"/>
+    <w:abstractNumId w:val="5"/>
   </w:num>
   <w:num w:numId="7" w16cid:durableId="164901317">
-    <w:abstractNumId w:val="12"/>
+    <w:abstractNumId w:val="13"/>
   </w:num>
   <w:num w:numId="8" w16cid:durableId="1480918736">
     <w:abstractNumId w:val="1"/>
   </w:num>
   <w:num w:numId="9" w16cid:durableId="326052530">
-    <w:abstractNumId w:val="14"/>
+    <w:abstractNumId w:val="15"/>
   </w:num>
   <w:num w:numId="10" w16cid:durableId="980427532">
-    <w:abstractNumId w:val="15"/>
+    <w:abstractNumId w:val="16"/>
   </w:num>
   <w:num w:numId="11" w16cid:durableId="1461681504">
-    <w:abstractNumId w:val="5"/>
+    <w:abstractNumId w:val="6"/>
   </w:num>
   <w:num w:numId="12" w16cid:durableId="652218896">
     <w:abstractNumId w:val="3"/>
   </w:num>
   <w:num w:numId="13" w16cid:durableId="230578305">
-    <w:abstractNumId w:val="6"/>
+    <w:abstractNumId w:val="7"/>
   </w:num>
   <w:num w:numId="14" w16cid:durableId="949557141">
-    <w:abstractNumId w:val="18"/>
+    <w:abstractNumId w:val="22"/>
   </w:num>
   <w:num w:numId="15" w16cid:durableId="1844540241">
-    <w:abstractNumId w:val="13"/>
+    <w:abstractNumId w:val="14"/>
   </w:num>
   <w:num w:numId="16" w16cid:durableId="454951809">
-    <w:abstractNumId w:val="22"/>
+    <w:abstractNumId w:val="28"/>
   </w:num>
   <w:num w:numId="17" w16cid:durableId="653028655">
     <w:abstractNumId w:val="0"/>
   </w:num>
   <w:num w:numId="18" w16cid:durableId="1262372581">
-    <w:abstractNumId w:val="10"/>
+    <w:abstractNumId w:val="11"/>
   </w:num>
   <w:num w:numId="19" w16cid:durableId="1555387864">
     <w:abstractNumId w:val="2"/>
   </w:num>
   <w:num w:numId="20" w16cid:durableId="1821997151">
-    <w:abstractNumId w:val="19"/>
+    <w:abstractNumId w:val="25"/>
   </w:num>
   <w:num w:numId="21" w16cid:durableId="1865746900">
-    <w:abstractNumId w:val="16"/>
+    <w:abstractNumId w:val="18"/>
   </w:num>
   <w:num w:numId="22" w16cid:durableId="1546333659">
-    <w:abstractNumId w:val="9"/>
+    <w:abstractNumId w:val="10"/>
   </w:num>
   <w:num w:numId="23" w16cid:durableId="32118057">
-    <w:abstractNumId w:val="23"/>
+    <w:abstractNumId w:val="29"/>
   </w:num>
   <w:num w:numId="24" w16cid:durableId="525369333">
-    <w:abstractNumId w:val="11"/>
+    <w:abstractNumId w:val="12"/>
   </w:num>
   <w:num w:numId="25" w16cid:durableId="926770571">
     <w:abstractNumId w:val="3"/>
@@ -16263,6 +16165,24 @@
     <w:lvlOverride w:ilvl="6"/>
     <w:lvlOverride w:ilvl="7"/>
     <w:lvlOverride w:ilvl="8"/>
+  </w:num>
+  <w:num w:numId="26" w16cid:durableId="256207391">
+    <w:abstractNumId w:val="24"/>
+  </w:num>
+  <w:num w:numId="27" w16cid:durableId="36862417">
+    <w:abstractNumId w:val="23"/>
+  </w:num>
+  <w:num w:numId="28" w16cid:durableId="519857732">
+    <w:abstractNumId w:val="19"/>
+  </w:num>
+  <w:num w:numId="29" w16cid:durableId="1054698219">
+    <w:abstractNumId w:val="4"/>
+  </w:num>
+  <w:num w:numId="30" w16cid:durableId="2007439042">
+    <w:abstractNumId w:val="21"/>
+  </w:num>
+  <w:num w:numId="31" w16cid:durableId="75370626">
+    <w:abstractNumId w:val="17"/>
   </w:num>
   <w:numIdMacAtCleanup w:val="24"/>
 </w:numbering>
@@ -16673,6 +16593,7 @@
   <w:style w:type="character" w:default="1" w:styleId="DefaultParagraphFont">
     <w:name w:val="Default Paragraph Font"/>
     <w:uiPriority w:val="1"/>
+    <w:semiHidden/>
     <w:unhideWhenUsed/>
   </w:style>
   <w:style w:type="table" w:default="1" w:styleId="TableNormal">

</xml_diff>

<commit_message>
Final pre-score changes added
</commit_message>
<xml_diff>
--- a/source/MySEProject/Documentation/ML -24-25-01-Investigate Image reconstruction using classifiers.docx
+++ b/source/MySEProject/Documentation/ML -24-25-01-Investigate Image reconstruction using classifiers.docx
@@ -6,11 +6,23 @@
       <w:pPr>
         <w:pStyle w:val="Title"/>
         <w:spacing w:before="100" w:beforeAutospacing="1" w:after="100" w:afterAutospacing="1"/>
-        <w:ind w:left="0"/>
         <w:jc w:val="center"/>
-      </w:pPr>
-      <w:bookmarkStart w:id="0" w:name="_Hlk193630253"/>
-      <w:bookmarkEnd w:id="0"/>
+        <w:rPr>
+          <w:lang w:val="en-IN"/>
+        </w:rPr>
+      </w:pPr>
+      <w:r>
+        <w:rPr>
+          <w:lang w:val="en-IN"/>
+        </w:rPr>
+        <w:t>ML 24/25-01</w:t>
+      </w:r>
+      <w:r>
+        <w:rPr>
+          <w:lang w:val="en-IN"/>
+        </w:rPr>
+        <w:t xml:space="preserve"> </w:t>
+      </w:r>
       <w:r>
         <w:t>Investigate</w:t>
       </w:r>
@@ -378,7 +390,31 @@
           <w:sz w:val="18"/>
           <w:szCs w:val="18"/>
         </w:rPr>
-        <w:t xml:space="preserve"> encompasses various techniques designed to handle diverse data formats such as text, images, audio, video, and numerical data, enabling accurate predictions based on the application context. Supervised learning, a major branch of ML, relies on classification and regression techniques to analyze patterns within data. Several classification algorithms fall under supervised learning, including decision trees, support vector machines, Naïve Bayes, and K-Nearest Neighbors (KNN), each offering distinct advantages based on the specific use case. This paper presents an image reconstruction framework leveraging machine learning classifiers to restore images from Sparse Distributed Representations (SDRs). Binarized images are encoded into SDRs using NeoCortexApi, ensuring a compact and noise-resilient representation. Two classifiers, K-Nearest Neighbors (KNN) and Hierarchical Temporal Memory (HTM), are trained to learn feature associations from SDRs. During reconstruction, the classifiers predict missing or distorted SDRs, which are then mapped back to the pixel domain. Reconstruction quality is evaluated using Cosine similarity metrics to assess structural integrity and information retention. Experimental results demonstrate the effectiveness of classifier-based reconstruction, highlighting trade-offs between computational complexity and accuracy for KNN and HTM.</w:t>
+        <w:t xml:space="preserve"> encompasses various techniques designed to handle diverse data formats such as text, images, audio, video, and numerical data, enabling accurate predictions based on the application context. Supervised learning, a major branch of ML, relies on classification and regression techniques to analyze patterns within data. Several classification algorithms fall under supervised learning, including decision trees, support vector machines, Naïve Bayes, and K-Nearest Neighbors (KNN), each offering distinct advantages based on the specific use case. This paper presents an image reconstruction framework leveraging machine learning classifiers to restore images from Sparse Distributed Representations (SDRs). Binarized images are encoded into SDRs using </w:t>
+      </w:r>
+      <w:proofErr w:type="spellStart"/>
+      <w:r>
+        <w:rPr>
+          <w:b/>
+          <w:bCs/>
+          <w:i/>
+          <w:iCs/>
+          <w:sz w:val="18"/>
+          <w:szCs w:val="18"/>
+        </w:rPr>
+        <w:t>NeoCortexApi</w:t>
+      </w:r>
+      <w:proofErr w:type="spellEnd"/>
+      <w:r>
+        <w:rPr>
+          <w:b/>
+          <w:bCs/>
+          <w:i/>
+          <w:iCs/>
+          <w:sz w:val="18"/>
+          <w:szCs w:val="18"/>
+        </w:rPr>
+        <w:t>, ensuring a compact and noise-resilient representation. Two classifiers, K-Nearest Neighbors (KNN) and Hierarchical Temporal Memory (HTM), are trained to learn feature associations from SDRs. During reconstruction, the classifiers predict missing or distorted SDRs, which are then mapped back to the pixel domain. Reconstruction quality is evaluated using Cosine similarity metrics to assess structural integrity and information retention. Experimental results demonstrate the effectiveness of classifier-based reconstruction, highlighting trade-offs between computational complexity and accuracy for KNN and HTM.</w:t>
       </w:r>
     </w:p>
     <w:p>
@@ -518,7 +554,16 @@
           <w:i/>
           <w:sz w:val="18"/>
         </w:rPr>
-        <w:t>Neighbors (KNN), Hierarchical</w:t>
+        <w:t xml:space="preserve">Neighbors (KNN), </w:t>
+      </w:r>
+      <w:proofErr w:type="gramStart"/>
+      <w:r>
+        <w:rPr>
+          <w:b/>
+          <w:i/>
+          <w:sz w:val="18"/>
+        </w:rPr>
+        <w:t>Hierarchical</w:t>
       </w:r>
       <w:r>
         <w:rPr>
@@ -545,6 +590,7 @@
         </w:rPr>
         <w:t>Temporal</w:t>
       </w:r>
+      <w:proofErr w:type="gramEnd"/>
       <w:r>
         <w:rPr>
           <w:b/>
@@ -577,7 +623,16 @@
           <w:i/>
           <w:sz w:val="18"/>
         </w:rPr>
-        <w:t>(HTM),</w:t>
+        <w:t>(HTM</w:t>
+      </w:r>
+      <w:proofErr w:type="gramStart"/>
+      <w:r>
+        <w:rPr>
+          <w:b/>
+          <w:i/>
+          <w:sz w:val="18"/>
+        </w:rPr>
+        <w:t>),</w:t>
       </w:r>
       <w:r>
         <w:rPr>
@@ -596,13 +651,23 @@
         </w:rPr>
         <w:t xml:space="preserve"> </w:t>
       </w:r>
+      <w:proofErr w:type="spellStart"/>
       <w:r>
         <w:rPr>
           <w:b/>
           <w:i/>
           <w:sz w:val="18"/>
         </w:rPr>
-        <w:t>NeoCortexApi,</w:t>
+        <w:t>NeoCortexApi</w:t>
+      </w:r>
+      <w:proofErr w:type="spellEnd"/>
+      <w:r>
+        <w:rPr>
+          <w:b/>
+          <w:i/>
+          <w:sz w:val="18"/>
+        </w:rPr>
+        <w:t>,</w:t>
       </w:r>
       <w:r>
         <w:rPr>
@@ -628,8 +693,9 @@
           <w:i/>
           <w:sz w:val="18"/>
         </w:rPr>
-        <w:t xml:space="preserve">Machine Learning, </w:t>
-      </w:r>
+        <w:t>Machine</w:t>
+      </w:r>
+      <w:proofErr w:type="gramEnd"/>
       <w:r>
         <w:rPr>
           <w:b/>
@@ -638,13 +704,39 @@
         </w:rPr>
         <w:t xml:space="preserve"> </w:t>
       </w:r>
+      <w:proofErr w:type="gramStart"/>
       <w:r>
         <w:rPr>
           <w:b/>
           <w:i/>
           <w:sz w:val="18"/>
         </w:rPr>
-        <w:t>Cosine Similarity.</w:t>
+        <w:t xml:space="preserve">Learning, </w:t>
+      </w:r>
+      <w:r>
+        <w:rPr>
+          <w:b/>
+          <w:i/>
+          <w:sz w:val="18"/>
+        </w:rPr>
+        <w:t xml:space="preserve"> </w:t>
+      </w:r>
+      <w:r>
+        <w:rPr>
+          <w:b/>
+          <w:i/>
+          <w:sz w:val="18"/>
+        </w:rPr>
+        <w:t>Cosine</w:t>
+      </w:r>
+      <w:proofErr w:type="gramEnd"/>
+      <w:r>
+        <w:rPr>
+          <w:b/>
+          <w:i/>
+          <w:sz w:val="18"/>
+        </w:rPr>
+        <w:t xml:space="preserve"> Similarity.</w:t>
       </w:r>
     </w:p>
     <w:p>
@@ -675,7 +767,7 @@
       <w:r>
         <w:t xml:space="preserve"> </w:t>
       </w:r>
-      <w:bookmarkStart w:id="1" w:name="_Hlk98197882"/>
+      <w:bookmarkStart w:id="0" w:name="_Hlk98197882"/>
     </w:p>
     <w:p>
       <w:pPr>
@@ -1044,7 +1136,7 @@
         <w:t>original images.</w:t>
       </w:r>
     </w:p>
-    <w:bookmarkEnd w:id="1"/>
+    <w:bookmarkEnd w:id="0"/>
     <w:p>
       <w:pPr>
         <w:pStyle w:val="Heading1"/>
@@ -1421,7 +1513,23 @@
           <w:iCs/>
           <w:sz w:val="20"/>
         </w:rPr>
-        <w:t xml:space="preserve">nearest neighbors are retrieved, forming a neighbourhood of </w:t>
+        <w:t xml:space="preserve">nearest neighbors </w:t>
+      </w:r>
+      <w:proofErr w:type="gramStart"/>
+      <w:r>
+        <w:rPr>
+          <w:iCs/>
+          <w:sz w:val="20"/>
+        </w:rPr>
+        <w:t>are</w:t>
+      </w:r>
+      <w:proofErr w:type="gramEnd"/>
+      <w:r>
+        <w:rPr>
+          <w:iCs/>
+          <w:sz w:val="20"/>
+        </w:rPr>
+        <w:t xml:space="preserve"> retrieved, forming a neighbourhood of </w:t>
       </w:r>
       <w:r>
         <w:rPr>
@@ -1597,7 +1705,7 @@
           <w:sz w:val="20"/>
         </w:rPr>
       </w:pPr>
-      <w:bookmarkStart w:id="2" w:name="_Hlk193624590"/>
+      <w:bookmarkStart w:id="1" w:name="_Hlk193624590"/>
       <w:r>
         <w:rPr>
           <w:i/>
@@ -1661,8 +1769,8 @@
           <w:lang w:val="en-US"/>
         </w:rPr>
       </w:pPr>
-      <w:bookmarkStart w:id="3" w:name="_Hlk193624640"/>
-      <w:bookmarkEnd w:id="2"/>
+      <w:bookmarkStart w:id="2" w:name="_Hlk193624640"/>
+      <w:bookmarkEnd w:id="1"/>
       <w:r>
         <w:rPr>
           <w:lang w:val="en-US"/>
@@ -1742,7 +1850,7 @@
         <w:t>.</w:t>
       </w:r>
     </w:p>
-    <w:bookmarkEnd w:id="3"/>
+    <w:bookmarkEnd w:id="2"/>
     <w:p>
       <w:pPr>
         <w:numPr>
@@ -2050,22 +2158,48 @@
           <w:rFonts w:eastAsia="Times New Roman"/>
           <w:szCs w:val="22"/>
         </w:rPr>
-        <w:t xml:space="preserve"> classification and reconstruction, input images are first converted into binary representations. An Image Binarizer </w:t>
-      </w:r>
-      <w:r>
-        <w:t xml:space="preserve">using the </w:t>
-      </w:r>
-      <w:r>
-        <w:t>BinarizeToFixedSize()</w:t>
-      </w:r>
-      <w:r>
-        <w:t xml:space="preserve"> </w:t>
-      </w:r>
+        <w:t xml:space="preserve"> classification and reconstruction, input images are first converted into binary representations. An Image </w:t>
+      </w:r>
+      <w:proofErr w:type="spellStart"/>
       <w:r>
         <w:rPr>
           <w:rFonts w:eastAsia="Times New Roman"/>
           <w:szCs w:val="22"/>
         </w:rPr>
+        <w:t>Binarizer</w:t>
+      </w:r>
+      <w:proofErr w:type="spellEnd"/>
+      <w:r>
+        <w:rPr>
+          <w:rFonts w:eastAsia="Times New Roman"/>
+          <w:szCs w:val="22"/>
+        </w:rPr>
+        <w:t xml:space="preserve"> </w:t>
+      </w:r>
+      <w:r>
+        <w:t xml:space="preserve">using the </w:t>
+      </w:r>
+      <w:proofErr w:type="spellStart"/>
+      <w:proofErr w:type="gramStart"/>
+      <w:r>
+        <w:t>BinarizeToFixedSize</w:t>
+      </w:r>
+      <w:proofErr w:type="spellEnd"/>
+      <w:r>
+        <w:t>(</w:t>
+      </w:r>
+      <w:proofErr w:type="gramEnd"/>
+      <w:r>
+        <w:t>)</w:t>
+      </w:r>
+      <w:r>
+        <w:t xml:space="preserve"> </w:t>
+      </w:r>
+      <w:r>
+        <w:rPr>
+          <w:rFonts w:eastAsia="Times New Roman"/>
+          <w:szCs w:val="22"/>
+        </w:rPr>
         <w:t xml:space="preserve">is employed to transform grayscale or color images into binary arrays, where each pixel is represented as either 0 or 1. </w:t>
       </w:r>
     </w:p>
@@ -2093,11 +2227,19 @@
         <w:t xml:space="preserve"> </w:t>
       </w:r>
       <w:hyperlink r:id="rId14" w:anchor="L223" w:history="1">
+        <w:proofErr w:type="spellStart"/>
         <w:r>
           <w:rPr>
             <w:rStyle w:val="Hyperlink"/>
           </w:rPr>
-          <w:t>BinarizeToFixedSize()</w:t>
+          <w:t>BinarizeToFixedSize</w:t>
+        </w:r>
+        <w:proofErr w:type="spellEnd"/>
+        <w:r>
+          <w:rPr>
+            <w:rStyle w:val="Hyperlink"/>
+          </w:rPr>
+          <w:t>()</w:t>
         </w:r>
       </w:hyperlink>
     </w:p>
@@ -2379,8 +2521,30 @@
         <w:rPr>
           <w:bCs/>
         </w:rPr>
-        <w:t>The binarized image data is processed using the Hierarchical Temporal Memory (HTM) Spatial Pooler (SP) from the NeoCortex API to generate Sparse Distributed Representations (SDRs). The Spatial Pooler maps the binary input into an SDR, ensuring that similar input images produce similar SDRs. The key parameters of the compute method sp.compute</w:t>
-      </w:r>
+        <w:t xml:space="preserve">The binarized image data is processed using the Hierarchical Temporal Memory (HTM) Spatial Pooler (SP) from the </w:t>
+      </w:r>
+      <w:proofErr w:type="spellStart"/>
+      <w:r>
+        <w:rPr>
+          <w:bCs/>
+        </w:rPr>
+        <w:t>NeoCortex</w:t>
+      </w:r>
+      <w:proofErr w:type="spellEnd"/>
+      <w:r>
+        <w:rPr>
+          <w:bCs/>
+        </w:rPr>
+        <w:t xml:space="preserve"> API to generate Sparse Distributed Representations (SDRs). The Spatial Pooler maps the binary input into an SDR, ensuring that similar input images produce similar SDRs. The key parameters of the compute method </w:t>
+      </w:r>
+      <w:proofErr w:type="spellStart"/>
+      <w:r>
+        <w:rPr>
+          <w:bCs/>
+        </w:rPr>
+        <w:t>sp.compute</w:t>
+      </w:r>
+      <w:proofErr w:type="spellEnd"/>
       <w:r>
         <w:rPr>
           <w:bCs/>
@@ -2576,12 +2740,14 @@
         <w:t xml:space="preserve">Listing 2 </w:t>
       </w:r>
       <w:hyperlink r:id="rId15" w:anchor="L232" w:history="1">
+        <w:proofErr w:type="spellStart"/>
         <w:r>
           <w:rPr>
             <w:rStyle w:val="Hyperlink"/>
           </w:rPr>
           <w:t>sp.compute</w:t>
         </w:r>
+        <w:proofErr w:type="spellEnd"/>
       </w:hyperlink>
       <w:r>
         <w:t xml:space="preserve"> </w:t>
@@ -3041,7 +3207,23 @@
           <w:spacing w:val="-1"/>
           <w:lang w:val="x-none" w:eastAsia="x-none"/>
         </w:rPr>
-        <w:t xml:space="preserve">Once classification is performed, the reconstruction process is initiated to evaluate how well the classifiers retain image structure. The NeoCortex API’s Reconstruct() method </w:t>
+        <w:t xml:space="preserve">Once classification is performed, the reconstruction process is initiated to evaluate how well the classifiers retain image structure. The </w:t>
+      </w:r>
+      <w:proofErr w:type="spellStart"/>
+      <w:r>
+        <w:rPr>
+          <w:spacing w:val="-1"/>
+          <w:lang w:val="x-none" w:eastAsia="x-none"/>
+        </w:rPr>
+        <w:t>NeoCortex</w:t>
+      </w:r>
+      <w:proofErr w:type="spellEnd"/>
+      <w:r>
+        <w:rPr>
+          <w:spacing w:val="-1"/>
+          <w:lang w:val="x-none" w:eastAsia="x-none"/>
+        </w:rPr>
+        <w:t xml:space="preserve"> API’s Reconstruct() method </w:t>
       </w:r>
       <w:r>
         <w:rPr>
@@ -4157,11 +4339,16 @@
       <w:r>
         <w:t xml:space="preserve"> </w:t>
       </w:r>
+      <w:proofErr w:type="spellStart"/>
       <w:r>
         <w:t>IC</w:t>
       </w:r>
       <w:r>
-        <w:t>lassifier learns to recognize</w:t>
+        <w:t>lassifier</w:t>
+      </w:r>
+      <w:proofErr w:type="spellEnd"/>
+      <w:r>
+        <w:t xml:space="preserve"> learns to recognize</w:t>
       </w:r>
       <w:r>
         <w:t xml:space="preserve"> </w:t>
@@ -4328,12 +4515,14 @@
       <w:r>
         <w:t xml:space="preserve"> </w:t>
       </w:r>
+      <w:proofErr w:type="spellStart"/>
       <w:r>
         <w:t>IC</w:t>
       </w:r>
       <w:r>
         <w:t>lassifier</w:t>
       </w:r>
+      <w:proofErr w:type="spellEnd"/>
       <w:r>
         <w:t xml:space="preserve"> </w:t>
       </w:r>
@@ -4584,7 +4773,15 @@
         <w:ind w:firstLine="199"/>
       </w:pPr>
       <w:r>
-        <w:t>The predicted SDRs are reconstructed back into images by computing the permanence values of the input space, ensuring that active columns are converted back into an approximate binarized image. The reconstruction process involves the fol- lowing steps:</w:t>
+        <w:t xml:space="preserve">The predicted SDRs are reconstructed back into images by computing the permanence values of the input space, ensuring that active columns are converted back into an approximate binarized image. The reconstruction process involves the </w:t>
+      </w:r>
+      <w:proofErr w:type="spellStart"/>
+      <w:r>
+        <w:t>fol</w:t>
+      </w:r>
+      <w:proofErr w:type="spellEnd"/>
+      <w:r>
+        <w:t>- lowing steps:</w:t>
       </w:r>
     </w:p>
     <w:p>
@@ -5233,7 +5430,15 @@
         <w:ind w:left="360"/>
       </w:pPr>
       <w:r>
-        <w:t>Once the nearest neighbors are identified, a majority vote is conducted to determine the predicted class label.</w:t>
+        <w:t xml:space="preserve">Once the nearest </w:t>
+      </w:r>
+      <w:proofErr w:type="spellStart"/>
+      <w:r>
+        <w:t>neighbors</w:t>
+      </w:r>
+      <w:proofErr w:type="spellEnd"/>
+      <w:r>
+        <w:t xml:space="preserve"> are identified, a majority vote is conducted to determine the predicted class label.</w:t>
       </w:r>
     </w:p>
     <w:p>
@@ -5247,7 +5452,23 @@
         <w:ind w:left="360"/>
       </w:pPr>
       <w:r>
-        <w:t>Majority Voting: The class label of the predicted SDR is determined by counting how many of the K nearest neighbors belong to each class. The class label with the highest count among the K neighbors is selected as the predicted class.</w:t>
+        <w:t xml:space="preserve">Majority Voting: The class label of the predicted SDR is determined by counting how many of the K nearest </w:t>
+      </w:r>
+      <w:proofErr w:type="spellStart"/>
+      <w:r>
+        <w:t>neighbors</w:t>
+      </w:r>
+      <w:proofErr w:type="spellEnd"/>
+      <w:r>
+        <w:t xml:space="preserve"> belong to each class. The class label with the highest count among the K </w:t>
+      </w:r>
+      <w:proofErr w:type="spellStart"/>
+      <w:r>
+        <w:t>neighbors</w:t>
+      </w:r>
+      <w:proofErr w:type="spellEnd"/>
+      <w:r>
+        <w:t xml:space="preserve"> is selected as the predicted class.</w:t>
       </w:r>
     </w:p>
     <w:p>
@@ -5317,7 +5538,15 @@
         <w:ind w:left="360"/>
       </w:pPr>
       <w:r>
-        <w:t>This process ensures that the classification decision reflects the majority consensus among the closest neighbors, increasing the accuracy of the classifier.</w:t>
+        <w:t xml:space="preserve">This process ensures that the classification decision reflects the majority consensus among the closest </w:t>
+      </w:r>
+      <w:proofErr w:type="spellStart"/>
+      <w:r>
+        <w:t>neighbors</w:t>
+      </w:r>
+      <w:proofErr w:type="spellEnd"/>
+      <w:r>
+        <w:t>, increasing the accuracy of the classifier.</w:t>
       </w:r>
     </w:p>
     <w:p>
@@ -5763,7 +5992,7 @@
         <w:spacing w:before="48" w:line="249" w:lineRule="auto"/>
         <w:ind w:firstLine="0"/>
       </w:pPr>
-      <w:bookmarkStart w:id="4" w:name="_Hlk193628538"/>
+      <w:bookmarkStart w:id="3" w:name="_Hlk193628538"/>
       <w:r>
         <w:t>A flowchart of the image reconstruction process is shown</w:t>
       </w:r>
@@ -6854,9 +7083,11 @@
       <w:r>
         <w:t xml:space="preserve"> </w:t>
       </w:r>
+      <w:proofErr w:type="spellStart"/>
       <w:r>
         <w:t>neighbors</w:t>
       </w:r>
+      <w:proofErr w:type="spellEnd"/>
       <w:r>
         <w:t xml:space="preserve"> </w:t>
       </w:r>
@@ -6978,7 +7209,7 @@
         <w:t xml:space="preserve"> reconstruction.</w:t>
       </w:r>
     </w:p>
-    <w:bookmarkEnd w:id="4"/>
+    <w:bookmarkEnd w:id="3"/>
     <w:p>
       <w:pPr>
         <w:pStyle w:val="Heading1"/>
@@ -7066,9 +7297,11 @@
         </w:rPr>
         <w:t xml:space="preserve"> </w:t>
       </w:r>
+      <w:proofErr w:type="spellStart"/>
       <w:r>
         <w:t>CosineSimilarity</w:t>
       </w:r>
+      <w:proofErr w:type="spellEnd"/>
       <w:r>
         <w:rPr>
           <w:spacing w:val="32"/>
@@ -7209,7 +7442,21 @@
         <w:rPr>
           <w:bCs/>
         </w:rPr>
-        <w:t>Two identical integer vectors, vec1 and vec2, are initialized. The CosineSimilarity function is invoked with these vectors as input. The result is compared to the expected similarity score of 1.0.</w:t>
+        <w:t xml:space="preserve">Two identical integer vectors, vec1 and vec2, are initialized. The </w:t>
+      </w:r>
+      <w:proofErr w:type="spellStart"/>
+      <w:r>
+        <w:rPr>
+          <w:bCs/>
+        </w:rPr>
+        <w:t>CosineSimilarity</w:t>
+      </w:r>
+      <w:proofErr w:type="spellEnd"/>
+      <w:r>
+        <w:rPr>
+          <w:bCs/>
+        </w:rPr>
+        <w:t xml:space="preserve"> function is invoked with these vectors as input. The result is compared to the expected similarity score of 1.0.</w:t>
       </w:r>
     </w:p>
     <w:p>
@@ -7320,7 +7567,7 @@
           <w:sz w:val="20"/>
         </w:rPr>
       </w:pPr>
-      <w:bookmarkStart w:id="5" w:name="_Hlk193629037"/>
+      <w:bookmarkStart w:id="4" w:name="_Hlk193629037"/>
       <w:r>
         <w:rPr>
           <w:i/>
@@ -7405,7 +7652,7 @@
         <w:t>Vectors</w:t>
       </w:r>
     </w:p>
-    <w:bookmarkEnd w:id="5"/>
+    <w:bookmarkEnd w:id="4"/>
     <w:p>
       <w:pPr>
         <w:pStyle w:val="BodyText"/>
@@ -7419,7 +7666,15 @@
         <w:t>Objective</w:t>
       </w:r>
       <w:r>
-        <w:t>: Confirm that the CosineSimilarity function re- turns a similarity score of 0.0 for completely different vectors, indicating no similarity.</w:t>
+        <w:t xml:space="preserve">: Confirm that the </w:t>
+      </w:r>
+      <w:proofErr w:type="spellStart"/>
+      <w:r>
+        <w:t>CosineSimilarity</w:t>
+      </w:r>
+      <w:proofErr w:type="spellEnd"/>
+      <w:r>
+        <w:t xml:space="preserve"> function re- turns a similarity score of 0.0 for completely different vectors, indicating no similarity.</w:t>
       </w:r>
     </w:p>
     <w:p>
@@ -7460,7 +7715,31 @@
         <w:t xml:space="preserve"> </w:t>
       </w:r>
       <w:r>
-        <w:t>Two integer vectors with no overlapping elements are ini- tialized. The CosineSimilarity function is invoked with these vectors.</w:t>
+        <w:t xml:space="preserve">Two integer vectors with no overlapping elements are </w:t>
+      </w:r>
+      <w:proofErr w:type="spellStart"/>
+      <w:r>
+        <w:t>ini</w:t>
+      </w:r>
+      <w:proofErr w:type="spellEnd"/>
+      <w:r>
+        <w:t xml:space="preserve">- </w:t>
+      </w:r>
+      <w:proofErr w:type="spellStart"/>
+      <w:r>
+        <w:t>tialized</w:t>
+      </w:r>
+      <w:proofErr w:type="spellEnd"/>
+      <w:r>
+        <w:t xml:space="preserve">. The </w:t>
+      </w:r>
+      <w:proofErr w:type="spellStart"/>
+      <w:r>
+        <w:t>CosineSimilarity</w:t>
+      </w:r>
+      <w:proofErr w:type="spellEnd"/>
+      <w:r>
+        <w:t xml:space="preserve"> function is invoked with these vectors.</w:t>
       </w:r>
       <w:r>
         <w:rPr>
@@ -8023,7 +8302,23 @@
           <w:i/>
           <w:sz w:val="20"/>
         </w:rPr>
-        <w:t>Converting Permanance Values</w:t>
+        <w:t xml:space="preserve">Converting </w:t>
+      </w:r>
+      <w:proofErr w:type="spellStart"/>
+      <w:r>
+        <w:rPr>
+          <w:i/>
+          <w:sz w:val="20"/>
+        </w:rPr>
+        <w:t>Permanance</w:t>
+      </w:r>
+      <w:proofErr w:type="spellEnd"/>
+      <w:r>
+        <w:rPr>
+          <w:i/>
+          <w:sz w:val="20"/>
+        </w:rPr>
+        <w:t xml:space="preserve"> Values</w:t>
       </w:r>
       <w:r>
         <w:rPr>
@@ -8062,7 +8357,15 @@
         <w:t>Objective</w:t>
       </w:r>
       <w:r>
-        <w:t>: Ensure that the ConvertPermanenceToBinary function correctly converts a given permanence array into a binary representation based on a threshold.</w:t>
+        <w:t xml:space="preserve">: Ensure that the </w:t>
+      </w:r>
+      <w:proofErr w:type="spellStart"/>
+      <w:r>
+        <w:t>ConvertPermanenceToBinary</w:t>
+      </w:r>
+      <w:proofErr w:type="spellEnd"/>
+      <w:r>
+        <w:t xml:space="preserve"> function correctly converts a given permanence array into a binary representation based on a threshold.</w:t>
       </w:r>
     </w:p>
     <w:p>
@@ -8141,9 +8444,11 @@
       <w:r>
         <w:t xml:space="preserve"> </w:t>
       </w:r>
+      <w:proofErr w:type="spellStart"/>
       <w:r>
         <w:t>permanenceValues</w:t>
       </w:r>
+      <w:proofErr w:type="spellEnd"/>
       <w:r>
         <w:rPr>
           <w:spacing w:val="13"/>
@@ -8301,7 +8606,15 @@
         <w:t>Outcome Verification</w:t>
       </w:r>
       <w:r>
-        <w:t>: The resulting binary array is as- serted to match the expected output.</w:t>
+        <w:t xml:space="preserve">: The resulting binary array is as- </w:t>
+      </w:r>
+      <w:proofErr w:type="spellStart"/>
+      <w:r>
+        <w:t>serted</w:t>
+      </w:r>
+      <w:proofErr w:type="spellEnd"/>
+      <w:r>
+        <w:t xml:space="preserve"> to match the expected output.</w:t>
       </w:r>
     </w:p>
     <w:p>
@@ -8363,12 +8676,14 @@
         </w:rPr>
         <w:t xml:space="preserve"> </w:t>
       </w:r>
+      <w:proofErr w:type="spellStart"/>
       <w:r>
         <w:rPr>
           <w:i/>
         </w:rPr>
         <w:t>Postive</w:t>
       </w:r>
+      <w:proofErr w:type="spellEnd"/>
       <w:r>
         <w:rPr>
           <w:i/>
@@ -8376,12 +8691,14 @@
         </w:rPr>
         <w:t xml:space="preserve"> </w:t>
       </w:r>
+      <w:proofErr w:type="spellStart"/>
       <w:r>
         <w:rPr>
           <w:i/>
         </w:rPr>
         <w:t>Permanance</w:t>
       </w:r>
+      <w:proofErr w:type="spellEnd"/>
       <w:r>
         <w:rPr>
           <w:i/>
@@ -8423,7 +8740,31 @@
         <w:t xml:space="preserve"> </w:t>
       </w:r>
       <w:r>
-        <w:t>that ConvertPermanenceToBinary cor- rectly handles non-negative permanence values and produces an accurate binary representation.</w:t>
+        <w:t xml:space="preserve">that </w:t>
+      </w:r>
+      <w:proofErr w:type="spellStart"/>
+      <w:r>
+        <w:t>ConvertPermanenceToBinary</w:t>
+      </w:r>
+      <w:proofErr w:type="spellEnd"/>
+      <w:r>
+        <w:t xml:space="preserve"> </w:t>
+      </w:r>
+      <w:proofErr w:type="spellStart"/>
+      <w:r>
+        <w:t>cor</w:t>
+      </w:r>
+      <w:proofErr w:type="spellEnd"/>
+      <w:r>
+        <w:t xml:space="preserve">- </w:t>
+      </w:r>
+      <w:proofErr w:type="spellStart"/>
+      <w:r>
+        <w:t>rectly</w:t>
+      </w:r>
+      <w:proofErr w:type="spellEnd"/>
+      <w:r>
+        <w:t xml:space="preserve"> handles non-negative permanence values and produces an accurate binary representation.</w:t>
       </w:r>
     </w:p>
     <w:p>
@@ -8513,9 +8854,11 @@
         </w:rPr>
         <w:t xml:space="preserve"> </w:t>
       </w:r>
+      <w:proofErr w:type="spellStart"/>
       <w:r>
         <w:t>permanenceValues</w:t>
       </w:r>
+      <w:proofErr w:type="spellEnd"/>
       <w:r>
         <w:rPr>
           <w:spacing w:val="12"/>
@@ -8780,6 +9123,7 @@
         </w:rPr>
         <w:t xml:space="preserve"> </w:t>
       </w:r>
+      <w:proofErr w:type="gramStart"/>
       <w:r>
         <w:rPr>
           <w:i/>
@@ -8787,6 +9131,7 @@
         </w:rPr>
         <w:t>To</w:t>
       </w:r>
+      <w:proofErr w:type="gramEnd"/>
       <w:r>
         <w:rPr>
           <w:i/>
@@ -8810,6 +9155,7 @@
         </w:rPr>
         <w:t xml:space="preserve"> </w:t>
       </w:r>
+      <w:proofErr w:type="gramStart"/>
       <w:r>
         <w:rPr>
           <w:i/>
@@ -8817,6 +9163,7 @@
         </w:rPr>
         <w:t>With</w:t>
       </w:r>
+      <w:proofErr w:type="gramEnd"/>
       <w:r>
         <w:rPr>
           <w:i/>
@@ -9009,9 +9356,11 @@
         </w:rPr>
         <w:t xml:space="preserve"> </w:t>
       </w:r>
+      <w:proofErr w:type="spellStart"/>
       <w:r>
         <w:t>permanenceValues</w:t>
       </w:r>
+      <w:proofErr w:type="spellEnd"/>
       <w:r>
         <w:rPr>
           <w:spacing w:val="40"/>
@@ -9058,7 +9407,21 @@
         <w:rPr>
           <w:spacing w:val="-2"/>
         </w:rPr>
-        <w:t>(ArgumentException).</w:t>
+        <w:t>(</w:t>
+      </w:r>
+      <w:proofErr w:type="spellStart"/>
+      <w:r>
+        <w:rPr>
+          <w:spacing w:val="-2"/>
+        </w:rPr>
+        <w:t>ArgumentException</w:t>
+      </w:r>
+      <w:proofErr w:type="spellEnd"/>
+      <w:r>
+        <w:rPr>
+          <w:spacing w:val="-2"/>
+        </w:rPr>
+        <w:t>).</w:t>
       </w:r>
     </w:p>
     <w:p>
@@ -9229,6 +9592,7 @@
         </w:rPr>
         <w:t xml:space="preserve"> </w:t>
       </w:r>
+      <w:proofErr w:type="gramStart"/>
       <w:r>
         <w:rPr>
           <w:i/>
@@ -9236,6 +9600,7 @@
         </w:rPr>
         <w:t>To</w:t>
       </w:r>
+      <w:proofErr w:type="gramEnd"/>
       <w:r>
         <w:rPr>
           <w:i/>
@@ -9259,6 +9624,7 @@
         </w:rPr>
         <w:t xml:space="preserve"> </w:t>
       </w:r>
+      <w:proofErr w:type="gramStart"/>
       <w:r>
         <w:rPr>
           <w:i/>
@@ -9266,6 +9632,7 @@
         </w:rPr>
         <w:t>With</w:t>
       </w:r>
+      <w:proofErr w:type="gramEnd"/>
       <w:r>
         <w:rPr>
           <w:i/>
@@ -9703,6 +10070,7 @@
         </w:rPr>
         <w:t xml:space="preserve"> </w:t>
       </w:r>
+      <w:proofErr w:type="gramStart"/>
       <w:r>
         <w:rPr>
           <w:i/>
@@ -9710,6 +10078,7 @@
         </w:rPr>
         <w:t>To</w:t>
       </w:r>
+      <w:proofErr w:type="gramEnd"/>
       <w:r>
         <w:rPr>
           <w:i/>
@@ -9755,7 +10124,23 @@
         <w:t>Objective</w:t>
       </w:r>
       <w:r>
-        <w:t>: Validate that the AddActiveColsToStoredSDRs function correctly stores active columns in a dictionary, main- taining accurate SDR records.</w:t>
+        <w:t xml:space="preserve">: Validate that the </w:t>
+      </w:r>
+      <w:proofErr w:type="spellStart"/>
+      <w:r>
+        <w:t>AddActiveColsToStoredSDRs</w:t>
+      </w:r>
+      <w:proofErr w:type="spellEnd"/>
+      <w:r>
+        <w:t xml:space="preserve"> function correctly stores active columns in a dictionary, main- </w:t>
+      </w:r>
+      <w:proofErr w:type="spellStart"/>
+      <w:r>
+        <w:t>taining</w:t>
+      </w:r>
+      <w:proofErr w:type="spellEnd"/>
+      <w:r>
+        <w:t xml:space="preserve"> accurate SDR records.</w:t>
       </w:r>
     </w:p>
     <w:p>
@@ -9787,7 +10172,15 @@
         <w:t>Parameters</w:t>
       </w:r>
       <w:r>
-        <w:t>: Input: image = ”image1”, activeCols = 1, 0,</w:t>
+        <w:t xml:space="preserve">: Input: image = ”image1”, </w:t>
+      </w:r>
+      <w:proofErr w:type="spellStart"/>
+      <w:r>
+        <w:t>activeCols</w:t>
+      </w:r>
+      <w:proofErr w:type="spellEnd"/>
+      <w:r>
+        <w:t xml:space="preserve"> = 1, 0,</w:t>
       </w:r>
       <w:r>
         <w:rPr>
@@ -9939,7 +10332,23 @@
         <w:t xml:space="preserve">Sparse Distributed Representations (SDRs) </w:t>
       </w:r>
       <w:r>
-        <w:t>from both clas- sifiers into the inverse transformation process. The accuracy and</w:t>
+        <w:t xml:space="preserve">from both </w:t>
+      </w:r>
+      <w:proofErr w:type="spellStart"/>
+      <w:r>
+        <w:t>clas</w:t>
+      </w:r>
+      <w:proofErr w:type="spellEnd"/>
+      <w:r>
+        <w:t xml:space="preserve">- </w:t>
+      </w:r>
+      <w:proofErr w:type="spellStart"/>
+      <w:r>
+        <w:t>sifiers</w:t>
+      </w:r>
+      <w:proofErr w:type="spellEnd"/>
+      <w:r>
+        <w:t xml:space="preserve"> into the inverse transformation process. The accuracy and</w:t>
       </w:r>
       <w:r>
         <w:t xml:space="preserve"> </w:t>
@@ -9984,7 +10393,15 @@
         <w:t>were</w:t>
       </w:r>
       <w:r>
-        <w:t xml:space="preserve"> analyzed.</w:t>
+        <w:t xml:space="preserve"> </w:t>
+      </w:r>
+      <w:proofErr w:type="spellStart"/>
+      <w:r>
+        <w:t>analyzed</w:t>
+      </w:r>
+      <w:proofErr w:type="spellEnd"/>
+      <w:r>
+        <w:t>.</w:t>
       </w:r>
     </w:p>
     <w:p>
@@ -10755,6 +11172,7 @@
         </w:rPr>
         <w:t xml:space="preserve"> </w:t>
       </w:r>
+      <w:proofErr w:type="gramStart"/>
       <w:r>
         <w:rPr>
           <w:spacing w:val="-10"/>
@@ -10767,7 +11185,15 @@
           <w:smallCaps/>
           <w:sz w:val="16"/>
         </w:rPr>
-        <w:t xml:space="preserve"> . KNN</w:t>
+        <w:t xml:space="preserve"> .</w:t>
+      </w:r>
+      <w:proofErr w:type="gramEnd"/>
+      <w:r>
+        <w:rPr>
+          <w:smallCaps/>
+          <w:sz w:val="16"/>
+        </w:rPr>
+        <w:t xml:space="preserve"> KNN</w:t>
       </w:r>
       <w:r>
         <w:rPr>
@@ -11836,8 +12262,13 @@
       <w:r>
         <w:t xml:space="preserve"> </w:t>
       </w:r>
-      <w:r>
-        <w:t>analyzing their</w:t>
+      <w:proofErr w:type="spellStart"/>
+      <w:r>
+        <w:t>analyzing</w:t>
+      </w:r>
+      <w:proofErr w:type="spellEnd"/>
+      <w:r>
+        <w:t xml:space="preserve"> their</w:t>
       </w:r>
       <w:r>
         <w:t xml:space="preserve"> </w:t>
@@ -12416,13 +12847,23 @@
         </w:rPr>
         <w:t>Hawkins, J., Ahmad, S., &amp; Dubinsky, D. (2011). Cortical learning algorithm and hierarchical temporal memory. </w:t>
       </w:r>
+      <w:proofErr w:type="spellStart"/>
       <w:r>
         <w:rPr>
           <w:i/>
           <w:iCs/>
           <w:sz w:val="16"/>
         </w:rPr>
-        <w:t>Numenta Whitepaper</w:t>
+        <w:t>Numenta</w:t>
+      </w:r>
+      <w:proofErr w:type="spellEnd"/>
+      <w:r>
+        <w:rPr>
+          <w:i/>
+          <w:iCs/>
+          <w:sz w:val="16"/>
+        </w:rPr>
+        <w:t xml:space="preserve"> Whitepaper</w:t>
       </w:r>
       <w:r>
         <w:rPr>
@@ -12551,7 +12992,21 @@
         <w:rPr>
           <w:sz w:val="16"/>
         </w:rPr>
-        <w:t>Guo, Gongde &amp; Wang, Hui &amp; Bell, David &amp; Bi, Yaxin. (2004). KNN Model-Based Approach in Classification.</w:t>
+        <w:t xml:space="preserve">Guo, </w:t>
+      </w:r>
+      <w:proofErr w:type="spellStart"/>
+      <w:r>
+        <w:rPr>
+          <w:sz w:val="16"/>
+        </w:rPr>
+        <w:t>Gongde</w:t>
+      </w:r>
+      <w:proofErr w:type="spellEnd"/>
+      <w:r>
+        <w:rPr>
+          <w:sz w:val="16"/>
+        </w:rPr>
+        <w:t xml:space="preserve"> &amp; Wang, Hui &amp; Bell, David &amp; Bi, Yaxin. (2004). KNN Model-Based Approach in Classification.</w:t>
       </w:r>
     </w:p>
     <w:p>
@@ -12575,7 +13030,21 @@
         <w:rPr>
           <w:sz w:val="16"/>
         </w:rPr>
-        <w:t>Antic, S. D., Zhou, W. L., Moore, A. R., Short, S. M., &amp; Ikonomu, K. D. (2010). The decade of the dendritic NMDA spike. </w:t>
+        <w:t xml:space="preserve">Antic, S. D., Zhou, W. L., Moore, A. R., Short, S. M., &amp; </w:t>
+      </w:r>
+      <w:proofErr w:type="spellStart"/>
+      <w:r>
+        <w:rPr>
+          <w:sz w:val="16"/>
+        </w:rPr>
+        <w:t>Ikonomu</w:t>
+      </w:r>
+      <w:proofErr w:type="spellEnd"/>
+      <w:r>
+        <w:rPr>
+          <w:sz w:val="16"/>
+        </w:rPr>
+        <w:t>, K. D. (2010). The decade of the dendritic NMDA spike. </w:t>
       </w:r>
       <w:r>
         <w:rPr>
@@ -16593,7 +17062,6 @@
   <w:style w:type="character" w:default="1" w:styleId="DefaultParagraphFont">
     <w:name w:val="Default Paragraph Font"/>
     <w:uiPriority w:val="1"/>
-    <w:semiHidden/>
     <w:unhideWhenUsed/>
   </w:style>
   <w:style w:type="table" w:default="1" w:styleId="TableNormal">

</xml_diff>